<commit_message>
Update courseware to v2.0 — 5-day, exam-domain-aligned SY0-701
- Reorganise deck to 5 days, one exam domain per day (539 slides)
- Add exam-domain overview + weightings up front; teach every SY0-701 key
  concept per objective (1.1–5.6) reusing the legacy deck content/graphics
- Add browser ed-tools slide, CompTIA exam-registration and practice-exam
  slides, and a visual Download-Course-Material + TRAQOM step-flow slides
- Expand to 43 labs (add cloud IAM, Docker, RAID, packet analysis, mobile
  hardening, media sanitisation, digital forensics)
- Restructure every lab into its own folder (README, INSTRUCTIONS, checklist,
  scripts/run.sh, PDF)
- Regenerate LP (5-day schedule) and LG (43 labs, per-lab terminal figures)
  with version-control records; bump all to v2.0
- Update README and tools.md; drop superseded v1.0 artifacts

Co-Authored-By: Claude Fable 5 <noreply@anthropic.com>
</commit_message>
<xml_diff>
--- a/courseware/LP-CompTIA Security+ (SY0-701).docx
+++ b/courseware/LP-CompTIA Security+ (SY0-701).docx
@@ -179,7 +179,7 @@
           <w:color w:val="1F6FEB"/>
           <w:sz w:val="24"/>
         </w:rPr>
-        <w:t>Version 1.0</w:t>
+        <w:t>Version 2.0</w:t>
       </w:r>
     </w:p>
     <w:p>
@@ -341,6 +341,64 @@
           </w:p>
         </w:tc>
       </w:tr>
+      <w:tr>
+        <w:tc>
+          <w:tcPr>
+            <w:tcW w:type="dxa" w:w="2160"/>
+          </w:tcPr>
+          <w:p>
+            <w:r/>
+            <w:r>
+              <w:rPr>
+                <w:sz w:val="19"/>
+              </w:rPr>
+              <w:t>2.0</w:t>
+            </w:r>
+          </w:p>
+        </w:tc>
+        <w:tc>
+          <w:tcPr>
+            <w:tcW w:type="dxa" w:w="2160"/>
+          </w:tcPr>
+          <w:p>
+            <w:r/>
+            <w:r>
+              <w:rPr>
+                <w:sz w:val="19"/>
+              </w:rPr>
+              <w:t>18 August 2026</w:t>
+            </w:r>
+          </w:p>
+        </w:tc>
+        <w:tc>
+          <w:tcPr>
+            <w:tcW w:type="dxa" w:w="2160"/>
+          </w:tcPr>
+          <w:p>
+            <w:r/>
+            <w:r>
+              <w:rPr>
+                <w:sz w:val="19"/>
+              </w:rPr>
+              <w:t>Reorganised to 5 days aligned to the SY0-701 exam domains (one domain per day); added full concept coverage per exam objective and 7 new labs (43 total); added exam-registration and practice-exam sections.</w:t>
+            </w:r>
+          </w:p>
+        </w:tc>
+        <w:tc>
+          <w:tcPr>
+            <w:tcW w:type="dxa" w:w="2160"/>
+          </w:tcPr>
+          <w:p>
+            <w:r/>
+            <w:r>
+              <w:rPr>
+                <w:sz w:val="19"/>
+              </w:rPr>
+              <w:t>Dr. Alfred Ang</w:t>
+            </w:r>
+          </w:p>
+        </w:tc>
+      </w:tr>
     </w:tbl>
     <w:p>
       <w:r>
@@ -361,12 +419,198 @@
       </w:r>
     </w:p>
     <w:p>
+      <w:pPr>
+        <w:tabs>
+          <w:tab w:pos="9072" w:val="right" w:leader="dot"/>
+        </w:tabs>
+        <w:spacing w:after="60"/>
+      </w:pPr>
       <w:r>
-        <w:fldChar w:fldCharType="begin"/>
-        <w:instrText xml:space="preserve">TOC \o "1-3" \h \z \u</w:instrText>
-        <w:fldChar w:fldCharType="separate"/>
-        <w:t>Right-click and choose “Update Field”, or press F9, to build the table of contents.</w:t>
-        <w:fldChar w:fldCharType="end"/>
+        <w:rPr>
+          <w:rFonts w:ascii="Arial" w:hAnsi="Arial"/>
+          <w:b/>
+          <w:color w:val="333333"/>
+          <w:sz w:val="22"/>
+        </w:rPr>
+        <w:t>Course Information</w:t>
+        <w:tab/>
+        <w:t>4</w:t>
+      </w:r>
+    </w:p>
+    <w:p>
+      <w:pPr>
+        <w:tabs>
+          <w:tab w:pos="9072" w:val="right" w:leader="dot"/>
+        </w:tabs>
+        <w:spacing w:after="60"/>
+      </w:pPr>
+      <w:r>
+        <w:rPr>
+          <w:rFonts w:ascii="Arial" w:hAnsi="Arial"/>
+          <w:b/>
+          <w:color w:val="333333"/>
+          <w:sz w:val="22"/>
+        </w:rPr>
+        <w:t>Learning Outcomes</w:t>
+        <w:tab/>
+        <w:t>4</w:t>
+      </w:r>
+    </w:p>
+    <w:p>
+      <w:pPr>
+        <w:tabs>
+          <w:tab w:pos="9072" w:val="right" w:leader="dot"/>
+        </w:tabs>
+        <w:spacing w:after="60"/>
+      </w:pPr>
+      <w:r>
+        <w:rPr>
+          <w:rFonts w:ascii="Arial" w:hAnsi="Arial"/>
+          <w:b/>
+          <w:color w:val="333333"/>
+          <w:sz w:val="22"/>
+        </w:rPr>
+        <w:t>Assessment</w:t>
+        <w:tab/>
+        <w:t>4</w:t>
+      </w:r>
+    </w:p>
+    <w:p>
+      <w:pPr>
+        <w:tabs>
+          <w:tab w:pos="9072" w:val="right" w:leader="dot"/>
+        </w:tabs>
+        <w:spacing w:after="60"/>
+      </w:pPr>
+      <w:r>
+        <w:rPr>
+          <w:rFonts w:ascii="Arial" w:hAnsi="Arial"/>
+          <w:b/>
+          <w:color w:val="333333"/>
+          <w:sz w:val="22"/>
+        </w:rPr>
+        <w:t>Course Schedule</w:t>
+        <w:tab/>
+        <w:t>4</w:t>
+      </w:r>
+    </w:p>
+    <w:p>
+      <w:pPr>
+        <w:tabs>
+          <w:tab w:pos="9072" w:val="right" w:leader="dot"/>
+        </w:tabs>
+        <w:spacing w:after="60"/>
+        <w:ind w:left="432"/>
+      </w:pPr>
+      <w:r>
+        <w:rPr>
+          <w:rFonts w:ascii="Arial" w:hAnsi="Arial"/>
+          <w:b w:val="0"/>
+          <w:color w:val="333333"/>
+          <w:sz w:val="21"/>
+        </w:rPr>
+        <w:t>Day 1 — Domain 1 — General Security Concepts (12%)</w:t>
+        <w:tab/>
+        <w:t>4</w:t>
+      </w:r>
+    </w:p>
+    <w:p>
+      <w:pPr>
+        <w:tabs>
+          <w:tab w:pos="9072" w:val="right" w:leader="dot"/>
+        </w:tabs>
+        <w:spacing w:after="60"/>
+        <w:ind w:left="432"/>
+      </w:pPr>
+      <w:r>
+        <w:rPr>
+          <w:rFonts w:ascii="Arial" w:hAnsi="Arial"/>
+          <w:b w:val="0"/>
+          <w:color w:val="333333"/>
+          <w:sz w:val="21"/>
+        </w:rPr>
+        <w:t>Day 2 — Domain 2 — Threats, Vulnerabilities &amp; Mitigations (22%)</w:t>
+        <w:tab/>
+        <w:t>5</w:t>
+      </w:r>
+    </w:p>
+    <w:p>
+      <w:pPr>
+        <w:tabs>
+          <w:tab w:pos="9072" w:val="right" w:leader="dot"/>
+        </w:tabs>
+        <w:spacing w:after="60"/>
+        <w:ind w:left="432"/>
+      </w:pPr>
+      <w:r>
+        <w:rPr>
+          <w:rFonts w:ascii="Arial" w:hAnsi="Arial"/>
+          <w:b w:val="0"/>
+          <w:color w:val="333333"/>
+          <w:sz w:val="21"/>
+        </w:rPr>
+        <w:t>Day 3 — Domain 3 — Security Architecture (18%)</w:t>
+        <w:tab/>
+        <w:t>6</w:t>
+      </w:r>
+    </w:p>
+    <w:p>
+      <w:pPr>
+        <w:tabs>
+          <w:tab w:pos="9072" w:val="right" w:leader="dot"/>
+        </w:tabs>
+        <w:spacing w:after="60"/>
+        <w:ind w:left="432"/>
+      </w:pPr>
+      <w:r>
+        <w:rPr>
+          <w:rFonts w:ascii="Arial" w:hAnsi="Arial"/>
+          <w:b w:val="0"/>
+          <w:color w:val="333333"/>
+          <w:sz w:val="21"/>
+        </w:rPr>
+        <w:t>Day 4 — Domain 4 — Security Operations (28%)</w:t>
+        <w:tab/>
+        <w:t>7</w:t>
+      </w:r>
+    </w:p>
+    <w:p>
+      <w:pPr>
+        <w:tabs>
+          <w:tab w:pos="9072" w:val="right" w:leader="dot"/>
+        </w:tabs>
+        <w:spacing w:after="60"/>
+        <w:ind w:left="432"/>
+      </w:pPr>
+      <w:r>
+        <w:rPr>
+          <w:rFonts w:ascii="Arial" w:hAnsi="Arial"/>
+          <w:b w:val="0"/>
+          <w:color w:val="333333"/>
+          <w:sz w:val="21"/>
+        </w:rPr>
+        <w:t>Day 5 — Domain 5 — Program Management, Oversight &amp; Assessment (20%)</w:t>
+        <w:tab/>
+        <w:t>7</w:t>
+      </w:r>
+    </w:p>
+    <w:p>
+      <w:pPr>
+        <w:tabs>
+          <w:tab w:pos="9072" w:val="right" w:leader="dot"/>
+        </w:tabs>
+        <w:spacing w:after="60"/>
+      </w:pPr>
+      <w:r>
+        <w:rPr>
+          <w:rFonts w:ascii="Arial" w:hAnsi="Arial"/>
+          <w:b/>
+          <w:color w:val="333333"/>
+          <w:sz w:val="22"/>
+        </w:rPr>
+        <w:t>Lab Reference (aligned to exam domains)</w:t>
+        <w:tab/>
+        <w:t>8</w:t>
       </w:r>
     </w:p>
     <w:p>
@@ -515,7 +759,7 @@
               <w:rPr>
                 <w:sz w:val="20"/>
               </w:rPr>
-              <w:t>3 days · 8 training hours per day (24 hours)</w:t>
+              <w:t>5 days · 8 training hours per day (40 hours)</w:t>
             </w:r>
           </w:p>
         </w:tc>
@@ -638,7 +882,7 @@
         <w:rPr>
           <w:sz w:val="21"/>
         </w:rPr>
-        <w:t>LO1: Apply general security concepts — control categories and types, the CIA triad and AAA, cryptographic primitives (hashing, symmetric/asymmetric encryption) and PKI.</w:t>
+        <w:t>LO1: Apply general security concepts — control categories and types, the CIA triad and AAA, Zero Trust, change management, cryptographic primitives (hashing, symmetric/asymmetric encryption) and PKI.</w:t>
       </w:r>
     </w:p>
     <w:p>
@@ -649,7 +893,7 @@
         <w:rPr>
           <w:sz w:val="21"/>
         </w:rPr>
-        <w:t>LO2: Identify threats, vulnerabilities and mitigations — phishing, password and web attacks (SQLi, XSS), malware, denial-of-service, vulnerability scanning and host hardening.</w:t>
+        <w:t>LO2: Identify threats, vulnerabilities and mitigations — threat actors, social engineering, password and web attacks (SQLi, XSS), malware, denial-of-service, wireless attacks and hardening.</w:t>
       </w:r>
     </w:p>
     <w:p>
@@ -660,7 +904,7 @@
         <w:rPr>
           <w:sz w:val="21"/>
         </w:rPr>
-        <w:t>LO3: Implement secure architecture — network segmentation, firewalls, WAF, VPN, data-at-rest encryption, TLS hardening and resilient backup.</w:t>
+        <w:t>LO3: Implement secure architecture — cloud and enterprise models, network segmentation, firewalls, WAF, VPN, container security, data-at-rest encryption, TLS hardening and resilient backup/RAID.</w:t>
       </w:r>
     </w:p>
     <w:p>
@@ -671,7 +915,7 @@
         <w:rPr>
           <w:sz w:val="21"/>
         </w:rPr>
-        <w:t>LO4: Run security operations — SSH/identity hardening, MFA, SIEM, IDS, EDR, file-integrity monitoring, vulnerability management, incident response and automation.</w:t>
+        <w:t>LO4: Run security operations — SSH/identity hardening, MFA, SIEM, IDS, EDR, file-integrity monitoring, packet analysis, vulnerability management, incident response, forensics and automation.</w:t>
       </w:r>
     </w:p>
     <w:p>
@@ -682,7 +926,7 @@
         <w:rPr>
           <w:sz w:val="21"/>
         </w:rPr>
-        <w:t>LO5: Manage the security program — risk registers and CVSS, reconnaissance, penetration testing, compliance auditing and security-awareness testing.</w:t>
+        <w:t>LO5: Manage the security program — governance, risk registers and CVSS, third-party risk, reconnaissance, penetration testing, compliance auditing and security-awareness testing.</w:t>
       </w:r>
     </w:p>
     <w:p>
@@ -734,7 +978,7 @@
         <w:rPr>
           <w:sz w:val="21"/>
         </w:rPr>
-        <w:t>Final assessment is conducted on Day 3 from 4:30 pm.</w:t>
+        <w:t>Final assessment is conducted on Day 5 from 4:30 pm.</w:t>
       </w:r>
     </w:p>
     <w:p>
@@ -761,7 +1005,7 @@
         <w:pStyle w:val="Heading2"/>
       </w:pPr>
       <w:r>
-        <w:t>Day 1 — General Security Concepts &amp; Threats</w:t>
+        <w:t>Day 1 — Domain 1 — General Security Concepts (12%)</w:t>
       </w:r>
     </w:p>
     <w:tbl>
@@ -880,7 +1124,7 @@
                 <w:b w:val="0"/>
                 <w:sz w:val="19"/>
               </w:rPr>
-              <w:t>Welcome, course introduction, ground rules and mandatory digital attendance (AM)</w:t>
+              <w:t>Welcome, course introduction, exam-domain overview, ground rules and mandatory digital attendance (AM)</w:t>
             </w:r>
           </w:p>
         </w:tc>
@@ -933,7 +1177,7 @@
                 <w:b/>
                 <w:sz w:val="19"/>
               </w:rPr>
-              <w:t>Domain 1 — General Security Concepts: control categories &amp; types, CIA triad &amp; AAA, hashing, symmetric/asymmetric encryption and PKI (concepts + demo)</w:t>
+              <w:t>Domain 1 concepts: security control categories &amp; types, defence in depth, gap analysis (Obj 1.1)</w:t>
             </w:r>
           </w:p>
         </w:tc>
@@ -995,13 +1239,14 @@
         <w:tc>
           <w:tcPr>
             <w:tcW w:type="dxa" w:w="1656"/>
+            <w:shd w:val="clear" w:color="auto" w:fill="E8F0FE"/>
           </w:tcPr>
           <w:p>
             <w:r/>
             <w:r>
               <w:rPr>
                 <w:rFonts w:ascii="Arial" w:hAnsi="Arial"/>
-                <w:b w:val="0"/>
+                <w:b/>
                 <w:sz w:val="19"/>
               </w:rPr>
               <w:t>11:15–13:00</w:t>
@@ -1011,6 +1256,7 @@
         <w:tc>
           <w:tcPr>
             <w:tcW w:type="dxa" w:w="1296"/>
+            <w:shd w:val="clear" w:color="auto" w:fill="E8F0FE"/>
           </w:tcPr>
           <w:p>
             <w:r/>
@@ -1027,16 +1273,17 @@
         <w:tc>
           <w:tcPr>
             <w:tcW w:type="dxa" w:w="6840"/>
+            <w:shd w:val="clear" w:color="auto" w:fill="E8F0FE"/>
           </w:tcPr>
           <w:p>
             <w:r/>
             <w:r>
               <w:rPr>
                 <w:rFonts w:ascii="Arial" w:hAnsi="Arial"/>
-                <w:b w:val="0"/>
+                <w:b/>
                 <w:sz w:val="19"/>
               </w:rPr>
-              <w:t>Hands-on: Lab 1: Security Controls Categorization; Lab 2: CIA Triad and AAA on Linux; Lab 3: Hashing, Salting, and Digital Signatures; Lab 4: Symmetric vs. Asymmetric Encryption; Lab 5: PKI: Build Your Own Certificate Authority</w:t>
+              <w:t>Domain 1 concepts: CIA/DAD triad, AAA, MFA, Zero Trust, physical security, deception; change management (Obj 1.2–1.3)</w:t>
             </w:r>
           </w:p>
         </w:tc>
@@ -1108,7 +1355,7 @@
                 <w:b/>
                 <w:sz w:val="19"/>
               </w:rPr>
-              <w:t>14:00–14:45</w:t>
+              <w:t>14:00–15:00</w:t>
             </w:r>
           </w:p>
         </w:tc>
@@ -1125,7 +1372,7 @@
                 <w:b w:val="0"/>
                 <w:sz w:val="19"/>
               </w:rPr>
-              <w:t>45 min</w:t>
+              <w:t>60 min</w:t>
             </w:r>
           </w:p>
         </w:tc>
@@ -1142,7 +1389,7 @@
                 <w:b/>
                 <w:sz w:val="19"/>
               </w:rPr>
-              <w:t>Domain 2 — Threats, Vulnerabilities &amp; Mitigations: social engineering, malware, web &amp; password attacks, scanning and hardening (concepts)</w:t>
+              <w:t>Domain 1 concepts: cryptography — symmetric/asymmetric, hashing, digital signatures, PKI, key protection, obfuscation (Obj 1.4)</w:t>
             </w:r>
           </w:p>
         </w:tc>
@@ -1160,7 +1407,7 @@
                 <w:b w:val="0"/>
                 <w:sz w:val="19"/>
               </w:rPr>
-              <w:t>14:45–16:15</w:t>
+              <w:t>15:00–16:15</w:t>
             </w:r>
           </w:p>
         </w:tc>
@@ -1176,7 +1423,7 @@
                 <w:b w:val="0"/>
                 <w:sz w:val="19"/>
               </w:rPr>
-              <w:t>90 min</w:t>
+              <w:t>75 min</w:t>
             </w:r>
           </w:p>
         </w:tc>
@@ -1192,7 +1439,7 @@
                 <w:b w:val="0"/>
                 <w:sz w:val="19"/>
               </w:rPr>
-              <w:t>Hands-on: Lab 6: Phishing Email Header Analysis (SPF / DKIM / DMARC); Lab 7: Password Attacks: Spraying, Brute Force, Cracking; Lab 8: Malware Static Analysis (Safe Sample); Lab 9: SQL Injection (SQLi)</w:t>
+              <w:t>Hands-on: Lab 1: Security Controls Categorization; Lab 2: CIA Triad and AAA on Linux; Lab 3: Hashing, Salting, and Digital Signatures</w:t>
             </w:r>
           </w:p>
         </w:tc>
@@ -1295,7 +1542,7 @@
                 <w:b w:val="0"/>
                 <w:sz w:val="19"/>
               </w:rPr>
-              <w:t>Hands-on: Lab 10: Cross-Site Scripting (XSS); Lab 11: DoS Simulation and Detection; Lab 12: Vulnerability Scanning with Nikto and Nuclei; Lab 13: Linux Hardening Baseline with Lynis</w:t>
+              <w:t>Hands-on: Lab 4: Symmetric vs. Asymmetric Encryption; Lab 5: PKI: Build Your Own Certificate Authority</w:t>
             </w:r>
           </w:p>
         </w:tc>
@@ -1369,7 +1616,7 @@
         <w:pStyle w:val="Heading2"/>
       </w:pPr>
       <w:r>
-        <w:t>Day 2 — Security Architecture &amp; Security Operations</w:t>
+        <w:t>Day 2 — Domain 2 — Threats, Vulnerabilities &amp; Mitigations (22%)</w:t>
       </w:r>
     </w:p>
     <w:tbl>
@@ -1507,7 +1754,7 @@
                 <w:b/>
                 <w:sz w:val="19"/>
               </w:rPr>
-              <w:t>9:45–10:30</w:t>
+              <w:t>9:45–11:00</w:t>
             </w:r>
           </w:p>
         </w:tc>
@@ -1524,7 +1771,7 @@
                 <w:b w:val="0"/>
                 <w:sz w:val="19"/>
               </w:rPr>
-              <w:t>45 min</w:t>
+              <w:t>75 min</w:t>
             </w:r>
           </w:p>
         </w:tc>
@@ -1541,7 +1788,7 @@
                 <w:b/>
                 <w:sz w:val="19"/>
               </w:rPr>
-              <w:t>Domain 3 — Security Architecture: segmentation, firewalls, WAF, VPN, encryption at rest, TLS and backup (concepts + demo)</w:t>
+              <w:t>Domain 2 concepts: threat actors &amp; motivations, vectors &amp; attack surface; malware, DoS/DDoS, network &amp; application attacks (Obj 2.1–2.2)</w:t>
             </w:r>
           </w:p>
         </w:tc>
@@ -1560,7 +1807,7 @@
                 <w:b w:val="0"/>
                 <w:sz w:val="19"/>
               </w:rPr>
-              <w:t>10:30–10:45</w:t>
+              <w:t>11:00–11:15</w:t>
             </w:r>
           </w:p>
         </w:tc>
@@ -1603,6 +1850,24 @@
         <w:tc>
           <w:tcPr>
             <w:tcW w:type="dxa" w:w="1656"/>
+            <w:shd w:val="clear" w:color="auto" w:fill="E8F0FE"/>
+          </w:tcPr>
+          <w:p>
+            <w:r/>
+            <w:r>
+              <w:rPr>
+                <w:rFonts w:ascii="Arial" w:hAnsi="Arial"/>
+                <w:b/>
+                <w:sz w:val="19"/>
+              </w:rPr>
+              <w:t>11:15–13:00</w:t>
+            </w:r>
+          </w:p>
+        </w:tc>
+        <w:tc>
+          <w:tcPr>
+            <w:tcW w:type="dxa" w:w="1296"/>
+            <w:shd w:val="clear" w:color="auto" w:fill="E8F0FE"/>
           </w:tcPr>
           <w:p>
             <w:r/>
@@ -1612,39 +1877,24 @@
                 <w:b w:val="0"/>
                 <w:sz w:val="19"/>
               </w:rPr>
-              <w:t>10:45–13:00</w:t>
+              <w:t>105 min</w:t>
             </w:r>
           </w:p>
         </w:tc>
         <w:tc>
           <w:tcPr>
-            <w:tcW w:type="dxa" w:w="1296"/>
+            <w:tcW w:type="dxa" w:w="6840"/>
+            <w:shd w:val="clear" w:color="auto" w:fill="E8F0FE"/>
           </w:tcPr>
           <w:p>
             <w:r/>
             <w:r>
               <w:rPr>
                 <w:rFonts w:ascii="Arial" w:hAnsi="Arial"/>
-                <w:b w:val="0"/>
+                <w:b/>
                 <w:sz w:val="19"/>
               </w:rPr>
-              <w:t>135 min</w:t>
-            </w:r>
-          </w:p>
-        </w:tc>
-        <w:tc>
-          <w:tcPr>
-            <w:tcW w:type="dxa" w:w="6840"/>
-          </w:tcPr>
-          <w:p>
-            <w:r/>
-            <w:r>
-              <w:rPr>
-                <w:rFonts w:ascii="Arial" w:hAnsi="Arial"/>
-                <w:b w:val="0"/>
-                <w:sz w:val="19"/>
-              </w:rPr>
-              <w:t>Hands-on: Lab 14: Network Segmentation with Linux Namespaces; Lab 15: Stateful Firewall with UFW and nftables; Lab 16: Web Application Firewall with ModSecurity; Lab 17: Site-to-Site VPN with WireGuard; Lab 18: Data at Rest: LUKS Full-Disk Encryption</w:t>
+              <w:t>Domain 2 concepts: social engineering, IOCs, password &amp; wireless attacks, vulnerability types &amp; mitigations (Obj 2.3–2.5). Hands-on: Lab 6: Phishing Email Header Analysis (SPF / DKIM / DMARC); Lab 7: Password Attacks: Spraying, Brute Force, Cracking</w:t>
             </w:r>
           </w:p>
         </w:tc>
@@ -1706,24 +1956,6 @@
         <w:tc>
           <w:tcPr>
             <w:tcW w:type="dxa" w:w="1656"/>
-            <w:shd w:val="clear" w:color="auto" w:fill="E8F0FE"/>
-          </w:tcPr>
-          <w:p>
-            <w:r/>
-            <w:r>
-              <w:rPr>
-                <w:rFonts w:ascii="Arial" w:hAnsi="Arial"/>
-                <w:b/>
-                <w:sz w:val="19"/>
-              </w:rPr>
-              <w:t>14:00–14:30</w:t>
-            </w:r>
-          </w:p>
-        </w:tc>
-        <w:tc>
-          <w:tcPr>
-            <w:tcW w:type="dxa" w:w="1296"/>
-            <w:shd w:val="clear" w:color="auto" w:fill="E8F0FE"/>
           </w:tcPr>
           <w:p>
             <w:r/>
@@ -1733,42 +1965,7 @@
                 <w:b w:val="0"/>
                 <w:sz w:val="19"/>
               </w:rPr>
-              <w:t>30 min</w:t>
-            </w:r>
-          </w:p>
-        </w:tc>
-        <w:tc>
-          <w:tcPr>
-            <w:tcW w:type="dxa" w:w="6840"/>
-            <w:shd w:val="clear" w:color="auto" w:fill="E8F0FE"/>
-          </w:tcPr>
-          <w:p>
-            <w:r/>
-            <w:r>
-              <w:rPr>
-                <w:rFonts w:ascii="Arial" w:hAnsi="Arial"/>
-                <w:b/>
-                <w:sz w:val="19"/>
-              </w:rPr>
-              <w:t>Domain 4 — Security Operations: hardening, IAM/MFA, SIEM, IDS, EDR, FIM, vuln management, IR and automation (concepts)</w:t>
-            </w:r>
-          </w:p>
-        </w:tc>
-      </w:tr>
-      <w:tr>
-        <w:tc>
-          <w:tcPr>
-            <w:tcW w:type="dxa" w:w="1656"/>
-          </w:tcPr>
-          <w:p>
-            <w:r/>
-            <w:r>
-              <w:rPr>
-                <w:rFonts w:ascii="Arial" w:hAnsi="Arial"/>
-                <w:b w:val="0"/>
-                <w:sz w:val="19"/>
-              </w:rPr>
-              <w:t>14:30–16:15</w:t>
+              <w:t>14:00–16:15</w:t>
             </w:r>
           </w:p>
         </w:tc>
@@ -1784,7 +1981,7 @@
                 <w:b w:val="0"/>
                 <w:sz w:val="19"/>
               </w:rPr>
-              <w:t>105 min</w:t>
+              <w:t>135 min</w:t>
             </w:r>
           </w:p>
         </w:tc>
@@ -1800,7 +1997,7 @@
                 <w:b w:val="0"/>
                 <w:sz w:val="19"/>
               </w:rPr>
-              <w:t>Hands-on: Lab 19: TLS Hardening and Cipher Audit; Lab 20: Backup and Recovery with restic; Lab 21: SSH Hardening + Fail2ban; Lab 22: IAM with PAM and sudo; Lab 23: Multi-Factor Authentication with TOTP</w:t>
+              <w:t>Hands-on: Lab 8: Malware Static Analysis (Safe Sample); Lab 9: SQL Injection (SQLi); Lab 10: Cross-Site Scripting (XSS)</w:t>
             </w:r>
           </w:p>
         </w:tc>
@@ -1903,7 +2100,7 @@
                 <w:b w:val="0"/>
                 <w:sz w:val="19"/>
               </w:rPr>
-              <w:t>Hands-on: Lab 24: SIEM Basics with Wazuh; Lab 25: Network IDS with Suricata; Lab 26: Endpoint Detection with osquery</w:t>
+              <w:t>Hands-on: Lab 11: DoS Simulation and Detection; Lab 12: Vulnerability Scanning with Nikto and Nuclei; Lab 13: Linux Hardening Baseline with Lynis</w:t>
             </w:r>
           </w:p>
         </w:tc>
@@ -1977,7 +2174,7 @@
         <w:pStyle w:val="Heading2"/>
       </w:pPr>
       <w:r>
-        <w:t>Day 3 — Security Operations, Program Management &amp; Assessment</w:t>
+        <w:t>Day 3 — Domain 3 — Security Architecture (18%)</w:t>
       </w:r>
     </w:p>
     <w:tbl>
@@ -2105,6 +2302,24 @@
         <w:tc>
           <w:tcPr>
             <w:tcW w:type="dxa" w:w="1656"/>
+            <w:shd w:val="clear" w:color="auto" w:fill="E8F0FE"/>
+          </w:tcPr>
+          <w:p>
+            <w:r/>
+            <w:r>
+              <w:rPr>
+                <w:rFonts w:ascii="Arial" w:hAnsi="Arial"/>
+                <w:b/>
+                <w:sz w:val="19"/>
+              </w:rPr>
+              <w:t>9:45–11:00</w:t>
+            </w:r>
+          </w:p>
+        </w:tc>
+        <w:tc>
+          <w:tcPr>
+            <w:tcW w:type="dxa" w:w="1296"/>
+            <w:shd w:val="clear" w:color="auto" w:fill="E8F0FE"/>
           </w:tcPr>
           <w:p>
             <w:r/>
@@ -2114,7 +2329,809 @@
                 <w:b w:val="0"/>
                 <w:sz w:val="19"/>
               </w:rPr>
-              <w:t>9:45–11:15</w:t>
+              <w:t>75 min</w:t>
+            </w:r>
+          </w:p>
+        </w:tc>
+        <w:tc>
+          <w:tcPr>
+            <w:tcW w:type="dxa" w:w="6840"/>
+            <w:shd w:val="clear" w:color="auto" w:fill="E8F0FE"/>
+          </w:tcPr>
+          <w:p>
+            <w:r/>
+            <w:r>
+              <w:rPr>
+                <w:rFonts w:ascii="Arial" w:hAnsi="Arial"/>
+                <w:b/>
+                <w:sz w:val="19"/>
+              </w:rPr>
+              <w:t>Domain 3 concepts: architecture models, cloud shared responsibility, IoT/OT; enterprise infrastructure, segmentation, firewalls, WAF, IDS/IPS, VPN (Obj 3.1–3.2)</w:t>
+            </w:r>
+          </w:p>
+        </w:tc>
+      </w:tr>
+      <w:tr>
+        <w:tc>
+          <w:tcPr>
+            <w:tcW w:type="dxa" w:w="1656"/>
+            <w:shd w:val="clear" w:color="auto" w:fill="FFF4E5"/>
+          </w:tcPr>
+          <w:p>
+            <w:r/>
+            <w:r>
+              <w:rPr>
+                <w:rFonts w:ascii="Arial" w:hAnsi="Arial"/>
+                <w:b w:val="0"/>
+                <w:sz w:val="19"/>
+              </w:rPr>
+              <w:t>11:00–11:15</w:t>
+            </w:r>
+          </w:p>
+        </w:tc>
+        <w:tc>
+          <w:tcPr>
+            <w:tcW w:type="dxa" w:w="1296"/>
+            <w:shd w:val="clear" w:color="auto" w:fill="FFF4E5"/>
+          </w:tcPr>
+          <w:p>
+            <w:r/>
+            <w:r>
+              <w:rPr>
+                <w:rFonts w:ascii="Arial" w:hAnsi="Arial"/>
+                <w:b w:val="0"/>
+                <w:sz w:val="19"/>
+              </w:rPr>
+              <w:t>15 min</w:t>
+            </w:r>
+          </w:p>
+        </w:tc>
+        <w:tc>
+          <w:tcPr>
+            <w:tcW w:type="dxa" w:w="6840"/>
+            <w:shd w:val="clear" w:color="auto" w:fill="FFF4E5"/>
+          </w:tcPr>
+          <w:p>
+            <w:r/>
+            <w:r>
+              <w:rPr>
+                <w:rFonts w:ascii="Arial" w:hAnsi="Arial"/>
+                <w:b w:val="0"/>
+                <w:sz w:val="19"/>
+              </w:rPr>
+              <w:t>Tea break</w:t>
+            </w:r>
+          </w:p>
+        </w:tc>
+      </w:tr>
+      <w:tr>
+        <w:tc>
+          <w:tcPr>
+            <w:tcW w:type="dxa" w:w="1656"/>
+            <w:shd w:val="clear" w:color="auto" w:fill="E8F0FE"/>
+          </w:tcPr>
+          <w:p>
+            <w:r/>
+            <w:r>
+              <w:rPr>
+                <w:rFonts w:ascii="Arial" w:hAnsi="Arial"/>
+                <w:b/>
+                <w:sz w:val="19"/>
+              </w:rPr>
+              <w:t>11:15–13:00</w:t>
+            </w:r>
+          </w:p>
+        </w:tc>
+        <w:tc>
+          <w:tcPr>
+            <w:tcW w:type="dxa" w:w="1296"/>
+            <w:shd w:val="clear" w:color="auto" w:fill="E8F0FE"/>
+          </w:tcPr>
+          <w:p>
+            <w:r/>
+            <w:r>
+              <w:rPr>
+                <w:rFonts w:ascii="Arial" w:hAnsi="Arial"/>
+                <w:b w:val="0"/>
+                <w:sz w:val="19"/>
+              </w:rPr>
+              <w:t>105 min</w:t>
+            </w:r>
+          </w:p>
+        </w:tc>
+        <w:tc>
+          <w:tcPr>
+            <w:tcW w:type="dxa" w:w="6840"/>
+            <w:shd w:val="clear" w:color="auto" w:fill="E8F0FE"/>
+          </w:tcPr>
+          <w:p>
+            <w:r/>
+            <w:r>
+              <w:rPr>
+                <w:rFonts w:ascii="Arial" w:hAnsi="Arial"/>
+                <w:b/>
+                <w:sz w:val="19"/>
+              </w:rPr>
+              <w:t>Domain 3 concepts: data protection &amp; states, encryption, DLP; resilience, RAID, backup 3-2-1 (Obj 3.3–3.4). Hands-on: Lab 14: Network Segmentation with Linux Namespaces; Lab 15: Stateful Firewall with UFW and nftables</w:t>
+            </w:r>
+          </w:p>
+        </w:tc>
+      </w:tr>
+      <w:tr>
+        <w:tc>
+          <w:tcPr>
+            <w:tcW w:type="dxa" w:w="1656"/>
+            <w:shd w:val="clear" w:color="auto" w:fill="FDE9D9"/>
+          </w:tcPr>
+          <w:p>
+            <w:r/>
+            <w:r>
+              <w:rPr>
+                <w:rFonts w:ascii="Arial" w:hAnsi="Arial"/>
+                <w:b w:val="0"/>
+                <w:sz w:val="19"/>
+              </w:rPr>
+              <w:t>13:00–14:00</w:t>
+            </w:r>
+          </w:p>
+        </w:tc>
+        <w:tc>
+          <w:tcPr>
+            <w:tcW w:type="dxa" w:w="1296"/>
+            <w:shd w:val="clear" w:color="auto" w:fill="FDE9D9"/>
+          </w:tcPr>
+          <w:p>
+            <w:r/>
+            <w:r>
+              <w:rPr>
+                <w:rFonts w:ascii="Arial" w:hAnsi="Arial"/>
+                <w:b w:val="0"/>
+                <w:sz w:val="19"/>
+              </w:rPr>
+              <w:t>60 min</w:t>
+            </w:r>
+          </w:p>
+        </w:tc>
+        <w:tc>
+          <w:tcPr>
+            <w:tcW w:type="dxa" w:w="6840"/>
+            <w:shd w:val="clear" w:color="auto" w:fill="FDE9D9"/>
+          </w:tcPr>
+          <w:p>
+            <w:r/>
+            <w:r>
+              <w:rPr>
+                <w:rFonts w:ascii="Arial" w:hAnsi="Arial"/>
+                <w:b w:val="0"/>
+                <w:sz w:val="19"/>
+              </w:rPr>
+              <w:t>Lunch break</w:t>
+            </w:r>
+          </w:p>
+        </w:tc>
+      </w:tr>
+      <w:tr>
+        <w:tc>
+          <w:tcPr>
+            <w:tcW w:type="dxa" w:w="1656"/>
+          </w:tcPr>
+          <w:p>
+            <w:r/>
+            <w:r>
+              <w:rPr>
+                <w:rFonts w:ascii="Arial" w:hAnsi="Arial"/>
+                <w:b w:val="0"/>
+                <w:sz w:val="19"/>
+              </w:rPr>
+              <w:t>14:00–16:15</w:t>
+            </w:r>
+          </w:p>
+        </w:tc>
+        <w:tc>
+          <w:tcPr>
+            <w:tcW w:type="dxa" w:w="1296"/>
+          </w:tcPr>
+          <w:p>
+            <w:r/>
+            <w:r>
+              <w:rPr>
+                <w:rFonts w:ascii="Arial" w:hAnsi="Arial"/>
+                <w:b w:val="0"/>
+                <w:sz w:val="19"/>
+              </w:rPr>
+              <w:t>135 min</w:t>
+            </w:r>
+          </w:p>
+        </w:tc>
+        <w:tc>
+          <w:tcPr>
+            <w:tcW w:type="dxa" w:w="6840"/>
+          </w:tcPr>
+          <w:p>
+            <w:r/>
+            <w:r>
+              <w:rPr>
+                <w:rFonts w:ascii="Arial" w:hAnsi="Arial"/>
+                <w:b w:val="0"/>
+                <w:sz w:val="19"/>
+              </w:rPr>
+              <w:t>Hands-on: Lab 16: Web Application Firewall with ModSecurity; Lab 17: Site-to-Site VPN with WireGuard; Lab 18: Data at Rest: LUKS Full-Disk Encryption; Lab 19: TLS Hardening and Cipher Audit</w:t>
+            </w:r>
+          </w:p>
+        </w:tc>
+      </w:tr>
+      <w:tr>
+        <w:tc>
+          <w:tcPr>
+            <w:tcW w:type="dxa" w:w="1656"/>
+            <w:shd w:val="clear" w:color="auto" w:fill="FFF4E5"/>
+          </w:tcPr>
+          <w:p>
+            <w:r/>
+            <w:r>
+              <w:rPr>
+                <w:rFonts w:ascii="Arial" w:hAnsi="Arial"/>
+                <w:b w:val="0"/>
+                <w:sz w:val="19"/>
+              </w:rPr>
+              <w:t>16:15–16:30</w:t>
+            </w:r>
+          </w:p>
+        </w:tc>
+        <w:tc>
+          <w:tcPr>
+            <w:tcW w:type="dxa" w:w="1296"/>
+            <w:shd w:val="clear" w:color="auto" w:fill="FFF4E5"/>
+          </w:tcPr>
+          <w:p>
+            <w:r/>
+            <w:r>
+              <w:rPr>
+                <w:rFonts w:ascii="Arial" w:hAnsi="Arial"/>
+                <w:b w:val="0"/>
+                <w:sz w:val="19"/>
+              </w:rPr>
+              <w:t>15 min</w:t>
+            </w:r>
+          </w:p>
+        </w:tc>
+        <w:tc>
+          <w:tcPr>
+            <w:tcW w:type="dxa" w:w="6840"/>
+            <w:shd w:val="clear" w:color="auto" w:fill="FFF4E5"/>
+          </w:tcPr>
+          <w:p>
+            <w:r/>
+            <w:r>
+              <w:rPr>
+                <w:rFonts w:ascii="Arial" w:hAnsi="Arial"/>
+                <w:b w:val="0"/>
+                <w:sz w:val="19"/>
+              </w:rPr>
+              <w:t>Tea break</w:t>
+            </w:r>
+          </w:p>
+        </w:tc>
+      </w:tr>
+      <w:tr>
+        <w:tc>
+          <w:tcPr>
+            <w:tcW w:type="dxa" w:w="1656"/>
+          </w:tcPr>
+          <w:p>
+            <w:r/>
+            <w:r>
+              <w:rPr>
+                <w:rFonts w:ascii="Arial" w:hAnsi="Arial"/>
+                <w:b w:val="0"/>
+                <w:sz w:val="19"/>
+              </w:rPr>
+              <w:t>16:30–18:15</w:t>
+            </w:r>
+          </w:p>
+        </w:tc>
+        <w:tc>
+          <w:tcPr>
+            <w:tcW w:type="dxa" w:w="1296"/>
+          </w:tcPr>
+          <w:p>
+            <w:r/>
+            <w:r>
+              <w:rPr>
+                <w:rFonts w:ascii="Arial" w:hAnsi="Arial"/>
+                <w:b w:val="0"/>
+                <w:sz w:val="19"/>
+              </w:rPr>
+              <w:t>105 min</w:t>
+            </w:r>
+          </w:p>
+        </w:tc>
+        <w:tc>
+          <w:tcPr>
+            <w:tcW w:type="dxa" w:w="6840"/>
+          </w:tcPr>
+          <w:p>
+            <w:r/>
+            <w:r>
+              <w:rPr>
+                <w:rFonts w:ascii="Arial" w:hAnsi="Arial"/>
+                <w:b w:val="0"/>
+                <w:sz w:val="19"/>
+              </w:rPr>
+              <w:t>Hands-on: Lab 20: Backup and Recovery with restic; Lab 37: Cloud Shared Responsibility &amp; IAM Least Privilege; Lab 38: Container Security with Docker; Lab 39: Storage Resilience with Software RAID (mdadm)</w:t>
+            </w:r>
+          </w:p>
+        </w:tc>
+      </w:tr>
+      <w:tr>
+        <w:tc>
+          <w:tcPr>
+            <w:tcW w:type="dxa" w:w="1656"/>
+            <w:shd w:val="clear" w:color="auto" w:fill="F3F5F8"/>
+          </w:tcPr>
+          <w:p>
+            <w:r/>
+            <w:r>
+              <w:rPr>
+                <w:rFonts w:ascii="Arial" w:hAnsi="Arial"/>
+                <w:b w:val="0"/>
+                <w:sz w:val="19"/>
+              </w:rPr>
+              <w:t>18:15–18:30</w:t>
+            </w:r>
+          </w:p>
+        </w:tc>
+        <w:tc>
+          <w:tcPr>
+            <w:tcW w:type="dxa" w:w="1296"/>
+            <w:shd w:val="clear" w:color="auto" w:fill="F3F5F8"/>
+          </w:tcPr>
+          <w:p>
+            <w:r/>
+            <w:r>
+              <w:rPr>
+                <w:rFonts w:ascii="Arial" w:hAnsi="Arial"/>
+                <w:b w:val="0"/>
+                <w:sz w:val="19"/>
+              </w:rPr>
+              <w:t>15 min</w:t>
+            </w:r>
+          </w:p>
+        </w:tc>
+        <w:tc>
+          <w:tcPr>
+            <w:tcW w:type="dxa" w:w="6840"/>
+            <w:shd w:val="clear" w:color="auto" w:fill="F3F5F8"/>
+          </w:tcPr>
+          <w:p>
+            <w:r/>
+            <w:r>
+              <w:rPr>
+                <w:rFonts w:ascii="Arial" w:hAnsi="Arial"/>
+                <w:b w:val="0"/>
+                <w:sz w:val="19"/>
+              </w:rPr>
+              <w:t>Day 3 recap, Q&amp;A and PM digital attendance</w:t>
+            </w:r>
+          </w:p>
+        </w:tc>
+      </w:tr>
+    </w:tbl>
+    <w:p>
+      <w:r>
+        <w:rPr>
+          <w:i/>
+          <w:color w:val="555B66"/>
+          <w:sz w:val="19"/>
+        </w:rPr>
+        <w:t>Total training time: 480 minutes (8 hours).</w:t>
+      </w:r>
+    </w:p>
+    <w:p>
+      <w:pPr>
+        <w:pStyle w:val="Heading2"/>
+      </w:pPr>
+      <w:r>
+        <w:t>Day 4 — Domain 4 — Security Operations (28%)</w:t>
+      </w:r>
+    </w:p>
+    <w:tbl>
+      <w:tblPr>
+        <w:tblStyle w:val="TableGrid"/>
+        <w:tblW w:type="auto" w:w="0"/>
+        <w:jc w:val="center"/>
+        <w:tblLook w:firstColumn="1" w:firstRow="1" w:lastColumn="0" w:lastRow="0" w:noHBand="0" w:noVBand="1" w:val="04A0"/>
+      </w:tblPr>
+      <w:tblGrid>
+        <w:gridCol w:w="2880"/>
+        <w:gridCol w:w="2880"/>
+        <w:gridCol w:w="2880"/>
+      </w:tblGrid>
+      <w:tr>
+        <w:tc>
+          <w:tcPr>
+            <w:tcW w:type="dxa" w:w="1656"/>
+            <w:shd w:val="clear" w:color="auto" w:fill="1F6FEB"/>
+          </w:tcPr>
+          <w:p>
+            <w:r/>
+            <w:r>
+              <w:rPr>
+                <w:rFonts w:ascii="Arial" w:hAnsi="Arial"/>
+                <w:b/>
+                <w:color w:val="FFFFFF"/>
+                <w:sz w:val="20"/>
+              </w:rPr>
+              <w:t>Time</w:t>
+            </w:r>
+          </w:p>
+        </w:tc>
+        <w:tc>
+          <w:tcPr>
+            <w:tcW w:type="dxa" w:w="1296"/>
+            <w:shd w:val="clear" w:color="auto" w:fill="1F6FEB"/>
+          </w:tcPr>
+          <w:p>
+            <w:r/>
+            <w:r>
+              <w:rPr>
+                <w:rFonts w:ascii="Arial" w:hAnsi="Arial"/>
+                <w:b/>
+                <w:color w:val="FFFFFF"/>
+                <w:sz w:val="20"/>
+              </w:rPr>
+              <w:t>Duration</w:t>
+            </w:r>
+          </w:p>
+        </w:tc>
+        <w:tc>
+          <w:tcPr>
+            <w:tcW w:type="dxa" w:w="6840"/>
+            <w:shd w:val="clear" w:color="auto" w:fill="1F6FEB"/>
+          </w:tcPr>
+          <w:p>
+            <w:r/>
+            <w:r>
+              <w:rPr>
+                <w:rFonts w:ascii="Arial" w:hAnsi="Arial"/>
+                <w:b/>
+                <w:color w:val="FFFFFF"/>
+                <w:sz w:val="20"/>
+              </w:rPr>
+              <w:t>Topic / Activity</w:t>
+            </w:r>
+          </w:p>
+        </w:tc>
+      </w:tr>
+      <w:tr>
+        <w:tc>
+          <w:tcPr>
+            <w:tcW w:type="dxa" w:w="1656"/>
+            <w:shd w:val="clear" w:color="auto" w:fill="F3F5F8"/>
+          </w:tcPr>
+          <w:p>
+            <w:r/>
+            <w:r>
+              <w:rPr>
+                <w:rFonts w:ascii="Arial" w:hAnsi="Arial"/>
+                <w:b w:val="0"/>
+                <w:sz w:val="19"/>
+              </w:rPr>
+              <w:t>9:30–9:45</w:t>
+            </w:r>
+          </w:p>
+        </w:tc>
+        <w:tc>
+          <w:tcPr>
+            <w:tcW w:type="dxa" w:w="1296"/>
+            <w:shd w:val="clear" w:color="auto" w:fill="F3F5F8"/>
+          </w:tcPr>
+          <w:p>
+            <w:r/>
+            <w:r>
+              <w:rPr>
+                <w:rFonts w:ascii="Arial" w:hAnsi="Arial"/>
+                <w:b w:val="0"/>
+                <w:sz w:val="19"/>
+              </w:rPr>
+              <w:t>15 min</w:t>
+            </w:r>
+          </w:p>
+        </w:tc>
+        <w:tc>
+          <w:tcPr>
+            <w:tcW w:type="dxa" w:w="6840"/>
+            <w:shd w:val="clear" w:color="auto" w:fill="F3F5F8"/>
+          </w:tcPr>
+          <w:p>
+            <w:r/>
+            <w:r>
+              <w:rPr>
+                <w:rFonts w:ascii="Arial" w:hAnsi="Arial"/>
+                <w:b w:val="0"/>
+                <w:sz w:val="19"/>
+              </w:rPr>
+              <w:t>Day 3 recap and mandatory digital attendance (AM)</w:t>
+            </w:r>
+          </w:p>
+        </w:tc>
+      </w:tr>
+      <w:tr>
+        <w:tc>
+          <w:tcPr>
+            <w:tcW w:type="dxa" w:w="1656"/>
+            <w:shd w:val="clear" w:color="auto" w:fill="E8F0FE"/>
+          </w:tcPr>
+          <w:p>
+            <w:r/>
+            <w:r>
+              <w:rPr>
+                <w:rFonts w:ascii="Arial" w:hAnsi="Arial"/>
+                <w:b/>
+                <w:sz w:val="19"/>
+              </w:rPr>
+              <w:t>9:45–11:00</w:t>
+            </w:r>
+          </w:p>
+        </w:tc>
+        <w:tc>
+          <w:tcPr>
+            <w:tcW w:type="dxa" w:w="1296"/>
+            <w:shd w:val="clear" w:color="auto" w:fill="E8F0FE"/>
+          </w:tcPr>
+          <w:p>
+            <w:r/>
+            <w:r>
+              <w:rPr>
+                <w:rFonts w:ascii="Arial" w:hAnsi="Arial"/>
+                <w:b w:val="0"/>
+                <w:sz w:val="19"/>
+              </w:rPr>
+              <w:t>75 min</w:t>
+            </w:r>
+          </w:p>
+        </w:tc>
+        <w:tc>
+          <w:tcPr>
+            <w:tcW w:type="dxa" w:w="6840"/>
+            <w:shd w:val="clear" w:color="auto" w:fill="E8F0FE"/>
+          </w:tcPr>
+          <w:p>
+            <w:r/>
+            <w:r>
+              <w:rPr>
+                <w:rFonts w:ascii="Arial" w:hAnsi="Arial"/>
+                <w:b/>
+                <w:sz w:val="19"/>
+              </w:rPr>
+              <w:t>Domain 4 concepts: secure baselines &amp; hardening, asset management; monitoring stack — SIEM, IDS/IPS, EDR, FIM, packet analysis (Obj 4.1–4.4)</w:t>
+            </w:r>
+          </w:p>
+        </w:tc>
+      </w:tr>
+      <w:tr>
+        <w:tc>
+          <w:tcPr>
+            <w:tcW w:type="dxa" w:w="1656"/>
+            <w:shd w:val="clear" w:color="auto" w:fill="FFF4E5"/>
+          </w:tcPr>
+          <w:p>
+            <w:r/>
+            <w:r>
+              <w:rPr>
+                <w:rFonts w:ascii="Arial" w:hAnsi="Arial"/>
+                <w:b w:val="0"/>
+                <w:sz w:val="19"/>
+              </w:rPr>
+              <w:t>11:00–11:15</w:t>
+            </w:r>
+          </w:p>
+        </w:tc>
+        <w:tc>
+          <w:tcPr>
+            <w:tcW w:type="dxa" w:w="1296"/>
+            <w:shd w:val="clear" w:color="auto" w:fill="FFF4E5"/>
+          </w:tcPr>
+          <w:p>
+            <w:r/>
+            <w:r>
+              <w:rPr>
+                <w:rFonts w:ascii="Arial" w:hAnsi="Arial"/>
+                <w:b w:val="0"/>
+                <w:sz w:val="19"/>
+              </w:rPr>
+              <w:t>15 min</w:t>
+            </w:r>
+          </w:p>
+        </w:tc>
+        <w:tc>
+          <w:tcPr>
+            <w:tcW w:type="dxa" w:w="6840"/>
+            <w:shd w:val="clear" w:color="auto" w:fill="FFF4E5"/>
+          </w:tcPr>
+          <w:p>
+            <w:r/>
+            <w:r>
+              <w:rPr>
+                <w:rFonts w:ascii="Arial" w:hAnsi="Arial"/>
+                <w:b w:val="0"/>
+                <w:sz w:val="19"/>
+              </w:rPr>
+              <w:t>Tea break</w:t>
+            </w:r>
+          </w:p>
+        </w:tc>
+      </w:tr>
+      <w:tr>
+        <w:tc>
+          <w:tcPr>
+            <w:tcW w:type="dxa" w:w="1656"/>
+          </w:tcPr>
+          <w:p>
+            <w:r/>
+            <w:r>
+              <w:rPr>
+                <w:rFonts w:ascii="Arial" w:hAnsi="Arial"/>
+                <w:b w:val="0"/>
+                <w:sz w:val="19"/>
+              </w:rPr>
+              <w:t>11:15–13:00</w:t>
+            </w:r>
+          </w:p>
+        </w:tc>
+        <w:tc>
+          <w:tcPr>
+            <w:tcW w:type="dxa" w:w="1296"/>
+          </w:tcPr>
+          <w:p>
+            <w:r/>
+            <w:r>
+              <w:rPr>
+                <w:rFonts w:ascii="Arial" w:hAnsi="Arial"/>
+                <w:b w:val="0"/>
+                <w:sz w:val="19"/>
+              </w:rPr>
+              <w:t>105 min</w:t>
+            </w:r>
+          </w:p>
+        </w:tc>
+        <w:tc>
+          <w:tcPr>
+            <w:tcW w:type="dxa" w:w="6840"/>
+          </w:tcPr>
+          <w:p>
+            <w:r/>
+            <w:r>
+              <w:rPr>
+                <w:rFonts w:ascii="Arial" w:hAnsi="Arial"/>
+                <w:b w:val="0"/>
+                <w:sz w:val="19"/>
+              </w:rPr>
+              <w:t>Hands-on: Lab 21: SSH Hardening + Fail2ban; Lab 22: IAM with PAM and sudo; Lab 23: Multi-Factor Authentication with TOTP; Lab 24: SIEM Basics with Wazuh</w:t>
+            </w:r>
+          </w:p>
+        </w:tc>
+      </w:tr>
+      <w:tr>
+        <w:tc>
+          <w:tcPr>
+            <w:tcW w:type="dxa" w:w="1656"/>
+            <w:shd w:val="clear" w:color="auto" w:fill="FDE9D9"/>
+          </w:tcPr>
+          <w:p>
+            <w:r/>
+            <w:r>
+              <w:rPr>
+                <w:rFonts w:ascii="Arial" w:hAnsi="Arial"/>
+                <w:b w:val="0"/>
+                <w:sz w:val="19"/>
+              </w:rPr>
+              <w:t>13:00–14:00</w:t>
+            </w:r>
+          </w:p>
+        </w:tc>
+        <w:tc>
+          <w:tcPr>
+            <w:tcW w:type="dxa" w:w="1296"/>
+            <w:shd w:val="clear" w:color="auto" w:fill="FDE9D9"/>
+          </w:tcPr>
+          <w:p>
+            <w:r/>
+            <w:r>
+              <w:rPr>
+                <w:rFonts w:ascii="Arial" w:hAnsi="Arial"/>
+                <w:b w:val="0"/>
+                <w:sz w:val="19"/>
+              </w:rPr>
+              <w:t>60 min</w:t>
+            </w:r>
+          </w:p>
+        </w:tc>
+        <w:tc>
+          <w:tcPr>
+            <w:tcW w:type="dxa" w:w="6840"/>
+            <w:shd w:val="clear" w:color="auto" w:fill="FDE9D9"/>
+          </w:tcPr>
+          <w:p>
+            <w:r/>
+            <w:r>
+              <w:rPr>
+                <w:rFonts w:ascii="Arial" w:hAnsi="Arial"/>
+                <w:b w:val="0"/>
+                <w:sz w:val="19"/>
+              </w:rPr>
+              <w:t>Lunch break</w:t>
+            </w:r>
+          </w:p>
+        </w:tc>
+      </w:tr>
+      <w:tr>
+        <w:tc>
+          <w:tcPr>
+            <w:tcW w:type="dxa" w:w="1656"/>
+            <w:shd w:val="clear" w:color="auto" w:fill="E8F0FE"/>
+          </w:tcPr>
+          <w:p>
+            <w:r/>
+            <w:r>
+              <w:rPr>
+                <w:rFonts w:ascii="Arial" w:hAnsi="Arial"/>
+                <w:b/>
+                <w:sz w:val="19"/>
+              </w:rPr>
+              <w:t>14:00–14:45</w:t>
+            </w:r>
+          </w:p>
+        </w:tc>
+        <w:tc>
+          <w:tcPr>
+            <w:tcW w:type="dxa" w:w="1296"/>
+            <w:shd w:val="clear" w:color="auto" w:fill="E8F0FE"/>
+          </w:tcPr>
+          <w:p>
+            <w:r/>
+            <w:r>
+              <w:rPr>
+                <w:rFonts w:ascii="Arial" w:hAnsi="Arial"/>
+                <w:b w:val="0"/>
+                <w:sz w:val="19"/>
+              </w:rPr>
+              <w:t>45 min</w:t>
+            </w:r>
+          </w:p>
+        </w:tc>
+        <w:tc>
+          <w:tcPr>
+            <w:tcW w:type="dxa" w:w="6840"/>
+            <w:shd w:val="clear" w:color="auto" w:fill="E8F0FE"/>
+          </w:tcPr>
+          <w:p>
+            <w:r/>
+            <w:r>
+              <w:rPr>
+                <w:rFonts w:ascii="Arial" w:hAnsi="Arial"/>
+                <w:b/>
+                <w:sz w:val="19"/>
+              </w:rPr>
+              <w:t>Domain 4 concepts: vulnerability management &amp; CVSS, IAM/MFA &amp; authorization models, automation/SOAR, incident response &amp; forensics (Obj 4.3–4.8)</w:t>
+            </w:r>
+          </w:p>
+        </w:tc>
+      </w:tr>
+      <w:tr>
+        <w:tc>
+          <w:tcPr>
+            <w:tcW w:type="dxa" w:w="1656"/>
+          </w:tcPr>
+          <w:p>
+            <w:r/>
+            <w:r>
+              <w:rPr>
+                <w:rFonts w:ascii="Arial" w:hAnsi="Arial"/>
+                <w:b w:val="0"/>
+                <w:sz w:val="19"/>
+              </w:rPr>
+              <w:t>14:45–16:15</w:t>
             </w:r>
           </w:p>
         </w:tc>
@@ -2146,7 +3163,356 @@
                 <w:b w:val="0"/>
                 <w:sz w:val="19"/>
               </w:rPr>
-              <w:t>Hands-on: Lab 27: File Integrity Monitoring with AIDE; Lab 28: Vulnerability Management with Trivy; Lab 29: Incident Response and Forensics; Lab 30: Automation and Orchestration (Mini-SOAR)</w:t>
+              <w:t>Hands-on: Lab 25: Network IDS with Suricata; Lab 26: Endpoint Detection with osquery; Lab 27: File Integrity Monitoring with AIDE; Lab 28: Vulnerability Management with Trivy</w:t>
+            </w:r>
+          </w:p>
+        </w:tc>
+      </w:tr>
+      <w:tr>
+        <w:tc>
+          <w:tcPr>
+            <w:tcW w:type="dxa" w:w="1656"/>
+            <w:shd w:val="clear" w:color="auto" w:fill="FFF4E5"/>
+          </w:tcPr>
+          <w:p>
+            <w:r/>
+            <w:r>
+              <w:rPr>
+                <w:rFonts w:ascii="Arial" w:hAnsi="Arial"/>
+                <w:b w:val="0"/>
+                <w:sz w:val="19"/>
+              </w:rPr>
+              <w:t>16:15–16:30</w:t>
+            </w:r>
+          </w:p>
+        </w:tc>
+        <w:tc>
+          <w:tcPr>
+            <w:tcW w:type="dxa" w:w="1296"/>
+            <w:shd w:val="clear" w:color="auto" w:fill="FFF4E5"/>
+          </w:tcPr>
+          <w:p>
+            <w:r/>
+            <w:r>
+              <w:rPr>
+                <w:rFonts w:ascii="Arial" w:hAnsi="Arial"/>
+                <w:b w:val="0"/>
+                <w:sz w:val="19"/>
+              </w:rPr>
+              <w:t>15 min</w:t>
+            </w:r>
+          </w:p>
+        </w:tc>
+        <w:tc>
+          <w:tcPr>
+            <w:tcW w:type="dxa" w:w="6840"/>
+            <w:shd w:val="clear" w:color="auto" w:fill="FFF4E5"/>
+          </w:tcPr>
+          <w:p>
+            <w:r/>
+            <w:r>
+              <w:rPr>
+                <w:rFonts w:ascii="Arial" w:hAnsi="Arial"/>
+                <w:b w:val="0"/>
+                <w:sz w:val="19"/>
+              </w:rPr>
+              <w:t>Tea break</w:t>
+            </w:r>
+          </w:p>
+        </w:tc>
+      </w:tr>
+      <w:tr>
+        <w:tc>
+          <w:tcPr>
+            <w:tcW w:type="dxa" w:w="1656"/>
+          </w:tcPr>
+          <w:p>
+            <w:r/>
+            <w:r>
+              <w:rPr>
+                <w:rFonts w:ascii="Arial" w:hAnsi="Arial"/>
+                <w:b w:val="0"/>
+                <w:sz w:val="19"/>
+              </w:rPr>
+              <w:t>16:30–18:15</w:t>
+            </w:r>
+          </w:p>
+        </w:tc>
+        <w:tc>
+          <w:tcPr>
+            <w:tcW w:type="dxa" w:w="1296"/>
+          </w:tcPr>
+          <w:p>
+            <w:r/>
+            <w:r>
+              <w:rPr>
+                <w:rFonts w:ascii="Arial" w:hAnsi="Arial"/>
+                <w:b w:val="0"/>
+                <w:sz w:val="19"/>
+              </w:rPr>
+              <w:t>105 min</w:t>
+            </w:r>
+          </w:p>
+        </w:tc>
+        <w:tc>
+          <w:tcPr>
+            <w:tcW w:type="dxa" w:w="6840"/>
+          </w:tcPr>
+          <w:p>
+            <w:r/>
+            <w:r>
+              <w:rPr>
+                <w:rFonts w:ascii="Arial" w:hAnsi="Arial"/>
+                <w:b w:val="0"/>
+                <w:sz w:val="19"/>
+              </w:rPr>
+              <w:t>Hands-on: Lab 29: Incident Response and Forensics; Lab 30: Automation and Orchestration (Mini-SOAR); Lab 40: Packet Capture &amp; Traffic Analysis; Lab 41: Mobile &amp; Endpoint Hardening Baseline; Lab 42: Secure Data Sanitisation (Media Disposal); Lab 43: Digital Forensics — Evidence Acquisition &amp; Hashing</w:t>
+            </w:r>
+          </w:p>
+        </w:tc>
+      </w:tr>
+      <w:tr>
+        <w:tc>
+          <w:tcPr>
+            <w:tcW w:type="dxa" w:w="1656"/>
+            <w:shd w:val="clear" w:color="auto" w:fill="F3F5F8"/>
+          </w:tcPr>
+          <w:p>
+            <w:r/>
+            <w:r>
+              <w:rPr>
+                <w:rFonts w:ascii="Arial" w:hAnsi="Arial"/>
+                <w:b w:val="0"/>
+                <w:sz w:val="19"/>
+              </w:rPr>
+              <w:t>18:15–18:30</w:t>
+            </w:r>
+          </w:p>
+        </w:tc>
+        <w:tc>
+          <w:tcPr>
+            <w:tcW w:type="dxa" w:w="1296"/>
+            <w:shd w:val="clear" w:color="auto" w:fill="F3F5F8"/>
+          </w:tcPr>
+          <w:p>
+            <w:r/>
+            <w:r>
+              <w:rPr>
+                <w:rFonts w:ascii="Arial" w:hAnsi="Arial"/>
+                <w:b w:val="0"/>
+                <w:sz w:val="19"/>
+              </w:rPr>
+              <w:t>15 min</w:t>
+            </w:r>
+          </w:p>
+        </w:tc>
+        <w:tc>
+          <w:tcPr>
+            <w:tcW w:type="dxa" w:w="6840"/>
+            <w:shd w:val="clear" w:color="auto" w:fill="F3F5F8"/>
+          </w:tcPr>
+          <w:p>
+            <w:r/>
+            <w:r>
+              <w:rPr>
+                <w:rFonts w:ascii="Arial" w:hAnsi="Arial"/>
+                <w:b w:val="0"/>
+                <w:sz w:val="19"/>
+              </w:rPr>
+              <w:t>Day 4 recap, Q&amp;A and PM digital attendance</w:t>
+            </w:r>
+          </w:p>
+        </w:tc>
+      </w:tr>
+    </w:tbl>
+    <w:p>
+      <w:r>
+        <w:rPr>
+          <w:i/>
+          <w:color w:val="555B66"/>
+          <w:sz w:val="19"/>
+        </w:rPr>
+        <w:t>Total training time: 480 minutes (8 hours).</w:t>
+      </w:r>
+    </w:p>
+    <w:p>
+      <w:pPr>
+        <w:pStyle w:val="Heading2"/>
+      </w:pPr>
+      <w:r>
+        <w:t>Day 5 — Domain 5 — Program Management, Oversight &amp; Assessment (20%)</w:t>
+      </w:r>
+    </w:p>
+    <w:tbl>
+      <w:tblPr>
+        <w:tblStyle w:val="TableGrid"/>
+        <w:tblW w:type="auto" w:w="0"/>
+        <w:jc w:val="center"/>
+        <w:tblLook w:firstColumn="1" w:firstRow="1" w:lastColumn="0" w:lastRow="0" w:noHBand="0" w:noVBand="1" w:val="04A0"/>
+      </w:tblPr>
+      <w:tblGrid>
+        <w:gridCol w:w="2880"/>
+        <w:gridCol w:w="2880"/>
+        <w:gridCol w:w="2880"/>
+      </w:tblGrid>
+      <w:tr>
+        <w:tc>
+          <w:tcPr>
+            <w:tcW w:type="dxa" w:w="1656"/>
+            <w:shd w:val="clear" w:color="auto" w:fill="1F6FEB"/>
+          </w:tcPr>
+          <w:p>
+            <w:r/>
+            <w:r>
+              <w:rPr>
+                <w:rFonts w:ascii="Arial" w:hAnsi="Arial"/>
+                <w:b/>
+                <w:color w:val="FFFFFF"/>
+                <w:sz w:val="20"/>
+              </w:rPr>
+              <w:t>Time</w:t>
+            </w:r>
+          </w:p>
+        </w:tc>
+        <w:tc>
+          <w:tcPr>
+            <w:tcW w:type="dxa" w:w="1296"/>
+            <w:shd w:val="clear" w:color="auto" w:fill="1F6FEB"/>
+          </w:tcPr>
+          <w:p>
+            <w:r/>
+            <w:r>
+              <w:rPr>
+                <w:rFonts w:ascii="Arial" w:hAnsi="Arial"/>
+                <w:b/>
+                <w:color w:val="FFFFFF"/>
+                <w:sz w:val="20"/>
+              </w:rPr>
+              <w:t>Duration</w:t>
+            </w:r>
+          </w:p>
+        </w:tc>
+        <w:tc>
+          <w:tcPr>
+            <w:tcW w:type="dxa" w:w="6840"/>
+            <w:shd w:val="clear" w:color="auto" w:fill="1F6FEB"/>
+          </w:tcPr>
+          <w:p>
+            <w:r/>
+            <w:r>
+              <w:rPr>
+                <w:rFonts w:ascii="Arial" w:hAnsi="Arial"/>
+                <w:b/>
+                <w:color w:val="FFFFFF"/>
+                <w:sz w:val="20"/>
+              </w:rPr>
+              <w:t>Topic / Activity</w:t>
+            </w:r>
+          </w:p>
+        </w:tc>
+      </w:tr>
+      <w:tr>
+        <w:tc>
+          <w:tcPr>
+            <w:tcW w:type="dxa" w:w="1656"/>
+            <w:shd w:val="clear" w:color="auto" w:fill="F3F5F8"/>
+          </w:tcPr>
+          <w:p>
+            <w:r/>
+            <w:r>
+              <w:rPr>
+                <w:rFonts w:ascii="Arial" w:hAnsi="Arial"/>
+                <w:b w:val="0"/>
+                <w:sz w:val="19"/>
+              </w:rPr>
+              <w:t>9:30–9:45</w:t>
+            </w:r>
+          </w:p>
+        </w:tc>
+        <w:tc>
+          <w:tcPr>
+            <w:tcW w:type="dxa" w:w="1296"/>
+            <w:shd w:val="clear" w:color="auto" w:fill="F3F5F8"/>
+          </w:tcPr>
+          <w:p>
+            <w:r/>
+            <w:r>
+              <w:rPr>
+                <w:rFonts w:ascii="Arial" w:hAnsi="Arial"/>
+                <w:b w:val="0"/>
+                <w:sz w:val="19"/>
+              </w:rPr>
+              <w:t>15 min</w:t>
+            </w:r>
+          </w:p>
+        </w:tc>
+        <w:tc>
+          <w:tcPr>
+            <w:tcW w:type="dxa" w:w="6840"/>
+            <w:shd w:val="clear" w:color="auto" w:fill="F3F5F8"/>
+          </w:tcPr>
+          <w:p>
+            <w:r/>
+            <w:r>
+              <w:rPr>
+                <w:rFonts w:ascii="Arial" w:hAnsi="Arial"/>
+                <w:b w:val="0"/>
+                <w:sz w:val="19"/>
+              </w:rPr>
+              <w:t>Day 4 recap and mandatory digital attendance (AM)</w:t>
+            </w:r>
+          </w:p>
+        </w:tc>
+      </w:tr>
+      <w:tr>
+        <w:tc>
+          <w:tcPr>
+            <w:tcW w:type="dxa" w:w="1656"/>
+            <w:shd w:val="clear" w:color="auto" w:fill="E8F0FE"/>
+          </w:tcPr>
+          <w:p>
+            <w:r/>
+            <w:r>
+              <w:rPr>
+                <w:rFonts w:ascii="Arial" w:hAnsi="Arial"/>
+                <w:b/>
+                <w:sz w:val="19"/>
+              </w:rPr>
+              <w:t>9:45–11:15</w:t>
+            </w:r>
+          </w:p>
+        </w:tc>
+        <w:tc>
+          <w:tcPr>
+            <w:tcW w:type="dxa" w:w="1296"/>
+            <w:shd w:val="clear" w:color="auto" w:fill="E8F0FE"/>
+          </w:tcPr>
+          <w:p>
+            <w:r/>
+            <w:r>
+              <w:rPr>
+                <w:rFonts w:ascii="Arial" w:hAnsi="Arial"/>
+                <w:b w:val="0"/>
+                <w:sz w:val="19"/>
+              </w:rPr>
+              <w:t>90 min</w:t>
+            </w:r>
+          </w:p>
+        </w:tc>
+        <w:tc>
+          <w:tcPr>
+            <w:tcW w:type="dxa" w:w="6840"/>
+            <w:shd w:val="clear" w:color="auto" w:fill="E8F0FE"/>
+          </w:tcPr>
+          <w:p>
+            <w:r/>
+            <w:r>
+              <w:rPr>
+                <w:rFonts w:ascii="Arial" w:hAnsi="Arial"/>
+                <w:b/>
+                <w:sz w:val="19"/>
+              </w:rPr>
+              <w:t>Domain 5 concepts: governance, policies/standards/procedures; risk management &amp; CVSS, third-party risk (Obj 5.1–5.3). Hands-on: Lab 31: Risk Register, CVSS Scoring, and Quantitative Risk</w:t>
             </w:r>
           </w:p>
         </w:tc>
@@ -2252,7 +3618,7 @@
                 <w:b/>
                 <w:sz w:val="19"/>
               </w:rPr>
-              <w:t>Domain 5 — Security Program Management &amp; Oversight: risk &amp; CVSS, reconnaissance, pentesting, compliance and awareness (concepts). Hands-on: Lab 31: Risk Register, CVSS Scoring, and Quantitative Risk; Lab 32: Passive Reconnaissance / OSINT</w:t>
+              <w:t>Domain 5 concepts: audits &amp; assessments, penetration testing, reconnaissance, security awareness &amp; compliance (Obj 5.4–5.6). Hands-on: Lab 32: Passive Reconnaissance / OSINT; Lab 33: Active Reconnaissance with Nmap</w:t>
             </w:r>
           </w:p>
         </w:tc>
@@ -2323,7 +3689,7 @@
                 <w:b w:val="0"/>
                 <w:sz w:val="19"/>
               </w:rPr>
-              <w:t>14:00–16:00</w:t>
+              <w:t>14:00–15:45</w:t>
             </w:r>
           </w:p>
         </w:tc>
@@ -2339,7 +3705,7 @@
                 <w:b w:val="0"/>
                 <w:sz w:val="19"/>
               </w:rPr>
-              <w:t>120 min</w:t>
+              <w:t>105 min</w:t>
             </w:r>
           </w:p>
         </w:tc>
@@ -2355,7 +3721,7 @@
                 <w:b w:val="0"/>
                 <w:sz w:val="19"/>
               </w:rPr>
-              <w:t>Hands-on: Lab 33: Active Reconnaissance with Nmap; Lab 34: Penetration Testing with Metasploit (Authorised Lab); Lab 35: Compliance Audit with OpenSCAP; Lab 36: Security Awareness: Run a Phishing Simulation with GoPhish</w:t>
+              <w:t>Hands-on: Lab 34: Penetration Testing with Metasploit (Authorised Lab); Lab 35: Compliance Audit with OpenSCAP; Lab 36: Security Awareness: Run a Phishing Simulation with GoPhish</w:t>
             </w:r>
           </w:p>
         </w:tc>
@@ -2374,7 +3740,7 @@
                 <w:b w:val="0"/>
                 <w:sz w:val="19"/>
               </w:rPr>
-              <w:t>16:00–16:15</w:t>
+              <w:t>15:45–16:00</w:t>
             </w:r>
           </w:p>
         </w:tc>
@@ -2427,7 +3793,7 @@
                 <w:b/>
                 <w:sz w:val="19"/>
               </w:rPr>
-              <w:t>16:15–16:30</w:t>
+              <w:t>16:00–16:30</w:t>
             </w:r>
           </w:p>
         </w:tc>
@@ -2444,7 +3810,7 @@
                 <w:b w:val="0"/>
                 <w:sz w:val="19"/>
               </w:rPr>
-              <w:t>15 min</w:t>
+              <w:t>30 min</w:t>
             </w:r>
           </w:p>
         </w:tc>
@@ -2461,7 +3827,7 @@
                 <w:b/>
                 <w:sz w:val="19"/>
               </w:rPr>
-              <w:t>Briefing for Assessment</w:t>
+              <w:t>Briefing for Assessment and exam-registration walkthrough</w:t>
             </w:r>
           </w:p>
         </w:tc>
@@ -2809,7 +4175,7 @@
                 <w:b w:val="0"/>
                 <w:sz w:val="19"/>
               </w:rPr>
-              <w:t>Lab 14, Lab 15, Lab 16, Lab 17, Lab 18, Lab 19, Lab 20</w:t>
+              <w:t>Lab 14, Lab 15, Lab 16, Lab 17, Lab 18, Lab 19, Lab 20, Lab 37, Lab 38, Lab 39</w:t>
             </w:r>
           </w:p>
         </w:tc>
@@ -2861,7 +4227,7 @@
                 <w:b w:val="0"/>
                 <w:sz w:val="19"/>
               </w:rPr>
-              <w:t>Lab 21, Lab 22, Lab 23, Lab 24, Lab 25, Lab 26, Lab 27, Lab 28, Lab 29, Lab 30</w:t>
+              <w:t>Lab 21, Lab 22, Lab 23, Lab 24, Lab 25, Lab 26, Lab 27, Lab 28, Lab 29, Lab 30, Lab 40, Lab 41, Lab 42, Lab 43</w:t>
             </w:r>
           </w:p>
         </w:tc>

</xml_diff>

<commit_message>
feat(courseware): v3.0 — follow C628 exam-prep v2.0: 52 labs in SY0-701 blueprint order, practice exam, WSQ layer retained
Co-Authored-By: Claude Sonnet 5.5 <noreply@anthropic.com>
</commit_message>
<xml_diff>
--- a/courseware/LP-CompTIA Security+ (SY0-701).docx
+++ b/courseware/LP-CompTIA Security+ (SY0-701).docx
@@ -179,7 +179,7 @@
           <w:color w:val="1F6FEB"/>
           <w:sz w:val="24"/>
         </w:rPr>
-        <w:t>Version 2.0</w:t>
+        <w:t>Version 3.0</w:t>
       </w:r>
     </w:p>
     <w:p>
@@ -380,7 +380,65 @@
               <w:rPr>
                 <w:sz w:val="19"/>
               </w:rPr>
-              <w:t>Reorganised to 5 days aligned to the SY0-701 exam domains (one domain per day); added full concept coverage per exam objective and 7 new labs (43 total); added exam-registration and practice-exam sections.</w:t>
+              <w:t>Reorganised to 5 days aligned to the SY0-701 exam domains; 43 labs; exam-registration and practice-exam sections.</w:t>
+            </w:r>
+          </w:p>
+        </w:tc>
+        <w:tc>
+          <w:tcPr>
+            <w:tcW w:type="dxa" w:w="2160"/>
+          </w:tcPr>
+          <w:p>
+            <w:r/>
+            <w:r>
+              <w:rPr>
+                <w:sz w:val="19"/>
+              </w:rPr>
+              <w:t>Dr. Alfred Ang</w:t>
+            </w:r>
+          </w:p>
+        </w:tc>
+      </w:tr>
+      <w:tr>
+        <w:tc>
+          <w:tcPr>
+            <w:tcW w:type="dxa" w:w="2160"/>
+          </w:tcPr>
+          <w:p>
+            <w:r/>
+            <w:r>
+              <w:rPr>
+                <w:sz w:val="19"/>
+              </w:rPr>
+              <w:t>3.0</w:t>
+            </w:r>
+          </w:p>
+        </w:tc>
+        <w:tc>
+          <w:tcPr>
+            <w:tcW w:type="dxa" w:w="2160"/>
+          </w:tcPr>
+          <w:p>
+            <w:r/>
+            <w:r>
+              <w:rPr>
+                <w:sz w:val="19"/>
+              </w:rPr>
+              <w:t>28 October 2026</w:t>
+            </w:r>
+          </w:p>
+        </w:tc>
+        <w:tc>
+          <w:tcPr>
+            <w:tcW w:type="dxa" w:w="2160"/>
+          </w:tcPr>
+          <w:p>
+            <w:r/>
+            <w:r>
+              <w:rPr>
+                <w:sz w:val="19"/>
+              </w:rPr>
+              <w:t>Re-sequenced to the official SY0-701 blueprint (5 domains, 28 objectives); concept content expanded per objective; 52 labs aligned one-to-one with objectives (9 new labs); exam tips and practice questions per domain; 5-day schedule (one domain per day, 40 training hours with the Day-5 final assessment) to match the published WSQ course duration. Labs and topic order aligned to the CyberLab simulator; practice exam added at the end; WSQ final assessment retained on Day 5.</w:t>
             </w:r>
           </w:p>
         </w:tc>
@@ -470,6 +528,25 @@
           <w:color w:val="333333"/>
           <w:sz w:val="22"/>
         </w:rPr>
+        <w:t>Learning Reinforcement</w:t>
+        <w:tab/>
+        <w:t>4</w:t>
+      </w:r>
+    </w:p>
+    <w:p>
+      <w:pPr>
+        <w:tabs>
+          <w:tab w:pos="9072" w:val="right" w:leader="dot"/>
+        </w:tabs>
+        <w:spacing w:after="60"/>
+      </w:pPr>
+      <w:r>
+        <w:rPr>
+          <w:rFonts w:ascii="Arial" w:hAnsi="Arial"/>
+          <w:b/>
+          <w:color w:val="333333"/>
+          <w:sz w:val="22"/>
+        </w:rPr>
         <w:t>Assessment</w:t>
         <w:tab/>
         <w:t>4</w:t>
@@ -491,7 +568,7 @@
         </w:rPr>
         <w:t>Course Schedule</w:t>
         <w:tab/>
-        <w:t>4</w:t>
+        <w:t>5</w:t>
       </w:r>
     </w:p>
     <w:p>
@@ -511,7 +588,7 @@
         </w:rPr>
         <w:t>Day 1 — Domain 1 — General Security Concepts (12%)</w:t>
         <w:tab/>
-        <w:t>4</w:t>
+        <w:t>5</w:t>
       </w:r>
     </w:p>
     <w:p>
@@ -529,7 +606,7 @@
           <w:color w:val="333333"/>
           <w:sz w:val="21"/>
         </w:rPr>
-        <w:t>Day 2 — Domain 2 — Threats, Vulnerabilities &amp; Mitigations (22%)</w:t>
+        <w:t>Day 2 — Domain 2 — Threats, Vulnerabilities and Mitigations (22%)</w:t>
         <w:tab/>
         <w:t>5</w:t>
       </w:r>
@@ -571,7 +648,7 @@
         </w:rPr>
         <w:t>Day 4 — Domain 4 — Security Operations (28%)</w:t>
         <w:tab/>
-        <w:t>7</w:t>
+        <w:t>6</w:t>
       </w:r>
     </w:p>
     <w:p>
@@ -589,7 +666,7 @@
           <w:color w:val="333333"/>
           <w:sz w:val="21"/>
         </w:rPr>
-        <w:t>Day 5 — Domain 5 — Program Management, Oversight &amp; Assessment (20%)</w:t>
+        <w:t>Day 5 — Domain 5 — Security Program Management and Oversight (20%), Exam Readiness &amp; Assessment</w:t>
         <w:tab/>
         <w:t>7</w:t>
       </w:r>
@@ -608,7 +685,26 @@
           <w:color w:val="333333"/>
           <w:sz w:val="22"/>
         </w:rPr>
-        <w:t>Lab Reference (aligned to exam domains)</w:t>
+        <w:t>Lab Reference (aligned to the exam domains)</w:t>
+        <w:tab/>
+        <w:t>7</w:t>
+      </w:r>
+    </w:p>
+    <w:p>
+      <w:pPr>
+        <w:tabs>
+          <w:tab w:pos="9072" w:val="right" w:leader="dot"/>
+        </w:tabs>
+        <w:spacing w:after="60"/>
+      </w:pPr>
+      <w:r>
+        <w:rPr>
+          <w:rFonts w:ascii="Arial" w:hAnsi="Arial"/>
+          <w:b/>
+          <w:color w:val="333333"/>
+          <w:sz w:val="22"/>
+        </w:rPr>
+        <w:t>SY0-701 Exam Objective Coverage</w:t>
         <w:tab/>
         <w:t>8</w:t>
       </w:r>
@@ -759,7 +855,7 @@
               <w:rPr>
                 <w:sz w:val="20"/>
               </w:rPr>
-              <w:t>5 days · 8 training hours per day (40 hours)</w:t>
+              <w:t>5 days · 8 training hours per day (40 hours), 1h lunch, tea breaks within</w:t>
             </w:r>
           </w:p>
         </w:tc>
@@ -882,7 +978,7 @@
         <w:rPr>
           <w:sz w:val="21"/>
         </w:rPr>
-        <w:t>LO1: Apply general security concepts — control categories and types, the CIA triad and AAA, Zero Trust, change management, cryptographic primitives (hashing, symmetric/asymmetric encryption) and PKI.</w:t>
+        <w:t>LO1: Explain general security concepts — control types, CIA and AAA, Zero Trust, physical security, deception, change management and cryptography with PKI.</w:t>
       </w:r>
     </w:p>
     <w:p>
@@ -893,7 +989,7 @@
         <w:rPr>
           <w:sz w:val="21"/>
         </w:rPr>
-        <w:t>LO2: Identify threats, vulnerabilities and mitigations — threat actors, social engineering, password and web attacks (SQLi, XSS), malware, denial-of-service, wireless attacks and hardening.</w:t>
+        <w:t>LO2: Analyse threat actors, vectors and social engineering, application and platform vulnerabilities, indicators of attack, and mitigation techniques.</w:t>
       </w:r>
     </w:p>
     <w:p>
@@ -904,7 +1000,7 @@
         <w:rPr>
           <w:sz w:val="21"/>
         </w:rPr>
-        <w:t>LO3: Implement secure architecture — cloud and enterprise models, network segmentation, firewalls, WAF, VPN, container security, data-at-rest encryption, TLS hardening and resilient backup/RAID.</w:t>
+        <w:t>LO3: Apply secure architecture — cloud and on-premises models, secure enterprise infrastructure, data protection, and resilience and recovery.</w:t>
       </w:r>
     </w:p>
     <w:p>
@@ -915,7 +1011,7 @@
         <w:rPr>
           <w:sz w:val="21"/>
         </w:rPr>
-        <w:t>LO4: Run security operations — SSH/identity hardening, MFA, SIEM, IDS, EDR, file-integrity monitoring, packet analysis, vulnerability management, incident response, forensics and automation.</w:t>
+        <w:t>LO4: Perform security operations — hardening, asset and vulnerability management, monitoring, security capabilities, IAM, automation and incident response.</w:t>
       </w:r>
     </w:p>
     <w:p>
@@ -926,7 +1022,70 @@
         <w:rPr>
           <w:sz w:val="21"/>
         </w:rPr>
-        <w:t>LO5: Manage the security program — governance, risk registers and CVSS, third-party risk, reconnaissance, penetration testing, compliance auditing and security-awareness testing.</w:t>
+        <w:t>LO5: Support program oversight — governance, risk and third-party risk, compliance, audits and penetration testing, and security awareness.</w:t>
+      </w:r>
+    </w:p>
+    <w:p>
+      <w:pPr>
+        <w:pStyle w:val="Heading1"/>
+      </w:pPr>
+      <w:r>
+        <w:t>Learning Reinforcement</w:t>
+      </w:r>
+    </w:p>
+    <w:p>
+      <w:pPr>
+        <w:pStyle w:val="ListBullet"/>
+      </w:pPr>
+      <w:r>
+        <w:rPr>
+          <w:sz w:val="21"/>
+        </w:rPr>
+        <w:t>Every SY0-701 objective is taught first and then practised in at least one hands-on lab in the browser-based Killercoda playground.</w:t>
+      </w:r>
+    </w:p>
+    <w:p>
+      <w:pPr>
+        <w:pStyle w:val="ListBullet"/>
+      </w:pPr>
+      <w:r>
+        <w:rPr>
+          <w:sz w:val="21"/>
+        </w:rPr>
+        <w:t>Each lab ends with a 'Test it' verification step so learners can confirm their own progress, plus a challenge task for fast finishers.</w:t>
+      </w:r>
+    </w:p>
+    <w:p>
+      <w:pPr>
+        <w:pStyle w:val="ListBullet"/>
+      </w:pPr>
+      <w:r>
+        <w:rPr>
+          <w:sz w:val="21"/>
+        </w:rPr>
+        <w:t>Each objective closes with exam tips that highlight commonly confused terms and high-yield facts.</w:t>
+      </w:r>
+    </w:p>
+    <w:p>
+      <w:pPr>
+        <w:pStyle w:val="ListBullet"/>
+      </w:pPr>
+      <w:r>
+        <w:rPr>
+          <w:sz w:val="21"/>
+        </w:rPr>
+        <w:t>Each domain closes with exam-style practice questions, reviewed together in the recap session.</w:t>
+      </w:r>
+    </w:p>
+    <w:p>
+      <w:pPr>
+        <w:pStyle w:val="ListBullet"/>
+      </w:pPr>
+      <w:r>
+        <w:rPr>
+          <w:sz w:val="21"/>
+        </w:rPr>
+        <w:t>The trainer circulates during lab time to give individual feedback and unblock learners.</w:t>
       </w:r>
     </w:p>
     <w:p>
@@ -978,7 +1137,7 @@
         <w:rPr>
           <w:sz w:val="21"/>
         </w:rPr>
-        <w:t>Final assessment is conducted on Day 5 from 4:30 pm.</w:t>
+        <w:t>Final assessment is conducted on Day 5 from 4:00 pm (briefing 4:00 pm, WA 4:30 pm, PP 5:30 pm).</w:t>
       </w:r>
     </w:p>
     <w:p>
@@ -1013,12 +1172,13 @@
         <w:tblStyle w:val="TableGrid"/>
         <w:tblW w:type="auto" w:w="0"/>
         <w:jc w:val="center"/>
+        <w:tblLayout w:type="fixed"/>
         <w:tblLook w:firstColumn="1" w:firstRow="1" w:lastColumn="0" w:lastRow="0" w:noHBand="0" w:noVBand="1" w:val="04A0"/>
       </w:tblPr>
       <w:tblGrid>
-        <w:gridCol w:w="2880"/>
-        <w:gridCol w:w="2880"/>
-        <w:gridCol w:w="2880"/>
+        <w:gridCol w:w="1656"/>
+        <w:gridCol w:w="1296"/>
+        <w:gridCol w:w="6840"/>
       </w:tblGrid>
       <w:tr>
         <w:tc>
@@ -1124,7 +1284,7 @@
                 <w:b w:val="0"/>
                 <w:sz w:val="19"/>
               </w:rPr>
-              <w:t>Welcome, course introduction, exam-domain overview, ground rules and mandatory digital attendance (AM)</w:t>
+              <w:t>Welcome, course introduction, the SY0-701 exam format and domains, ground rules, mandatory digital attendance (AM) and lab environment setup</w:t>
             </w:r>
           </w:p>
         </w:tc>
@@ -1177,7 +1337,7 @@
                 <w:b/>
                 <w:sz w:val="19"/>
               </w:rPr>
-              <w:t>Domain 1 concepts: security control categories &amp; types, defence in depth, gap analysis (Obj 1.1)</w:t>
+              <w:t>Domain 1 General Security Concepts — Objective 1.1 security controls and 1.2 fundamental concepts (CIA, AAA, Zero Trust, physical security, deception)</w:t>
             </w:r>
           </w:p>
         </w:tc>
@@ -1239,6 +1399,109 @@
         <w:tc>
           <w:tcPr>
             <w:tcW w:type="dxa" w:w="1656"/>
+          </w:tcPr>
+          <w:p>
+            <w:r/>
+            <w:r>
+              <w:rPr>
+                <w:rFonts w:ascii="Arial" w:hAnsi="Arial"/>
+                <w:b w:val="0"/>
+                <w:sz w:val="19"/>
+              </w:rPr>
+              <w:t>11:15–13:00</w:t>
+            </w:r>
+          </w:p>
+        </w:tc>
+        <w:tc>
+          <w:tcPr>
+            <w:tcW w:type="dxa" w:w="1296"/>
+          </w:tcPr>
+          <w:p>
+            <w:r/>
+            <w:r>
+              <w:rPr>
+                <w:rFonts w:ascii="Arial" w:hAnsi="Arial"/>
+                <w:b w:val="0"/>
+                <w:sz w:val="19"/>
+              </w:rPr>
+              <w:t>105 min</w:t>
+            </w:r>
+          </w:p>
+        </w:tc>
+        <w:tc>
+          <w:tcPr>
+            <w:tcW w:type="dxa" w:w="6840"/>
+          </w:tcPr>
+          <w:p>
+            <w:r/>
+            <w:r>
+              <w:rPr>
+                <w:rFonts w:ascii="Arial" w:hAnsi="Arial"/>
+                <w:b w:val="0"/>
+                <w:sz w:val="19"/>
+              </w:rPr>
+              <w:t>Hands-on: Lab 1: Security Controls Categorization; Lab 2: CIA Triad and AAA on Linux; Lab 3: Deception: Honeypots, Honeyfiles and Honeytokens</w:t>
+            </w:r>
+          </w:p>
+        </w:tc>
+      </w:tr>
+      <w:tr>
+        <w:tc>
+          <w:tcPr>
+            <w:tcW w:type="dxa" w:w="1656"/>
+            <w:shd w:val="clear" w:color="auto" w:fill="FDE9D9"/>
+          </w:tcPr>
+          <w:p>
+            <w:r/>
+            <w:r>
+              <w:rPr>
+                <w:rFonts w:ascii="Arial" w:hAnsi="Arial"/>
+                <w:b w:val="0"/>
+                <w:sz w:val="19"/>
+              </w:rPr>
+              <w:t>13:00–14:00</w:t>
+            </w:r>
+          </w:p>
+        </w:tc>
+        <w:tc>
+          <w:tcPr>
+            <w:tcW w:type="dxa" w:w="1296"/>
+            <w:shd w:val="clear" w:color="auto" w:fill="FDE9D9"/>
+          </w:tcPr>
+          <w:p>
+            <w:r/>
+            <w:r>
+              <w:rPr>
+                <w:rFonts w:ascii="Arial" w:hAnsi="Arial"/>
+                <w:b w:val="0"/>
+                <w:sz w:val="19"/>
+              </w:rPr>
+              <w:t>60 min</w:t>
+            </w:r>
+          </w:p>
+        </w:tc>
+        <w:tc>
+          <w:tcPr>
+            <w:tcW w:type="dxa" w:w="6840"/>
+            <w:shd w:val="clear" w:color="auto" w:fill="FDE9D9"/>
+          </w:tcPr>
+          <w:p>
+            <w:r/>
+            <w:r>
+              <w:rPr>
+                <w:rFonts w:ascii="Arial" w:hAnsi="Arial"/>
+                <w:b w:val="0"/>
+                <w:sz w:val="19"/>
+              </w:rPr>
+              <w:t>Lunch break</w:t>
+            </w:r>
+          </w:p>
+        </w:tc>
+      </w:tr>
+      <w:tr>
+        <w:tc>
+          <w:tcPr>
+            <w:tcW w:type="dxa" w:w="1656"/>
             <w:shd w:val="clear" w:color="auto" w:fill="E8F0FE"/>
           </w:tcPr>
           <w:p>
@@ -1249,7 +1512,7 @@
                 <w:b/>
                 <w:sz w:val="19"/>
               </w:rPr>
-              <w:t>11:15–13:00</w:t>
+              <w:t>14:00–15:00</w:t>
             </w:r>
           </w:p>
         </w:tc>
@@ -1266,7 +1529,7 @@
                 <w:b w:val="0"/>
                 <w:sz w:val="19"/>
               </w:rPr>
-              <w:t>105 min</w:t>
+              <w:t>60 min</w:t>
             </w:r>
           </w:p>
         </w:tc>
@@ -1283,7 +1546,7 @@
                 <w:b/>
                 <w:sz w:val="19"/>
               </w:rPr>
-              <w:t>Domain 1 concepts: CIA/DAD triad, AAA, MFA, Zero Trust, physical security, deception; change management (Obj 1.2–1.3)</w:t>
+              <w:t>Objective 1.3 change management and 1.4 cryptographic solutions (encryption, hashing, signatures, PKI, key protection, obfuscation)</w:t>
             </w:r>
           </w:p>
         </w:tc>
@@ -1292,7 +1555,6 @@
         <w:tc>
           <w:tcPr>
             <w:tcW w:type="dxa" w:w="1656"/>
-            <w:shd w:val="clear" w:color="auto" w:fill="FDE9D9"/>
           </w:tcPr>
           <w:p>
             <w:r/>
@@ -1302,14 +1564,13 @@
                 <w:b w:val="0"/>
                 <w:sz w:val="19"/>
               </w:rPr>
-              <w:t>13:00–14:00</w:t>
+              <w:t>15:00–16:30</w:t>
             </w:r>
           </w:p>
         </w:tc>
         <w:tc>
           <w:tcPr>
             <w:tcW w:type="dxa" w:w="1296"/>
-            <w:shd w:val="clear" w:color="auto" w:fill="FDE9D9"/>
           </w:tcPr>
           <w:p>
             <w:r/>
@@ -1319,14 +1580,13 @@
                 <w:b w:val="0"/>
                 <w:sz w:val="19"/>
               </w:rPr>
-              <w:t>60 min</w:t>
+              <w:t>90 min</w:t>
             </w:r>
           </w:p>
         </w:tc>
         <w:tc>
           <w:tcPr>
             <w:tcW w:type="dxa" w:w="6840"/>
-            <w:shd w:val="clear" w:color="auto" w:fill="FDE9D9"/>
           </w:tcPr>
           <w:p>
             <w:r/>
@@ -1336,7 +1596,7 @@
                 <w:b w:val="0"/>
                 <w:sz w:val="19"/>
               </w:rPr>
-              <w:t>Lunch break</w:t>
+              <w:t>Hands-on: Lab 4: Change Management with Version-Controlled Configuration; Lab 5: Hashing, Salting, and Digital Signatures</w:t>
             </w:r>
           </w:p>
         </w:tc>
@@ -1345,24 +1605,7 @@
         <w:tc>
           <w:tcPr>
             <w:tcW w:type="dxa" w:w="1656"/>
-            <w:shd w:val="clear" w:color="auto" w:fill="E8F0FE"/>
-          </w:tcPr>
-          <w:p>
-            <w:r/>
-            <w:r>
-              <w:rPr>
-                <w:rFonts w:ascii="Arial" w:hAnsi="Arial"/>
-                <w:b/>
-                <w:sz w:val="19"/>
-              </w:rPr>
-              <w:t>14:00–15:00</w:t>
-            </w:r>
-          </w:p>
-        </w:tc>
-        <w:tc>
-          <w:tcPr>
-            <w:tcW w:type="dxa" w:w="1296"/>
-            <w:shd w:val="clear" w:color="auto" w:fill="E8F0FE"/>
+            <w:shd w:val="clear" w:color="auto" w:fill="FFF4E5"/>
           </w:tcPr>
           <w:p>
             <w:r/>
@@ -1372,32 +1615,14 @@
                 <w:b w:val="0"/>
                 <w:sz w:val="19"/>
               </w:rPr>
-              <w:t>60 min</w:t>
-            </w:r>
-          </w:p>
-        </w:tc>
-        <w:tc>
-          <w:tcPr>
-            <w:tcW w:type="dxa" w:w="6840"/>
-            <w:shd w:val="clear" w:color="auto" w:fill="E8F0FE"/>
-          </w:tcPr>
-          <w:p>
-            <w:r/>
-            <w:r>
-              <w:rPr>
-                <w:rFonts w:ascii="Arial" w:hAnsi="Arial"/>
-                <w:b/>
-                <w:sz w:val="19"/>
-              </w:rPr>
-              <w:t>Domain 1 concepts: cryptography — symmetric/asymmetric, hashing, digital signatures, PKI, key protection, obfuscation (Obj 1.4)</w:t>
-            </w:r>
-          </w:p>
-        </w:tc>
-      </w:tr>
-      <w:tr>
-        <w:tc>
-          <w:tcPr>
-            <w:tcW w:type="dxa" w:w="1656"/>
+              <w:t>16:30–16:45</w:t>
+            </w:r>
+          </w:p>
+        </w:tc>
+        <w:tc>
+          <w:tcPr>
+            <w:tcW w:type="dxa" w:w="1296"/>
+            <w:shd w:val="clear" w:color="auto" w:fill="FFF4E5"/>
           </w:tcPr>
           <w:p>
             <w:r/>
@@ -1407,13 +1632,14 @@
                 <w:b w:val="0"/>
                 <w:sz w:val="19"/>
               </w:rPr>
-              <w:t>15:00–16:15</w:t>
-            </w:r>
-          </w:p>
-        </w:tc>
-        <w:tc>
-          <w:tcPr>
-            <w:tcW w:type="dxa" w:w="1296"/>
+              <w:t>15 min</w:t>
+            </w:r>
+          </w:p>
+        </w:tc>
+        <w:tc>
+          <w:tcPr>
+            <w:tcW w:type="dxa" w:w="6840"/>
+            <w:shd w:val="clear" w:color="auto" w:fill="FFF4E5"/>
           </w:tcPr>
           <w:p>
             <w:r/>
@@ -1423,13 +1649,15 @@
                 <w:b w:val="0"/>
                 <w:sz w:val="19"/>
               </w:rPr>
-              <w:t>75 min</w:t>
-            </w:r>
-          </w:p>
-        </w:tc>
-        <w:tc>
-          <w:tcPr>
-            <w:tcW w:type="dxa" w:w="6840"/>
+              <w:t>Tea break</w:t>
+            </w:r>
+          </w:p>
+        </w:tc>
+      </w:tr>
+      <w:tr>
+        <w:tc>
+          <w:tcPr>
+            <w:tcW w:type="dxa" w:w="1656"/>
           </w:tcPr>
           <w:p>
             <w:r/>
@@ -1439,16 +1667,13 @@
                 <w:b w:val="0"/>
                 <w:sz w:val="19"/>
               </w:rPr>
-              <w:t>Hands-on: Lab 1: Security Controls Categorization; Lab 2: CIA Triad and AAA on Linux; Lab 3: Hashing, Salting, and Digital Signatures</w:t>
-            </w:r>
-          </w:p>
-        </w:tc>
-      </w:tr>
-      <w:tr>
-        <w:tc>
-          <w:tcPr>
-            <w:tcW w:type="dxa" w:w="1656"/>
-            <w:shd w:val="clear" w:color="auto" w:fill="FFF4E5"/>
+              <w:t>16:45–17:45</w:t>
+            </w:r>
+          </w:p>
+        </w:tc>
+        <w:tc>
+          <w:tcPr>
+            <w:tcW w:type="dxa" w:w="1296"/>
           </w:tcPr>
           <w:p>
             <w:r/>
@@ -1458,14 +1683,13 @@
                 <w:b w:val="0"/>
                 <w:sz w:val="19"/>
               </w:rPr>
-              <w:t>16:15–16:30</w:t>
-            </w:r>
-          </w:p>
-        </w:tc>
-        <w:tc>
-          <w:tcPr>
-            <w:tcW w:type="dxa" w:w="1296"/>
-            <w:shd w:val="clear" w:color="auto" w:fill="FFF4E5"/>
+              <w:t>60 min</w:t>
+            </w:r>
+          </w:p>
+        </w:tc>
+        <w:tc>
+          <w:tcPr>
+            <w:tcW w:type="dxa" w:w="6840"/>
           </w:tcPr>
           <w:p>
             <w:r/>
@@ -1475,14 +1699,16 @@
                 <w:b w:val="0"/>
                 <w:sz w:val="19"/>
               </w:rPr>
-              <w:t>15 min</w:t>
-            </w:r>
-          </w:p>
-        </w:tc>
-        <w:tc>
-          <w:tcPr>
-            <w:tcW w:type="dxa" w:w="6840"/>
-            <w:shd w:val="clear" w:color="auto" w:fill="FFF4E5"/>
+              <w:t>Hands-on: Lab 6: Symmetric vs. Asymmetric Encryption and Key Exchange; Lab 7: PKI: Build Your Own Certificate Authority</w:t>
+            </w:r>
+          </w:p>
+        </w:tc>
+      </w:tr>
+      <w:tr>
+        <w:tc>
+          <w:tcPr>
+            <w:tcW w:type="dxa" w:w="1656"/>
+            <w:shd w:val="clear" w:color="auto" w:fill="F3F5F8"/>
           </w:tcPr>
           <w:p>
             <w:r/>
@@ -1492,15 +1718,14 @@
                 <w:b w:val="0"/>
                 <w:sz w:val="19"/>
               </w:rPr>
-              <w:t>Tea break</w:t>
-            </w:r>
-          </w:p>
-        </w:tc>
-      </w:tr>
-      <w:tr>
-        <w:tc>
-          <w:tcPr>
-            <w:tcW w:type="dxa" w:w="1656"/>
+              <w:t>17:45–18:30</w:t>
+            </w:r>
+          </w:p>
+        </w:tc>
+        <w:tc>
+          <w:tcPr>
+            <w:tcW w:type="dxa" w:w="1296"/>
+            <w:shd w:val="clear" w:color="auto" w:fill="F3F5F8"/>
           </w:tcPr>
           <w:p>
             <w:r/>
@@ -1510,13 +1735,14 @@
                 <w:b w:val="0"/>
                 <w:sz w:val="19"/>
               </w:rPr>
-              <w:t>16:30–18:15</w:t>
-            </w:r>
-          </w:p>
-        </w:tc>
-        <w:tc>
-          <w:tcPr>
-            <w:tcW w:type="dxa" w:w="1296"/>
+              <w:t>45 min</w:t>
+            </w:r>
+          </w:p>
+        </w:tc>
+        <w:tc>
+          <w:tcPr>
+            <w:tcW w:type="dxa" w:w="6840"/>
+            <w:shd w:val="clear" w:color="auto" w:fill="F3F5F8"/>
           </w:tcPr>
           <w:p>
             <w:r/>
@@ -1526,76 +1752,7 @@
                 <w:b w:val="0"/>
                 <w:sz w:val="19"/>
               </w:rPr>
-              <w:t>105 min</w:t>
-            </w:r>
-          </w:p>
-        </w:tc>
-        <w:tc>
-          <w:tcPr>
-            <w:tcW w:type="dxa" w:w="6840"/>
-          </w:tcPr>
-          <w:p>
-            <w:r/>
-            <w:r>
-              <w:rPr>
-                <w:rFonts w:ascii="Arial" w:hAnsi="Arial"/>
-                <w:b w:val="0"/>
-                <w:sz w:val="19"/>
-              </w:rPr>
-              <w:t>Hands-on: Lab 4: Symmetric vs. Asymmetric Encryption; Lab 5: PKI: Build Your Own Certificate Authority</w:t>
-            </w:r>
-          </w:p>
-        </w:tc>
-      </w:tr>
-      <w:tr>
-        <w:tc>
-          <w:tcPr>
-            <w:tcW w:type="dxa" w:w="1656"/>
-            <w:shd w:val="clear" w:color="auto" w:fill="F3F5F8"/>
-          </w:tcPr>
-          <w:p>
-            <w:r/>
-            <w:r>
-              <w:rPr>
-                <w:rFonts w:ascii="Arial" w:hAnsi="Arial"/>
-                <w:b w:val="0"/>
-                <w:sz w:val="19"/>
-              </w:rPr>
-              <w:t>18:15–18:30</w:t>
-            </w:r>
-          </w:p>
-        </w:tc>
-        <w:tc>
-          <w:tcPr>
-            <w:tcW w:type="dxa" w:w="1296"/>
-            <w:shd w:val="clear" w:color="auto" w:fill="F3F5F8"/>
-          </w:tcPr>
-          <w:p>
-            <w:r/>
-            <w:r>
-              <w:rPr>
-                <w:rFonts w:ascii="Arial" w:hAnsi="Arial"/>
-                <w:b w:val="0"/>
-                <w:sz w:val="19"/>
-              </w:rPr>
-              <w:t>15 min</w:t>
-            </w:r>
-          </w:p>
-        </w:tc>
-        <w:tc>
-          <w:tcPr>
-            <w:tcW w:type="dxa" w:w="6840"/>
-            <w:shd w:val="clear" w:color="auto" w:fill="F3F5F8"/>
-          </w:tcPr>
-          <w:p>
-            <w:r/>
-            <w:r>
-              <w:rPr>
-                <w:rFonts w:ascii="Arial" w:hAnsi="Arial"/>
-                <w:b w:val="0"/>
-                <w:sz w:val="19"/>
-              </w:rPr>
-              <w:t>Day 1 recap, Q&amp;A and PM digital attendance</w:t>
+              <w:t>Domain 1 recap, exam-style practice questions, Q&amp;A and PM digital attendance</w:t>
             </w:r>
           </w:p>
         </w:tc>
@@ -1608,7 +1765,7 @@
           <w:color w:val="555B66"/>
           <w:sz w:val="19"/>
         </w:rPr>
-        <w:t>Total training time: 480 minutes (8 hours).</w:t>
+        <w:t>Total scheduled time: 480 minutes (8 hours) excluding lunch — of which 450 minutes (7.5 hours) are instructional, plus 30 minutes of tea breaks.</w:t>
       </w:r>
     </w:p>
     <w:p>
@@ -1616,7 +1773,7 @@
         <w:pStyle w:val="Heading2"/>
       </w:pPr>
       <w:r>
-        <w:t>Day 2 — Domain 2 — Threats, Vulnerabilities &amp; Mitigations (22%)</w:t>
+        <w:t>Day 2 — Domain 2 — Threats, Vulnerabilities and Mitigations (22%)</w:t>
       </w:r>
     </w:p>
     <w:tbl>
@@ -1624,12 +1781,13 @@
         <w:tblStyle w:val="TableGrid"/>
         <w:tblW w:type="auto" w:w="0"/>
         <w:jc w:val="center"/>
+        <w:tblLayout w:type="fixed"/>
         <w:tblLook w:firstColumn="1" w:firstRow="1" w:lastColumn="0" w:lastRow="0" w:noHBand="0" w:noVBand="1" w:val="04A0"/>
       </w:tblPr>
       <w:tblGrid>
-        <w:gridCol w:w="2880"/>
-        <w:gridCol w:w="2880"/>
-        <w:gridCol w:w="2880"/>
+        <w:gridCol w:w="1656"/>
+        <w:gridCol w:w="1296"/>
+        <w:gridCol w:w="6840"/>
       </w:tblGrid>
       <w:tr>
         <w:tc>
@@ -1735,7 +1893,7 @@
                 <w:b w:val="0"/>
                 <w:sz w:val="19"/>
               </w:rPr>
-              <w:t>Day 1 recap and mandatory digital attendance (AM)</w:t>
+              <w:t>Day 1 review, warm-up questions and mandatory digital attendance (AM)</w:t>
             </w:r>
           </w:p>
         </w:tc>
@@ -1754,7 +1912,7 @@
                 <w:b/>
                 <w:sz w:val="19"/>
               </w:rPr>
-              <w:t>9:45–11:00</w:t>
+              <w:t>9:45–10:30</w:t>
             </w:r>
           </w:p>
         </w:tc>
@@ -1771,7 +1929,7 @@
                 <w:b w:val="0"/>
                 <w:sz w:val="19"/>
               </w:rPr>
-              <w:t>75 min</w:t>
+              <w:t>45 min</w:t>
             </w:r>
           </w:p>
         </w:tc>
@@ -1788,7 +1946,7 @@
                 <w:b/>
                 <w:sz w:val="19"/>
               </w:rPr>
-              <w:t>Domain 2 concepts: threat actors &amp; motivations, vectors &amp; attack surface; malware, DoS/DDoS, network &amp; application attacks (Obj 2.1–2.2)</w:t>
+              <w:t>Domain 2 Threats, Vulnerabilities and Mitigations — Objective 2.1 threat actors and motivations, 2.2 threat vectors, attack surfaces and social engineering</w:t>
             </w:r>
           </w:p>
         </w:tc>
@@ -1797,7 +1955,6 @@
         <w:tc>
           <w:tcPr>
             <w:tcW w:type="dxa" w:w="1656"/>
-            <w:shd w:val="clear" w:color="auto" w:fill="FFF4E5"/>
           </w:tcPr>
           <w:p>
             <w:r/>
@@ -1807,14 +1964,13 @@
                 <w:b w:val="0"/>
                 <w:sz w:val="19"/>
               </w:rPr>
-              <w:t>11:00–11:15</w:t>
+              <w:t>10:30–11:15</w:t>
             </w:r>
           </w:p>
         </w:tc>
         <w:tc>
           <w:tcPr>
             <w:tcW w:type="dxa" w:w="1296"/>
-            <w:shd w:val="clear" w:color="auto" w:fill="FFF4E5"/>
           </w:tcPr>
           <w:p>
             <w:r/>
@@ -1824,14 +1980,13 @@
                 <w:b w:val="0"/>
                 <w:sz w:val="19"/>
               </w:rPr>
-              <w:t>15 min</w:t>
+              <w:t>45 min</w:t>
             </w:r>
           </w:p>
         </w:tc>
         <w:tc>
           <w:tcPr>
             <w:tcW w:type="dxa" w:w="6840"/>
-            <w:shd w:val="clear" w:color="auto" w:fill="FFF4E5"/>
           </w:tcPr>
           <w:p>
             <w:r/>
@@ -1841,6 +1996,59 @@
                 <w:b w:val="0"/>
                 <w:sz w:val="19"/>
               </w:rPr>
+              <w:t>Hands-on: Lab 8: Threat Actors &amp; the MITRE ATT&amp;CK Framework; Lab 9: Phishing Email Analysis (SPF / DKIM / DMARC)</w:t>
+            </w:r>
+          </w:p>
+        </w:tc>
+      </w:tr>
+      <w:tr>
+        <w:tc>
+          <w:tcPr>
+            <w:tcW w:type="dxa" w:w="1656"/>
+            <w:shd w:val="clear" w:color="auto" w:fill="FFF4E5"/>
+          </w:tcPr>
+          <w:p>
+            <w:r/>
+            <w:r>
+              <w:rPr>
+                <w:rFonts w:ascii="Arial" w:hAnsi="Arial"/>
+                <w:b w:val="0"/>
+                <w:sz w:val="19"/>
+              </w:rPr>
+              <w:t>11:15–11:30</w:t>
+            </w:r>
+          </w:p>
+        </w:tc>
+        <w:tc>
+          <w:tcPr>
+            <w:tcW w:type="dxa" w:w="1296"/>
+            <w:shd w:val="clear" w:color="auto" w:fill="FFF4E5"/>
+          </w:tcPr>
+          <w:p>
+            <w:r/>
+            <w:r>
+              <w:rPr>
+                <w:rFonts w:ascii="Arial" w:hAnsi="Arial"/>
+                <w:b w:val="0"/>
+                <w:sz w:val="19"/>
+              </w:rPr>
+              <w:t>15 min</w:t>
+            </w:r>
+          </w:p>
+        </w:tc>
+        <w:tc>
+          <w:tcPr>
+            <w:tcW w:type="dxa" w:w="6840"/>
+            <w:shd w:val="clear" w:color="auto" w:fill="FFF4E5"/>
+          </w:tcPr>
+          <w:p>
+            <w:r/>
+            <w:r>
+              <w:rPr>
+                <w:rFonts w:ascii="Arial" w:hAnsi="Arial"/>
+                <w:b w:val="0"/>
+                <w:sz w:val="19"/>
+              </w:rPr>
               <w:t>Tea break</w:t>
             </w:r>
           </w:p>
@@ -1860,7 +2068,7 @@
                 <w:b/>
                 <w:sz w:val="19"/>
               </w:rPr>
-              <w:t>11:15–13:00</w:t>
+              <w:t>11:30–12:00</w:t>
             </w:r>
           </w:p>
         </w:tc>
@@ -1877,7 +2085,7 @@
                 <w:b w:val="0"/>
                 <w:sz w:val="19"/>
               </w:rPr>
-              <w:t>105 min</w:t>
+              <w:t>30 min</w:t>
             </w:r>
           </w:p>
         </w:tc>
@@ -1894,7 +2102,7 @@
                 <w:b/>
                 <w:sz w:val="19"/>
               </w:rPr>
-              <w:t>Domain 2 concepts: social engineering, IOCs, password &amp; wireless attacks, vulnerability types &amp; mitigations (Obj 2.3–2.5). Hands-on: Lab 6: Phishing Email Header Analysis (SPF / DKIM / DMARC); Lab 7: Password Attacks: Spraying, Brute Force, Cracking</w:t>
+              <w:t>Objective 2.3 types of vulnerabilities (application, memory, web, OS, hardware, cloud, supply chain, zero-day)</w:t>
             </w:r>
           </w:p>
         </w:tc>
@@ -1903,7 +2111,6 @@
         <w:tc>
           <w:tcPr>
             <w:tcW w:type="dxa" w:w="1656"/>
-            <w:shd w:val="clear" w:color="auto" w:fill="FDE9D9"/>
           </w:tcPr>
           <w:p>
             <w:r/>
@@ -1913,14 +2120,13 @@
                 <w:b w:val="0"/>
                 <w:sz w:val="19"/>
               </w:rPr>
-              <w:t>13:00–14:00</w:t>
+              <w:t>12:00–13:00</w:t>
             </w:r>
           </w:p>
         </w:tc>
         <w:tc>
           <w:tcPr>
             <w:tcW w:type="dxa" w:w="1296"/>
-            <w:shd w:val="clear" w:color="auto" w:fill="FDE9D9"/>
           </w:tcPr>
           <w:p>
             <w:r/>
@@ -1937,7 +2143,6 @@
         <w:tc>
           <w:tcPr>
             <w:tcW w:type="dxa" w:w="6840"/>
-            <w:shd w:val="clear" w:color="auto" w:fill="FDE9D9"/>
           </w:tcPr>
           <w:p>
             <w:r/>
@@ -1947,7 +2152,7 @@
                 <w:b w:val="0"/>
                 <w:sz w:val="19"/>
               </w:rPr>
-              <w:t>Lunch break</w:t>
+              <w:t>Hands-on: Lab 10: SQL Injection (SQLi); Lab 11: Cross-Site Scripting (XSS); Lab 12: Memory Vulnerabilities &amp; Exploit Mitigations</w:t>
             </w:r>
           </w:p>
         </w:tc>
@@ -1956,6 +2161,7 @@
         <w:tc>
           <w:tcPr>
             <w:tcW w:type="dxa" w:w="1656"/>
+            <w:shd w:val="clear" w:color="auto" w:fill="FDE9D9"/>
           </w:tcPr>
           <w:p>
             <w:r/>
@@ -1965,13 +2171,14 @@
                 <w:b w:val="0"/>
                 <w:sz w:val="19"/>
               </w:rPr>
-              <w:t>14:00–16:15</w:t>
+              <w:t>13:00–14:00</w:t>
             </w:r>
           </w:p>
         </w:tc>
         <w:tc>
           <w:tcPr>
             <w:tcW w:type="dxa" w:w="1296"/>
+            <w:shd w:val="clear" w:color="auto" w:fill="FDE9D9"/>
           </w:tcPr>
           <w:p>
             <w:r/>
@@ -1981,13 +2188,14 @@
                 <w:b w:val="0"/>
                 <w:sz w:val="19"/>
               </w:rPr>
-              <w:t>135 min</w:t>
+              <w:t>60 min</w:t>
             </w:r>
           </w:p>
         </w:tc>
         <w:tc>
           <w:tcPr>
             <w:tcW w:type="dxa" w:w="6840"/>
+            <w:shd w:val="clear" w:color="auto" w:fill="FDE9D9"/>
           </w:tcPr>
           <w:p>
             <w:r/>
@@ -1997,7 +2205,7 @@
                 <w:b w:val="0"/>
                 <w:sz w:val="19"/>
               </w:rPr>
-              <w:t>Hands-on: Lab 8: Malware Static Analysis (Safe Sample); Lab 9: SQL Injection (SQLi); Lab 10: Cross-Site Scripting (XSS)</w:t>
+              <w:t>Lunch break</w:t>
             </w:r>
           </w:p>
         </w:tc>
@@ -2006,7 +2214,24 @@
         <w:tc>
           <w:tcPr>
             <w:tcW w:type="dxa" w:w="1656"/>
-            <w:shd w:val="clear" w:color="auto" w:fill="FFF4E5"/>
+            <w:shd w:val="clear" w:color="auto" w:fill="E8F0FE"/>
+          </w:tcPr>
+          <w:p>
+            <w:r/>
+            <w:r>
+              <w:rPr>
+                <w:rFonts w:ascii="Arial" w:hAnsi="Arial"/>
+                <w:b/>
+                <w:sz w:val="19"/>
+              </w:rPr>
+              <w:t>14:00–14:45</w:t>
+            </w:r>
+          </w:p>
+        </w:tc>
+        <w:tc>
+          <w:tcPr>
+            <w:tcW w:type="dxa" w:w="1296"/>
+            <w:shd w:val="clear" w:color="auto" w:fill="E8F0FE"/>
           </w:tcPr>
           <w:p>
             <w:r/>
@@ -2016,14 +2241,32 @@
                 <w:b w:val="0"/>
                 <w:sz w:val="19"/>
               </w:rPr>
-              <w:t>16:15–16:30</w:t>
-            </w:r>
-          </w:p>
-        </w:tc>
-        <w:tc>
-          <w:tcPr>
-            <w:tcW w:type="dxa" w:w="1296"/>
-            <w:shd w:val="clear" w:color="auto" w:fill="FFF4E5"/>
+              <w:t>45 min</w:t>
+            </w:r>
+          </w:p>
+        </w:tc>
+        <w:tc>
+          <w:tcPr>
+            <w:tcW w:type="dxa" w:w="6840"/>
+            <w:shd w:val="clear" w:color="auto" w:fill="E8F0FE"/>
+          </w:tcPr>
+          <w:p>
+            <w:r/>
+            <w:r>
+              <w:rPr>
+                <w:rFonts w:ascii="Arial" w:hAnsi="Arial"/>
+                <w:b/>
+                <w:sz w:val="19"/>
+              </w:rPr>
+              <w:t>Objective 2.4 indicators of malicious activity (malware, physical, network, application, cryptographic and password attacks)</w:t>
+            </w:r>
+          </w:p>
+        </w:tc>
+      </w:tr>
+      <w:tr>
+        <w:tc>
+          <w:tcPr>
+            <w:tcW w:type="dxa" w:w="1656"/>
           </w:tcPr>
           <w:p>
             <w:r/>
@@ -2033,14 +2276,13 @@
                 <w:b w:val="0"/>
                 <w:sz w:val="19"/>
               </w:rPr>
-              <w:t>15 min</w:t>
-            </w:r>
-          </w:p>
-        </w:tc>
-        <w:tc>
-          <w:tcPr>
-            <w:tcW w:type="dxa" w:w="6840"/>
-            <w:shd w:val="clear" w:color="auto" w:fill="FFF4E5"/>
+              <w:t>14:45–16:15</w:t>
+            </w:r>
+          </w:p>
+        </w:tc>
+        <w:tc>
+          <w:tcPr>
+            <w:tcW w:type="dxa" w:w="1296"/>
           </w:tcPr>
           <w:p>
             <w:r/>
@@ -2050,15 +2292,13 @@
                 <w:b w:val="0"/>
                 <w:sz w:val="19"/>
               </w:rPr>
-              <w:t>Tea break</w:t>
-            </w:r>
-          </w:p>
-        </w:tc>
-      </w:tr>
-      <w:tr>
-        <w:tc>
-          <w:tcPr>
-            <w:tcW w:type="dxa" w:w="1656"/>
+              <w:t>90 min</w:t>
+            </w:r>
+          </w:p>
+        </w:tc>
+        <w:tc>
+          <w:tcPr>
+            <w:tcW w:type="dxa" w:w="6840"/>
           </w:tcPr>
           <w:p>
             <w:r/>
@@ -2068,13 +2308,16 @@
                 <w:b w:val="0"/>
                 <w:sz w:val="19"/>
               </w:rPr>
-              <w:t>16:30–18:15</w:t>
-            </w:r>
-          </w:p>
-        </w:tc>
-        <w:tc>
-          <w:tcPr>
-            <w:tcW w:type="dxa" w:w="1296"/>
+              <w:t>Hands-on: Lab 13: Password Attacks: Spraying &amp; Brute Force; Lab 14: Malware Static Analysis &amp; Linux IOC Hunting; Lab 15: DoS Simulation and Detection</w:t>
+            </w:r>
+          </w:p>
+        </w:tc>
+      </w:tr>
+      <w:tr>
+        <w:tc>
+          <w:tcPr>
+            <w:tcW w:type="dxa" w:w="1656"/>
+            <w:shd w:val="clear" w:color="auto" w:fill="FFF4E5"/>
           </w:tcPr>
           <w:p>
             <w:r/>
@@ -2084,13 +2327,14 @@
                 <w:b w:val="0"/>
                 <w:sz w:val="19"/>
               </w:rPr>
-              <w:t>105 min</w:t>
-            </w:r>
-          </w:p>
-        </w:tc>
-        <w:tc>
-          <w:tcPr>
-            <w:tcW w:type="dxa" w:w="6840"/>
+              <w:t>16:15–16:30</w:t>
+            </w:r>
+          </w:p>
+        </w:tc>
+        <w:tc>
+          <w:tcPr>
+            <w:tcW w:type="dxa" w:w="1296"/>
+            <w:shd w:val="clear" w:color="auto" w:fill="FFF4E5"/>
           </w:tcPr>
           <w:p>
             <w:r/>
@@ -2100,16 +2344,14 @@
                 <w:b w:val="0"/>
                 <w:sz w:val="19"/>
               </w:rPr>
-              <w:t>Hands-on: Lab 11: DoS Simulation and Detection; Lab 12: Vulnerability Scanning with Nikto and Nuclei; Lab 13: Linux Hardening Baseline with Lynis</w:t>
-            </w:r>
-          </w:p>
-        </w:tc>
-      </w:tr>
-      <w:tr>
-        <w:tc>
-          <w:tcPr>
-            <w:tcW w:type="dxa" w:w="1656"/>
-            <w:shd w:val="clear" w:color="auto" w:fill="F3F5F8"/>
+              <w:t>15 min</w:t>
+            </w:r>
+          </w:p>
+        </w:tc>
+        <w:tc>
+          <w:tcPr>
+            <w:tcW w:type="dxa" w:w="6840"/>
+            <w:shd w:val="clear" w:color="auto" w:fill="FFF4E5"/>
           </w:tcPr>
           <w:p>
             <w:r/>
@@ -2119,14 +2361,33 @@
                 <w:b w:val="0"/>
                 <w:sz w:val="19"/>
               </w:rPr>
-              <w:t>18:15–18:30</w:t>
+              <w:t>Tea break</w:t>
+            </w:r>
+          </w:p>
+        </w:tc>
+      </w:tr>
+      <w:tr>
+        <w:tc>
+          <w:tcPr>
+            <w:tcW w:type="dxa" w:w="1656"/>
+            <w:shd w:val="clear" w:color="auto" w:fill="E8F0FE"/>
+          </w:tcPr>
+          <w:p>
+            <w:r/>
+            <w:r>
+              <w:rPr>
+                <w:rFonts w:ascii="Arial" w:hAnsi="Arial"/>
+                <w:b/>
+                <w:sz w:val="19"/>
+              </w:rPr>
+              <w:t>16:30–16:50</w:t>
             </w:r>
           </w:p>
         </w:tc>
         <w:tc>
           <w:tcPr>
             <w:tcW w:type="dxa" w:w="1296"/>
-            <w:shd w:val="clear" w:color="auto" w:fill="F3F5F8"/>
+            <w:shd w:val="clear" w:color="auto" w:fill="E8F0FE"/>
           </w:tcPr>
           <w:p>
             <w:r/>
@@ -2136,14 +2397,32 @@
                 <w:b w:val="0"/>
                 <w:sz w:val="19"/>
               </w:rPr>
-              <w:t>15 min</w:t>
+              <w:t>20 min</w:t>
             </w:r>
           </w:p>
         </w:tc>
         <w:tc>
           <w:tcPr>
             <w:tcW w:type="dxa" w:w="6840"/>
-            <w:shd w:val="clear" w:color="auto" w:fill="F3F5F8"/>
+            <w:shd w:val="clear" w:color="auto" w:fill="E8F0FE"/>
+          </w:tcPr>
+          <w:p>
+            <w:r/>
+            <w:r>
+              <w:rPr>
+                <w:rFonts w:ascii="Arial" w:hAnsi="Arial"/>
+                <w:b/>
+                <w:sz w:val="19"/>
+              </w:rPr>
+              <w:t>Objective 2.5 mitigation techniques used to secure the enterprise</w:t>
+            </w:r>
+          </w:p>
+        </w:tc>
+      </w:tr>
+      <w:tr>
+        <w:tc>
+          <w:tcPr>
+            <w:tcW w:type="dxa" w:w="1656"/>
           </w:tcPr>
           <w:p>
             <w:r/>
@@ -2153,7 +2432,92 @@
                 <w:b w:val="0"/>
                 <w:sz w:val="19"/>
               </w:rPr>
-              <w:t>Day 2 recap, Q&amp;A and PM digital attendance</w:t>
+              <w:t>16:50–17:45</w:t>
+            </w:r>
+          </w:p>
+        </w:tc>
+        <w:tc>
+          <w:tcPr>
+            <w:tcW w:type="dxa" w:w="1296"/>
+          </w:tcPr>
+          <w:p>
+            <w:r/>
+            <w:r>
+              <w:rPr>
+                <w:rFonts w:ascii="Arial" w:hAnsi="Arial"/>
+                <w:b w:val="0"/>
+                <w:sz w:val="19"/>
+              </w:rPr>
+              <w:t>55 min</w:t>
+            </w:r>
+          </w:p>
+        </w:tc>
+        <w:tc>
+          <w:tcPr>
+            <w:tcW w:type="dxa" w:w="6840"/>
+          </w:tcPr>
+          <w:p>
+            <w:r/>
+            <w:r>
+              <w:rPr>
+                <w:rFonts w:ascii="Arial" w:hAnsi="Arial"/>
+                <w:b w:val="0"/>
+                <w:sz w:val="19"/>
+              </w:rPr>
+              <w:t>Hands-on: Lab 16: Linux Hardening Baseline with Lynis</w:t>
+            </w:r>
+          </w:p>
+        </w:tc>
+      </w:tr>
+      <w:tr>
+        <w:tc>
+          <w:tcPr>
+            <w:tcW w:type="dxa" w:w="1656"/>
+            <w:shd w:val="clear" w:color="auto" w:fill="F3F5F8"/>
+          </w:tcPr>
+          <w:p>
+            <w:r/>
+            <w:r>
+              <w:rPr>
+                <w:rFonts w:ascii="Arial" w:hAnsi="Arial"/>
+                <w:b w:val="0"/>
+                <w:sz w:val="19"/>
+              </w:rPr>
+              <w:t>17:45–18:30</w:t>
+            </w:r>
+          </w:p>
+        </w:tc>
+        <w:tc>
+          <w:tcPr>
+            <w:tcW w:type="dxa" w:w="1296"/>
+            <w:shd w:val="clear" w:color="auto" w:fill="F3F5F8"/>
+          </w:tcPr>
+          <w:p>
+            <w:r/>
+            <w:r>
+              <w:rPr>
+                <w:rFonts w:ascii="Arial" w:hAnsi="Arial"/>
+                <w:b w:val="0"/>
+                <w:sz w:val="19"/>
+              </w:rPr>
+              <w:t>45 min</w:t>
+            </w:r>
+          </w:p>
+        </w:tc>
+        <w:tc>
+          <w:tcPr>
+            <w:tcW w:type="dxa" w:w="6840"/>
+            <w:shd w:val="clear" w:color="auto" w:fill="F3F5F8"/>
+          </w:tcPr>
+          <w:p>
+            <w:r/>
+            <w:r>
+              <w:rPr>
+                <w:rFonts w:ascii="Arial" w:hAnsi="Arial"/>
+                <w:b w:val="0"/>
+                <w:sz w:val="19"/>
+              </w:rPr>
+              <w:t>Domain 2 recap, exam-style practice questions, Q&amp;A and PM digital attendance</w:t>
             </w:r>
           </w:p>
         </w:tc>
@@ -2166,7 +2530,7 @@
           <w:color w:val="555B66"/>
           <w:sz w:val="19"/>
         </w:rPr>
-        <w:t>Total training time: 480 minutes (8 hours).</w:t>
+        <w:t>Total scheduled time: 480 minutes (8 hours) excluding lunch — of which 450 minutes (7.5 hours) are instructional, plus 30 minutes of tea breaks.</w:t>
       </w:r>
     </w:p>
     <w:p>
@@ -2182,12 +2546,13 @@
         <w:tblStyle w:val="TableGrid"/>
         <w:tblW w:type="auto" w:w="0"/>
         <w:jc w:val="center"/>
+        <w:tblLayout w:type="fixed"/>
         <w:tblLook w:firstColumn="1" w:firstRow="1" w:lastColumn="0" w:lastRow="0" w:noHBand="0" w:noVBand="1" w:val="04A0"/>
       </w:tblPr>
       <w:tblGrid>
-        <w:gridCol w:w="2880"/>
-        <w:gridCol w:w="2880"/>
-        <w:gridCol w:w="2880"/>
+        <w:gridCol w:w="1656"/>
+        <w:gridCol w:w="1296"/>
+        <w:gridCol w:w="6840"/>
       </w:tblGrid>
       <w:tr>
         <w:tc>
@@ -2293,7 +2658,7 @@
                 <w:b w:val="0"/>
                 <w:sz w:val="19"/>
               </w:rPr>
-              <w:t>Day 2 recap and mandatory digital attendance (AM)</w:t>
+              <w:t>Day 2 review, warm-up questions and mandatory digital attendance (AM)</w:t>
             </w:r>
           </w:p>
         </w:tc>
@@ -2312,7 +2677,7 @@
                 <w:b/>
                 <w:sz w:val="19"/>
               </w:rPr>
-              <w:t>9:45–11:00</w:t>
+              <w:t>9:45–10:20</w:t>
             </w:r>
           </w:p>
         </w:tc>
@@ -2329,7 +2694,7 @@
                 <w:b w:val="0"/>
                 <w:sz w:val="19"/>
               </w:rPr>
-              <w:t>75 min</w:t>
+              <w:t>35 min</w:t>
             </w:r>
           </w:p>
         </w:tc>
@@ -2346,7 +2711,7 @@
                 <w:b/>
                 <w:sz w:val="19"/>
               </w:rPr>
-              <w:t>Domain 3 concepts: architecture models, cloud shared responsibility, IoT/OT; enterprise infrastructure, segmentation, firewalls, WAF, IDS/IPS, VPN (Obj 3.1–3.2)</w:t>
+              <w:t>Domain 3 Security Architecture — Objective 3.1 architecture models (cloud, IaC, serverless, containers, IoT, ICS/SCADA)</w:t>
             </w:r>
           </w:p>
         </w:tc>
@@ -2355,7 +2720,6 @@
         <w:tc>
           <w:tcPr>
             <w:tcW w:type="dxa" w:w="1656"/>
-            <w:shd w:val="clear" w:color="auto" w:fill="FFF4E5"/>
           </w:tcPr>
           <w:p>
             <w:r/>
@@ -2365,14 +2729,13 @@
                 <w:b w:val="0"/>
                 <w:sz w:val="19"/>
               </w:rPr>
-              <w:t>11:00–11:15</w:t>
+              <w:t>10:20–11:15</w:t>
             </w:r>
           </w:p>
         </w:tc>
         <w:tc>
           <w:tcPr>
             <w:tcW w:type="dxa" w:w="1296"/>
-            <w:shd w:val="clear" w:color="auto" w:fill="FFF4E5"/>
           </w:tcPr>
           <w:p>
             <w:r/>
@@ -2382,14 +2745,13 @@
                 <w:b w:val="0"/>
                 <w:sz w:val="19"/>
               </w:rPr>
-              <w:t>15 min</w:t>
+              <w:t>55 min</w:t>
             </w:r>
           </w:p>
         </w:tc>
         <w:tc>
           <w:tcPr>
             <w:tcW w:type="dxa" w:w="6840"/>
-            <w:shd w:val="clear" w:color="auto" w:fill="FFF4E5"/>
           </w:tcPr>
           <w:p>
             <w:r/>
@@ -2399,6 +2761,59 @@
                 <w:b w:val="0"/>
                 <w:sz w:val="19"/>
               </w:rPr>
+              <w:t>Hands-on: Lab 17: Cloud Shared Responsibility and IAM Least Privilege; Lab 18: Container Security with Docker</w:t>
+            </w:r>
+          </w:p>
+        </w:tc>
+      </w:tr>
+      <w:tr>
+        <w:tc>
+          <w:tcPr>
+            <w:tcW w:type="dxa" w:w="1656"/>
+            <w:shd w:val="clear" w:color="auto" w:fill="FFF4E5"/>
+          </w:tcPr>
+          <w:p>
+            <w:r/>
+            <w:r>
+              <w:rPr>
+                <w:rFonts w:ascii="Arial" w:hAnsi="Arial"/>
+                <w:b w:val="0"/>
+                <w:sz w:val="19"/>
+              </w:rPr>
+              <w:t>11:15–11:30</w:t>
+            </w:r>
+          </w:p>
+        </w:tc>
+        <w:tc>
+          <w:tcPr>
+            <w:tcW w:type="dxa" w:w="1296"/>
+            <w:shd w:val="clear" w:color="auto" w:fill="FFF4E5"/>
+          </w:tcPr>
+          <w:p>
+            <w:r/>
+            <w:r>
+              <w:rPr>
+                <w:rFonts w:ascii="Arial" w:hAnsi="Arial"/>
+                <w:b w:val="0"/>
+                <w:sz w:val="19"/>
+              </w:rPr>
+              <w:t>15 min</w:t>
+            </w:r>
+          </w:p>
+        </w:tc>
+        <w:tc>
+          <w:tcPr>
+            <w:tcW w:type="dxa" w:w="6840"/>
+            <w:shd w:val="clear" w:color="auto" w:fill="FFF4E5"/>
+          </w:tcPr>
+          <w:p>
+            <w:r/>
+            <w:r>
+              <w:rPr>
+                <w:rFonts w:ascii="Arial" w:hAnsi="Arial"/>
+                <w:b w:val="0"/>
+                <w:sz w:val="19"/>
+              </w:rPr>
               <w:t>Tea break</w:t>
             </w:r>
           </w:p>
@@ -2418,7 +2833,7 @@
                 <w:b/>
                 <w:sz w:val="19"/>
               </w:rPr>
-              <w:t>11:15–13:00</w:t>
+              <w:t>11:30–12:10</w:t>
             </w:r>
           </w:p>
         </w:tc>
@@ -2435,7 +2850,7 @@
                 <w:b w:val="0"/>
                 <w:sz w:val="19"/>
               </w:rPr>
-              <w:t>105 min</w:t>
+              <w:t>40 min</w:t>
             </w:r>
           </w:p>
         </w:tc>
@@ -2452,7 +2867,7 @@
                 <w:b/>
                 <w:sz w:val="19"/>
               </w:rPr>
-              <w:t>Domain 3 concepts: data protection &amp; states, encryption, DLP; resilience, RAID, backup 3-2-1 (Obj 3.3–3.4). Hands-on: Lab 14: Network Segmentation with Linux Namespaces; Lab 15: Stateful Firewall with UFW and nftables</w:t>
+              <w:t>Objective 3.2 secure enterprise infrastructure (zones, appliances, port security, firewall types, VPN, SD-WAN, SASE)</w:t>
             </w:r>
           </w:p>
         </w:tc>
@@ -2461,7 +2876,6 @@
         <w:tc>
           <w:tcPr>
             <w:tcW w:type="dxa" w:w="1656"/>
-            <w:shd w:val="clear" w:color="auto" w:fill="FDE9D9"/>
           </w:tcPr>
           <w:p>
             <w:r/>
@@ -2471,14 +2885,13 @@
                 <w:b w:val="0"/>
                 <w:sz w:val="19"/>
               </w:rPr>
-              <w:t>13:00–14:00</w:t>
+              <w:t>12:10–13:00</w:t>
             </w:r>
           </w:p>
         </w:tc>
         <w:tc>
           <w:tcPr>
             <w:tcW w:type="dxa" w:w="1296"/>
-            <w:shd w:val="clear" w:color="auto" w:fill="FDE9D9"/>
           </w:tcPr>
           <w:p>
             <w:r/>
@@ -2488,14 +2901,13 @@
                 <w:b w:val="0"/>
                 <w:sz w:val="19"/>
               </w:rPr>
-              <w:t>60 min</w:t>
+              <w:t>50 min</w:t>
             </w:r>
           </w:p>
         </w:tc>
         <w:tc>
           <w:tcPr>
             <w:tcW w:type="dxa" w:w="6840"/>
-            <w:shd w:val="clear" w:color="auto" w:fill="FDE9D9"/>
           </w:tcPr>
           <w:p>
             <w:r/>
@@ -2505,7 +2917,7 @@
                 <w:b w:val="0"/>
                 <w:sz w:val="19"/>
               </w:rPr>
-              <w:t>Lunch break</w:t>
+              <w:t>Hands-on: Lab 19: Network Segmentation and Security Zones; Lab 20: Stateful Firewall with UFW and nftables</w:t>
             </w:r>
           </w:p>
         </w:tc>
@@ -2514,6 +2926,7 @@
         <w:tc>
           <w:tcPr>
             <w:tcW w:type="dxa" w:w="1656"/>
+            <w:shd w:val="clear" w:color="auto" w:fill="FDE9D9"/>
           </w:tcPr>
           <w:p>
             <w:r/>
@@ -2523,13 +2936,14 @@
                 <w:b w:val="0"/>
                 <w:sz w:val="19"/>
               </w:rPr>
-              <w:t>14:00–16:15</w:t>
+              <w:t>13:00–14:00</w:t>
             </w:r>
           </w:p>
         </w:tc>
         <w:tc>
           <w:tcPr>
             <w:tcW w:type="dxa" w:w="1296"/>
+            <w:shd w:val="clear" w:color="auto" w:fill="FDE9D9"/>
           </w:tcPr>
           <w:p>
             <w:r/>
@@ -2539,13 +2953,14 @@
                 <w:b w:val="0"/>
                 <w:sz w:val="19"/>
               </w:rPr>
-              <w:t>135 min</w:t>
+              <w:t>60 min</w:t>
             </w:r>
           </w:p>
         </w:tc>
         <w:tc>
           <w:tcPr>
             <w:tcW w:type="dxa" w:w="6840"/>
+            <w:shd w:val="clear" w:color="auto" w:fill="FDE9D9"/>
           </w:tcPr>
           <w:p>
             <w:r/>
@@ -2555,7 +2970,7 @@
                 <w:b w:val="0"/>
                 <w:sz w:val="19"/>
               </w:rPr>
-              <w:t>Hands-on: Lab 16: Web Application Firewall with ModSecurity; Lab 17: Site-to-Site VPN with WireGuard; Lab 18: Data at Rest: LUKS Full-Disk Encryption; Lab 19: TLS Hardening and Cipher Audit</w:t>
+              <w:t>Lunch break</w:t>
             </w:r>
           </w:p>
         </w:tc>
@@ -2564,7 +2979,6 @@
         <w:tc>
           <w:tcPr>
             <w:tcW w:type="dxa" w:w="1656"/>
-            <w:shd w:val="clear" w:color="auto" w:fill="FFF4E5"/>
           </w:tcPr>
           <w:p>
             <w:r/>
@@ -2574,14 +2988,13 @@
                 <w:b w:val="0"/>
                 <w:sz w:val="19"/>
               </w:rPr>
-              <w:t>16:15–16:30</w:t>
+              <w:t>14:00–14:50</w:t>
             </w:r>
           </w:p>
         </w:tc>
         <w:tc>
           <w:tcPr>
             <w:tcW w:type="dxa" w:w="1296"/>
-            <w:shd w:val="clear" w:color="auto" w:fill="FFF4E5"/>
           </w:tcPr>
           <w:p>
             <w:r/>
@@ -2591,14 +3004,13 @@
                 <w:b w:val="0"/>
                 <w:sz w:val="19"/>
               </w:rPr>
-              <w:t>15 min</w:t>
+              <w:t>50 min</w:t>
             </w:r>
           </w:p>
         </w:tc>
         <w:tc>
           <w:tcPr>
             <w:tcW w:type="dxa" w:w="6840"/>
-            <w:shd w:val="clear" w:color="auto" w:fill="FFF4E5"/>
           </w:tcPr>
           <w:p>
             <w:r/>
@@ -2608,7 +3020,7 @@
                 <w:b w:val="0"/>
                 <w:sz w:val="19"/>
               </w:rPr>
-              <w:t>Tea break</w:t>
+              <w:t>Hands-on: Lab 21: Web Application Firewall with ModSecurity and the OWASP CRS; Lab 22: Site-to-Site VPN with WireGuard</w:t>
             </w:r>
           </w:p>
         </w:tc>
@@ -2617,6 +3029,24 @@
         <w:tc>
           <w:tcPr>
             <w:tcW w:type="dxa" w:w="1656"/>
+            <w:shd w:val="clear" w:color="auto" w:fill="E8F0FE"/>
+          </w:tcPr>
+          <w:p>
+            <w:r/>
+            <w:r>
+              <w:rPr>
+                <w:rFonts w:ascii="Arial" w:hAnsi="Arial"/>
+                <w:b/>
+                <w:sz w:val="19"/>
+              </w:rPr>
+              <w:t>14:50–15:30</w:t>
+            </w:r>
+          </w:p>
+        </w:tc>
+        <w:tc>
+          <w:tcPr>
+            <w:tcW w:type="dxa" w:w="1296"/>
+            <w:shd w:val="clear" w:color="auto" w:fill="E8F0FE"/>
           </w:tcPr>
           <w:p>
             <w:r/>
@@ -2626,13 +3056,32 @@
                 <w:b w:val="0"/>
                 <w:sz w:val="19"/>
               </w:rPr>
-              <w:t>16:30–18:15</w:t>
-            </w:r>
-          </w:p>
-        </w:tc>
-        <w:tc>
-          <w:tcPr>
-            <w:tcW w:type="dxa" w:w="1296"/>
+              <w:t>40 min</w:t>
+            </w:r>
+          </w:p>
+        </w:tc>
+        <w:tc>
+          <w:tcPr>
+            <w:tcW w:type="dxa" w:w="6840"/>
+            <w:shd w:val="clear" w:color="auto" w:fill="E8F0FE"/>
+          </w:tcPr>
+          <w:p>
+            <w:r/>
+            <w:r>
+              <w:rPr>
+                <w:rFonts w:ascii="Arial" w:hAnsi="Arial"/>
+                <w:b/>
+                <w:sz w:val="19"/>
+              </w:rPr>
+              <w:t>Objective 3.3 data protection strategies and 3.4 resilience and recovery</w:t>
+            </w:r>
+          </w:p>
+        </w:tc>
+      </w:tr>
+      <w:tr>
+        <w:tc>
+          <w:tcPr>
+            <w:tcW w:type="dxa" w:w="1656"/>
           </w:tcPr>
           <w:p>
             <w:r/>
@@ -2642,13 +3091,13 @@
                 <w:b w:val="0"/>
                 <w:sz w:val="19"/>
               </w:rPr>
-              <w:t>105 min</w:t>
-            </w:r>
-          </w:p>
-        </w:tc>
-        <w:tc>
-          <w:tcPr>
-            <w:tcW w:type="dxa" w:w="6840"/>
+              <w:t>15:30–16:30</w:t>
+            </w:r>
+          </w:p>
+        </w:tc>
+        <w:tc>
+          <w:tcPr>
+            <w:tcW w:type="dxa" w:w="1296"/>
           </w:tcPr>
           <w:p>
             <w:r/>
@@ -2658,16 +3107,13 @@
                 <w:b w:val="0"/>
                 <w:sz w:val="19"/>
               </w:rPr>
-              <w:t>Hands-on: Lab 20: Backup and Recovery with restic; Lab 37: Cloud Shared Responsibility &amp; IAM Least Privilege; Lab 38: Container Security with Docker; Lab 39: Storage Resilience with Software RAID (mdadm)</w:t>
-            </w:r>
-          </w:p>
-        </w:tc>
-      </w:tr>
-      <w:tr>
-        <w:tc>
-          <w:tcPr>
-            <w:tcW w:type="dxa" w:w="1656"/>
-            <w:shd w:val="clear" w:color="auto" w:fill="F3F5F8"/>
+              <w:t>60 min</w:t>
+            </w:r>
+          </w:p>
+        </w:tc>
+        <w:tc>
+          <w:tcPr>
+            <w:tcW w:type="dxa" w:w="6840"/>
           </w:tcPr>
           <w:p>
             <w:r/>
@@ -2677,14 +3123,16 @@
                 <w:b w:val="0"/>
                 <w:sz w:val="19"/>
               </w:rPr>
-              <w:t>18:15–18:30</w:t>
-            </w:r>
-          </w:p>
-        </w:tc>
-        <w:tc>
-          <w:tcPr>
-            <w:tcW w:type="dxa" w:w="1296"/>
-            <w:shd w:val="clear" w:color="auto" w:fill="F3F5F8"/>
+              <w:t>Hands-on: Lab 23: Data Classification and Data Loss Prevention; Lab 24: Data at Rest: LUKS2 Disk Encryption; Lab 25: Data in Transit: TLS Hardening and Cipher Audit</w:t>
+            </w:r>
+          </w:p>
+        </w:tc>
+      </w:tr>
+      <w:tr>
+        <w:tc>
+          <w:tcPr>
+            <w:tcW w:type="dxa" w:w="1656"/>
+            <w:shd w:val="clear" w:color="auto" w:fill="FFF4E5"/>
           </w:tcPr>
           <w:p>
             <w:r/>
@@ -2694,14 +3142,14 @@
                 <w:b w:val="0"/>
                 <w:sz w:val="19"/>
               </w:rPr>
-              <w:t>15 min</w:t>
-            </w:r>
-          </w:p>
-        </w:tc>
-        <w:tc>
-          <w:tcPr>
-            <w:tcW w:type="dxa" w:w="6840"/>
-            <w:shd w:val="clear" w:color="auto" w:fill="F3F5F8"/>
+              <w:t>16:30–16:45</w:t>
+            </w:r>
+          </w:p>
+        </w:tc>
+        <w:tc>
+          <w:tcPr>
+            <w:tcW w:type="dxa" w:w="1296"/>
+            <w:shd w:val="clear" w:color="auto" w:fill="FFF4E5"/>
           </w:tcPr>
           <w:p>
             <w:r/>
@@ -2711,7 +3159,127 @@
                 <w:b w:val="0"/>
                 <w:sz w:val="19"/>
               </w:rPr>
-              <w:t>Day 3 recap, Q&amp;A and PM digital attendance</w:t>
+              <w:t>15 min</w:t>
+            </w:r>
+          </w:p>
+        </w:tc>
+        <w:tc>
+          <w:tcPr>
+            <w:tcW w:type="dxa" w:w="6840"/>
+            <w:shd w:val="clear" w:color="auto" w:fill="FFF4E5"/>
+          </w:tcPr>
+          <w:p>
+            <w:r/>
+            <w:r>
+              <w:rPr>
+                <w:rFonts w:ascii="Arial" w:hAnsi="Arial"/>
+                <w:b w:val="0"/>
+                <w:sz w:val="19"/>
+              </w:rPr>
+              <w:t>Tea break</w:t>
+            </w:r>
+          </w:p>
+        </w:tc>
+      </w:tr>
+      <w:tr>
+        <w:tc>
+          <w:tcPr>
+            <w:tcW w:type="dxa" w:w="1656"/>
+          </w:tcPr>
+          <w:p>
+            <w:r/>
+            <w:r>
+              <w:rPr>
+                <w:rFonts w:ascii="Arial" w:hAnsi="Arial"/>
+                <w:b w:val="0"/>
+                <w:sz w:val="19"/>
+              </w:rPr>
+              <w:t>16:45–17:45</w:t>
+            </w:r>
+          </w:p>
+        </w:tc>
+        <w:tc>
+          <w:tcPr>
+            <w:tcW w:type="dxa" w:w="1296"/>
+          </w:tcPr>
+          <w:p>
+            <w:r/>
+            <w:r>
+              <w:rPr>
+                <w:rFonts w:ascii="Arial" w:hAnsi="Arial"/>
+                <w:b w:val="0"/>
+                <w:sz w:val="19"/>
+              </w:rPr>
+              <w:t>60 min</w:t>
+            </w:r>
+          </w:p>
+        </w:tc>
+        <w:tc>
+          <w:tcPr>
+            <w:tcW w:type="dxa" w:w="6840"/>
+          </w:tcPr>
+          <w:p>
+            <w:r/>
+            <w:r>
+              <w:rPr>
+                <w:rFonts w:ascii="Arial" w:hAnsi="Arial"/>
+                <w:b w:val="0"/>
+                <w:sz w:val="19"/>
+              </w:rPr>
+              <w:t>Hands-on: Lab 26: Backup and Recovery with restic; Lab 27: Storage Resilience with Software RAID (mdadm)</w:t>
+            </w:r>
+          </w:p>
+        </w:tc>
+      </w:tr>
+      <w:tr>
+        <w:tc>
+          <w:tcPr>
+            <w:tcW w:type="dxa" w:w="1656"/>
+            <w:shd w:val="clear" w:color="auto" w:fill="F3F5F8"/>
+          </w:tcPr>
+          <w:p>
+            <w:r/>
+            <w:r>
+              <w:rPr>
+                <w:rFonts w:ascii="Arial" w:hAnsi="Arial"/>
+                <w:b w:val="0"/>
+                <w:sz w:val="19"/>
+              </w:rPr>
+              <w:t>17:45–18:30</w:t>
+            </w:r>
+          </w:p>
+        </w:tc>
+        <w:tc>
+          <w:tcPr>
+            <w:tcW w:type="dxa" w:w="1296"/>
+            <w:shd w:val="clear" w:color="auto" w:fill="F3F5F8"/>
+          </w:tcPr>
+          <w:p>
+            <w:r/>
+            <w:r>
+              <w:rPr>
+                <w:rFonts w:ascii="Arial" w:hAnsi="Arial"/>
+                <w:b w:val="0"/>
+                <w:sz w:val="19"/>
+              </w:rPr>
+              <w:t>45 min</w:t>
+            </w:r>
+          </w:p>
+        </w:tc>
+        <w:tc>
+          <w:tcPr>
+            <w:tcW w:type="dxa" w:w="6840"/>
+            <w:shd w:val="clear" w:color="auto" w:fill="F3F5F8"/>
+          </w:tcPr>
+          <w:p>
+            <w:r/>
+            <w:r>
+              <w:rPr>
+                <w:rFonts w:ascii="Arial" w:hAnsi="Arial"/>
+                <w:b w:val="0"/>
+                <w:sz w:val="19"/>
+              </w:rPr>
+              <w:t>Domain 3 recap, exam-style practice questions, Q&amp;A and PM digital attendance</w:t>
             </w:r>
           </w:p>
         </w:tc>
@@ -2724,7 +3292,7 @@
           <w:color w:val="555B66"/>
           <w:sz w:val="19"/>
         </w:rPr>
-        <w:t>Total training time: 480 minutes (8 hours).</w:t>
+        <w:t>Total scheduled time: 480 minutes (8 hours) excluding lunch — of which 450 minutes (7.5 hours) are instructional, plus 30 minutes of tea breaks.</w:t>
       </w:r>
     </w:p>
     <w:p>
@@ -2740,12 +3308,13 @@
         <w:tblStyle w:val="TableGrid"/>
         <w:tblW w:type="auto" w:w="0"/>
         <w:jc w:val="center"/>
+        <w:tblLayout w:type="fixed"/>
         <w:tblLook w:firstColumn="1" w:firstRow="1" w:lastColumn="0" w:lastRow="0" w:noHBand="0" w:noVBand="1" w:val="04A0"/>
       </w:tblPr>
       <w:tblGrid>
-        <w:gridCol w:w="2880"/>
-        <w:gridCol w:w="2880"/>
-        <w:gridCol w:w="2880"/>
+        <w:gridCol w:w="1656"/>
+        <w:gridCol w:w="1296"/>
+        <w:gridCol w:w="6840"/>
       </w:tblGrid>
       <w:tr>
         <w:tc>
@@ -2851,7 +3420,7 @@
                 <w:b w:val="0"/>
                 <w:sz w:val="19"/>
               </w:rPr>
-              <w:t>Day 3 recap and mandatory digital attendance (AM)</w:t>
+              <w:t>Day 3 review, warm-up questions and mandatory digital attendance (AM)</w:t>
             </w:r>
           </w:p>
         </w:tc>
@@ -2870,7 +3439,7 @@
                 <w:b/>
                 <w:sz w:val="19"/>
               </w:rPr>
-              <w:t>9:45–11:00</w:t>
+              <w:t>9:45–10:30</w:t>
             </w:r>
           </w:p>
         </w:tc>
@@ -2887,7 +3456,7 @@
                 <w:b w:val="0"/>
                 <w:sz w:val="19"/>
               </w:rPr>
-              <w:t>75 min</w:t>
+              <w:t>45 min</w:t>
             </w:r>
           </w:p>
         </w:tc>
@@ -2904,7 +3473,7 @@
                 <w:b/>
                 <w:sz w:val="19"/>
               </w:rPr>
-              <w:t>Domain 4 concepts: secure baselines &amp; hardening, asset management; monitoring stack — SIEM, IDS/IPS, EDR, FIM, packet analysis (Obj 4.1–4.4)</w:t>
+              <w:t>Domain 4 Security Operations — Objectives 4.1 secure computing resources, 4.2 asset management, 4.3 vulnerability management</w:t>
             </w:r>
           </w:p>
         </w:tc>
@@ -2913,7 +3482,6 @@
         <w:tc>
           <w:tcPr>
             <w:tcW w:type="dxa" w:w="1656"/>
-            <w:shd w:val="clear" w:color="auto" w:fill="FFF4E5"/>
           </w:tcPr>
           <w:p>
             <w:r/>
@@ -2923,14 +3491,13 @@
                 <w:b w:val="0"/>
                 <w:sz w:val="19"/>
               </w:rPr>
-              <w:t>11:00–11:15</w:t>
+              <w:t>10:30–11:30</w:t>
             </w:r>
           </w:p>
         </w:tc>
         <w:tc>
           <w:tcPr>
             <w:tcW w:type="dxa" w:w="1296"/>
-            <w:shd w:val="clear" w:color="auto" w:fill="FFF4E5"/>
           </w:tcPr>
           <w:p>
             <w:r/>
@@ -2940,14 +3507,13 @@
                 <w:b w:val="0"/>
                 <w:sz w:val="19"/>
               </w:rPr>
-              <w:t>15 min</w:t>
+              <w:t>60 min</w:t>
             </w:r>
           </w:p>
         </w:tc>
         <w:tc>
           <w:tcPr>
             <w:tcW w:type="dxa" w:w="6840"/>
-            <w:shd w:val="clear" w:color="auto" w:fill="FFF4E5"/>
           </w:tcPr>
           <w:p>
             <w:r/>
@@ -2957,7 +3523,7 @@
                 <w:b w:val="0"/>
                 <w:sz w:val="19"/>
               </w:rPr>
-              <w:t>Tea break</w:t>
+              <w:t>Hands-on: Lab 28: Mobile and Endpoint Hardening Baseline; Lab 29: Application Security: Validation, SAST and Code Signing; Lab 30: Asset Inventory, Media Sanitisation and Disposal Certificate; Lab 31: Vulnerability Scanning, Confirmation and Rescan; Lab 32: Vulnerability Management Pipeline with Trivy</w:t>
             </w:r>
           </w:p>
         </w:tc>
@@ -2966,6 +3532,7 @@
         <w:tc>
           <w:tcPr>
             <w:tcW w:type="dxa" w:w="1656"/>
+            <w:shd w:val="clear" w:color="auto" w:fill="FFF4E5"/>
           </w:tcPr>
           <w:p>
             <w:r/>
@@ -2975,13 +3542,14 @@
                 <w:b w:val="0"/>
                 <w:sz w:val="19"/>
               </w:rPr>
-              <w:t>11:15–13:00</w:t>
+              <w:t>11:30–11:45</w:t>
             </w:r>
           </w:p>
         </w:tc>
         <w:tc>
           <w:tcPr>
             <w:tcW w:type="dxa" w:w="1296"/>
+            <w:shd w:val="clear" w:color="auto" w:fill="FFF4E5"/>
           </w:tcPr>
           <w:p>
             <w:r/>
@@ -2991,13 +3559,14 @@
                 <w:b w:val="0"/>
                 <w:sz w:val="19"/>
               </w:rPr>
-              <w:t>105 min</w:t>
+              <w:t>15 min</w:t>
             </w:r>
           </w:p>
         </w:tc>
         <w:tc>
           <w:tcPr>
             <w:tcW w:type="dxa" w:w="6840"/>
+            <w:shd w:val="clear" w:color="auto" w:fill="FFF4E5"/>
           </w:tcPr>
           <w:p>
             <w:r/>
@@ -3007,7 +3576,7 @@
                 <w:b w:val="0"/>
                 <w:sz w:val="19"/>
               </w:rPr>
-              <w:t>Hands-on: Lab 21: SSH Hardening + Fail2ban; Lab 22: IAM with PAM and sudo; Lab 23: Multi-Factor Authentication with TOTP; Lab 24: SIEM Basics with Wazuh</w:t>
+              <w:t>Tea break</w:t>
             </w:r>
           </w:p>
         </w:tc>
@@ -3016,7 +3585,24 @@
         <w:tc>
           <w:tcPr>
             <w:tcW w:type="dxa" w:w="1656"/>
-            <w:shd w:val="clear" w:color="auto" w:fill="FDE9D9"/>
+            <w:shd w:val="clear" w:color="auto" w:fill="E8F0FE"/>
+          </w:tcPr>
+          <w:p>
+            <w:r/>
+            <w:r>
+              <w:rPr>
+                <w:rFonts w:ascii="Arial" w:hAnsi="Arial"/>
+                <w:b/>
+                <w:sz w:val="19"/>
+              </w:rPr>
+              <w:t>11:45–12:15</w:t>
+            </w:r>
+          </w:p>
+        </w:tc>
+        <w:tc>
+          <w:tcPr>
+            <w:tcW w:type="dxa" w:w="1296"/>
+            <w:shd w:val="clear" w:color="auto" w:fill="E8F0FE"/>
           </w:tcPr>
           <w:p>
             <w:r/>
@@ -3026,14 +3612,32 @@
                 <w:b w:val="0"/>
                 <w:sz w:val="19"/>
               </w:rPr>
-              <w:t>13:00–14:00</w:t>
-            </w:r>
-          </w:p>
-        </w:tc>
-        <w:tc>
-          <w:tcPr>
-            <w:tcW w:type="dxa" w:w="1296"/>
-            <w:shd w:val="clear" w:color="auto" w:fill="FDE9D9"/>
+              <w:t>30 min</w:t>
+            </w:r>
+          </w:p>
+        </w:tc>
+        <w:tc>
+          <w:tcPr>
+            <w:tcW w:type="dxa" w:w="6840"/>
+            <w:shd w:val="clear" w:color="auto" w:fill="E8F0FE"/>
+          </w:tcPr>
+          <w:p>
+            <w:r/>
+            <w:r>
+              <w:rPr>
+                <w:rFonts w:ascii="Arial" w:hAnsi="Arial"/>
+                <w:b/>
+                <w:sz w:val="19"/>
+              </w:rPr>
+              <w:t>Objective 4.4 alerting and monitoring and 4.5 enterprise security capabilities</w:t>
+            </w:r>
+          </w:p>
+        </w:tc>
+      </w:tr>
+      <w:tr>
+        <w:tc>
+          <w:tcPr>
+            <w:tcW w:type="dxa" w:w="1656"/>
           </w:tcPr>
           <w:p>
             <w:r/>
@@ -3043,14 +3647,13 @@
                 <w:b w:val="0"/>
                 <w:sz w:val="19"/>
               </w:rPr>
-              <w:t>60 min</w:t>
-            </w:r>
-          </w:p>
-        </w:tc>
-        <w:tc>
-          <w:tcPr>
-            <w:tcW w:type="dxa" w:w="6840"/>
-            <w:shd w:val="clear" w:color="auto" w:fill="FDE9D9"/>
+              <w:t>12:15–13:00</w:t>
+            </w:r>
+          </w:p>
+        </w:tc>
+        <w:tc>
+          <w:tcPr>
+            <w:tcW w:type="dxa" w:w="1296"/>
           </w:tcPr>
           <w:p>
             <w:r/>
@@ -3060,7 +3663,126 @@
                 <w:b w:val="0"/>
                 <w:sz w:val="19"/>
               </w:rPr>
+              <w:t>45 min</w:t>
+            </w:r>
+          </w:p>
+        </w:tc>
+        <w:tc>
+          <w:tcPr>
+            <w:tcW w:type="dxa" w:w="6840"/>
+          </w:tcPr>
+          <w:p>
+            <w:r/>
+            <w:r>
+              <w:rPr>
+                <w:rFonts w:ascii="Arial" w:hAnsi="Arial"/>
+                <w:b w:val="0"/>
+                <w:sz w:val="19"/>
+              </w:rPr>
+              <w:t>Hands-on: Lab 33: SIEM Alerting and Monitoring with Wazuh; Lab 34: File Integrity Monitoring with AIDE</w:t>
+            </w:r>
+          </w:p>
+        </w:tc>
+      </w:tr>
+      <w:tr>
+        <w:tc>
+          <w:tcPr>
+            <w:tcW w:type="dxa" w:w="1656"/>
+            <w:shd w:val="clear" w:color="auto" w:fill="FDE9D9"/>
+          </w:tcPr>
+          <w:p>
+            <w:r/>
+            <w:r>
+              <w:rPr>
+                <w:rFonts w:ascii="Arial" w:hAnsi="Arial"/>
+                <w:b w:val="0"/>
+                <w:sz w:val="19"/>
+              </w:rPr>
+              <w:t>13:00–14:00</w:t>
+            </w:r>
+          </w:p>
+        </w:tc>
+        <w:tc>
+          <w:tcPr>
+            <w:tcW w:type="dxa" w:w="1296"/>
+            <w:shd w:val="clear" w:color="auto" w:fill="FDE9D9"/>
+          </w:tcPr>
+          <w:p>
+            <w:r/>
+            <w:r>
+              <w:rPr>
+                <w:rFonts w:ascii="Arial" w:hAnsi="Arial"/>
+                <w:b w:val="0"/>
+                <w:sz w:val="19"/>
+              </w:rPr>
+              <w:t>60 min</w:t>
+            </w:r>
+          </w:p>
+        </w:tc>
+        <w:tc>
+          <w:tcPr>
+            <w:tcW w:type="dxa" w:w="6840"/>
+            <w:shd w:val="clear" w:color="auto" w:fill="FDE9D9"/>
+          </w:tcPr>
+          <w:p>
+            <w:r/>
+            <w:r>
+              <w:rPr>
+                <w:rFonts w:ascii="Arial" w:hAnsi="Arial"/>
+                <w:b w:val="0"/>
+                <w:sz w:val="19"/>
+              </w:rPr>
               <w:t>Lunch break</w:t>
+            </w:r>
+          </w:p>
+        </w:tc>
+      </w:tr>
+      <w:tr>
+        <w:tc>
+          <w:tcPr>
+            <w:tcW w:type="dxa" w:w="1656"/>
+          </w:tcPr>
+          <w:p>
+            <w:r/>
+            <w:r>
+              <w:rPr>
+                <w:rFonts w:ascii="Arial" w:hAnsi="Arial"/>
+                <w:b w:val="0"/>
+                <w:sz w:val="19"/>
+              </w:rPr>
+              <w:t>14:00–15:00</w:t>
+            </w:r>
+          </w:p>
+        </w:tc>
+        <w:tc>
+          <w:tcPr>
+            <w:tcW w:type="dxa" w:w="1296"/>
+          </w:tcPr>
+          <w:p>
+            <w:r/>
+            <w:r>
+              <w:rPr>
+                <w:rFonts w:ascii="Arial" w:hAnsi="Arial"/>
+                <w:b w:val="0"/>
+                <w:sz w:val="19"/>
+              </w:rPr>
+              <w:t>60 min</w:t>
+            </w:r>
+          </w:p>
+        </w:tc>
+        <w:tc>
+          <w:tcPr>
+            <w:tcW w:type="dxa" w:w="6840"/>
+          </w:tcPr>
+          <w:p>
+            <w:r/>
+            <w:r>
+              <w:rPr>
+                <w:rFonts w:ascii="Arial" w:hAnsi="Arial"/>
+                <w:b w:val="0"/>
+                <w:sz w:val="19"/>
+              </w:rPr>
+              <w:t>Hands-on: Lab 35: Secure Remote Access: SSH Hardening and Fail2ban; Lab 36: Network IDS with Suricata; Lab 37: Endpoint Detection and Response with osquery</w:t>
             </w:r>
           </w:p>
         </w:tc>
@@ -3079,7 +3801,7 @@
                 <w:b/>
                 <w:sz w:val="19"/>
               </w:rPr>
-              <w:t>14:00–14:45</w:t>
+              <w:t>15:00–15:40</w:t>
             </w:r>
           </w:p>
         </w:tc>
@@ -3096,7 +3818,7 @@
                 <w:b w:val="0"/>
                 <w:sz w:val="19"/>
               </w:rPr>
-              <w:t>45 min</w:t>
+              <w:t>40 min</w:t>
             </w:r>
           </w:p>
         </w:tc>
@@ -3113,7 +3835,7 @@
                 <w:b/>
                 <w:sz w:val="19"/>
               </w:rPr>
-              <w:t>Domain 4 concepts: vulnerability management &amp; CVSS, IAM/MFA &amp; authorization models, automation/SOAR, incident response &amp; forensics (Obj 4.3–4.8)</w:t>
+              <w:t>Objectives 4.6 identity and access management, 4.7 automation and orchestration, 4.8 incident response, 4.9 data sources for investigation</w:t>
             </w:r>
           </w:p>
         </w:tc>
@@ -3131,7 +3853,7 @@
                 <w:b w:val="0"/>
                 <w:sz w:val="19"/>
               </w:rPr>
-              <w:t>14:45–16:15</w:t>
+              <w:t>15:40–16:30</w:t>
             </w:r>
           </w:p>
         </w:tc>
@@ -3147,7 +3869,7 @@
                 <w:b w:val="0"/>
                 <w:sz w:val="19"/>
               </w:rPr>
-              <w:t>90 min</w:t>
+              <w:t>50 min</w:t>
             </w:r>
           </w:p>
         </w:tc>
@@ -3163,7 +3885,7 @@
                 <w:b w:val="0"/>
                 <w:sz w:val="19"/>
               </w:rPr>
-              <w:t>Hands-on: Lab 25: Network IDS with Suricata; Lab 26: Endpoint Detection with osquery; Lab 27: File Integrity Monitoring with AIDE; Lab 28: Vulnerability Management with Trivy</w:t>
+              <w:t>Hands-on: Lab 38: Identity &amp; Access Management with PAM and sudo; Lab 39: Multifactor Authentication with TOTP; Lab 40: Automation and Orchestration with a Mini-SOAR Playbook</w:t>
             </w:r>
           </w:p>
         </w:tc>
@@ -3182,7 +3904,7 @@
                 <w:b w:val="0"/>
                 <w:sz w:val="19"/>
               </w:rPr>
-              <w:t>16:15–16:30</w:t>
+              <w:t>16:30–16:45</w:t>
             </w:r>
           </w:p>
         </w:tc>
@@ -3234,7 +3956,7 @@
                 <w:b w:val="0"/>
                 <w:sz w:val="19"/>
               </w:rPr>
-              <w:t>16:30–18:15</w:t>
+              <w:t>16:45–17:50</w:t>
             </w:r>
           </w:p>
         </w:tc>
@@ -3250,7 +3972,7 @@
                 <w:b w:val="0"/>
                 <w:sz w:val="19"/>
               </w:rPr>
-              <w:t>105 min</w:t>
+              <w:t>65 min</w:t>
             </w:r>
           </w:p>
         </w:tc>
@@ -3266,7 +3988,7 @@
                 <w:b w:val="0"/>
                 <w:sz w:val="19"/>
               </w:rPr>
-              <w:t>Hands-on: Lab 29: Incident Response and Forensics; Lab 30: Automation and Orchestration (Mini-SOAR); Lab 40: Packet Capture &amp; Traffic Analysis; Lab 41: Mobile &amp; Endpoint Hardening Baseline; Lab 42: Secure Data Sanitisation (Media Disposal); Lab 43: Digital Forensics — Evidence Acquisition &amp; Hashing</w:t>
+              <w:t>Hands-on: Lab 41: Incident Response: Live Triage; Lab 42: Digital Forensics: Acquisition &amp; Chain of Custody; Lab 43: Packet Capture and Traffic Analysis with tcpdump and tshark; Lab 44: Log Investigation: Building an Attack Timeline</w:t>
             </w:r>
           </w:p>
         </w:tc>
@@ -3285,7 +4007,7 @@
                 <w:b w:val="0"/>
                 <w:sz w:val="19"/>
               </w:rPr>
-              <w:t>18:15–18:30</w:t>
+              <w:t>17:50–18:30</w:t>
             </w:r>
           </w:p>
         </w:tc>
@@ -3302,7 +4024,7 @@
                 <w:b w:val="0"/>
                 <w:sz w:val="19"/>
               </w:rPr>
-              <w:t>15 min</w:t>
+              <w:t>40 min</w:t>
             </w:r>
           </w:p>
         </w:tc>
@@ -3319,7 +4041,7 @@
                 <w:b w:val="0"/>
                 <w:sz w:val="19"/>
               </w:rPr>
-              <w:t>Day 4 recap, Q&amp;A and PM digital attendance</w:t>
+              <w:t>Domain 4 recap, exam-style practice questions, Q&amp;A and PM digital attendance</w:t>
             </w:r>
           </w:p>
         </w:tc>
@@ -3332,7 +4054,7 @@
           <w:color w:val="555B66"/>
           <w:sz w:val="19"/>
         </w:rPr>
-        <w:t>Total training time: 480 minutes (8 hours).</w:t>
+        <w:t>Total scheduled time: 480 minutes (8 hours) excluding lunch — of which 450 minutes (7.5 hours) are instructional, plus 30 minutes of tea breaks.</w:t>
       </w:r>
     </w:p>
     <w:p>
@@ -3340,7 +4062,7 @@
         <w:pStyle w:val="Heading2"/>
       </w:pPr>
       <w:r>
-        <w:t>Day 5 — Domain 5 — Program Management, Oversight &amp; Assessment (20%)</w:t>
+        <w:t>Day 5 — Domain 5 — Security Program Management and Oversight (20%), Exam Readiness &amp; Assessment</w:t>
       </w:r>
     </w:p>
     <w:tbl>
@@ -3348,12 +4070,13 @@
         <w:tblStyle w:val="TableGrid"/>
         <w:tblW w:type="auto" w:w="0"/>
         <w:jc w:val="center"/>
+        <w:tblLayout w:type="fixed"/>
         <w:tblLook w:firstColumn="1" w:firstRow="1" w:lastColumn="0" w:lastRow="0" w:noHBand="0" w:noVBand="1" w:val="04A0"/>
       </w:tblPr>
       <w:tblGrid>
-        <w:gridCol w:w="2880"/>
-        <w:gridCol w:w="2880"/>
-        <w:gridCol w:w="2880"/>
+        <w:gridCol w:w="1656"/>
+        <w:gridCol w:w="1296"/>
+        <w:gridCol w:w="6840"/>
       </w:tblGrid>
       <w:tr>
         <w:tc>
@@ -3459,7 +4182,7 @@
                 <w:b w:val="0"/>
                 <w:sz w:val="19"/>
               </w:rPr>
-              <w:t>Day 4 recap and mandatory digital attendance (AM)</w:t>
+              <w:t>Day 4 review, warm-up questions and mandatory digital attendance (AM)</w:t>
             </w:r>
           </w:p>
         </w:tc>
@@ -3478,7 +4201,7 @@
                 <w:b/>
                 <w:sz w:val="19"/>
               </w:rPr>
-              <w:t>9:45–11:15</w:t>
+              <w:t>9:45–10:30</w:t>
             </w:r>
           </w:p>
         </w:tc>
@@ -3495,7 +4218,7 @@
                 <w:b w:val="0"/>
                 <w:sz w:val="19"/>
               </w:rPr>
-              <w:t>90 min</w:t>
+              <w:t>45 min</w:t>
             </w:r>
           </w:p>
         </w:tc>
@@ -3512,7 +4235,7 @@
                 <w:b/>
                 <w:sz w:val="19"/>
               </w:rPr>
-              <w:t>Domain 5 concepts: governance, policies/standards/procedures; risk management &amp; CVSS, third-party risk (Obj 5.1–5.3). Hands-on: Lab 31: Risk Register, CVSS Scoring, and Quantitative Risk</w:t>
+              <w:t>Domain 5 Security Program Management and Oversight — Objectives 5.1 governance, 5.2 risk management, 5.3 third-party risk</w:t>
             </w:r>
           </w:p>
         </w:tc>
@@ -3521,7 +4244,6 @@
         <w:tc>
           <w:tcPr>
             <w:tcW w:type="dxa" w:w="1656"/>
-            <w:shd w:val="clear" w:color="auto" w:fill="FFF4E5"/>
           </w:tcPr>
           <w:p>
             <w:r/>
@@ -3531,14 +4253,13 @@
                 <w:b w:val="0"/>
                 <w:sz w:val="19"/>
               </w:rPr>
-              <w:t>11:15–11:30</w:t>
+              <w:t>10:30–11:30</w:t>
             </w:r>
           </w:p>
         </w:tc>
         <w:tc>
           <w:tcPr>
             <w:tcW w:type="dxa" w:w="1296"/>
-            <w:shd w:val="clear" w:color="auto" w:fill="FFF4E5"/>
           </w:tcPr>
           <w:p>
             <w:r/>
@@ -3548,14 +4269,13 @@
                 <w:b w:val="0"/>
                 <w:sz w:val="19"/>
               </w:rPr>
-              <w:t>15 min</w:t>
+              <w:t>60 min</w:t>
             </w:r>
           </w:p>
         </w:tc>
         <w:tc>
           <w:tcPr>
             <w:tcW w:type="dxa" w:w="6840"/>
-            <w:shd w:val="clear" w:color="auto" w:fill="FFF4E5"/>
           </w:tcPr>
           <w:p>
             <w:r/>
@@ -3565,6 +4285,59 @@
                 <w:b w:val="0"/>
                 <w:sz w:val="19"/>
               </w:rPr>
+              <w:t>Hands-on: Lab 45: Governance: Policies, Standards, Procedures; Lab 46: Risk Register, CVSS Scoring, and Quantitative Risk; Lab 47: Supply Chain Security: SBOM and Vendor Trust</w:t>
+            </w:r>
+          </w:p>
+        </w:tc>
+      </w:tr>
+      <w:tr>
+        <w:tc>
+          <w:tcPr>
+            <w:tcW w:type="dxa" w:w="1656"/>
+            <w:shd w:val="clear" w:color="auto" w:fill="FFF4E5"/>
+          </w:tcPr>
+          <w:p>
+            <w:r/>
+            <w:r>
+              <w:rPr>
+                <w:rFonts w:ascii="Arial" w:hAnsi="Arial"/>
+                <w:b w:val="0"/>
+                <w:sz w:val="19"/>
+              </w:rPr>
+              <w:t>11:30–11:45</w:t>
+            </w:r>
+          </w:p>
+        </w:tc>
+        <w:tc>
+          <w:tcPr>
+            <w:tcW w:type="dxa" w:w="1296"/>
+            <w:shd w:val="clear" w:color="auto" w:fill="FFF4E5"/>
+          </w:tcPr>
+          <w:p>
+            <w:r/>
+            <w:r>
+              <w:rPr>
+                <w:rFonts w:ascii="Arial" w:hAnsi="Arial"/>
+                <w:b w:val="0"/>
+                <w:sz w:val="19"/>
+              </w:rPr>
+              <w:t>15 min</w:t>
+            </w:r>
+          </w:p>
+        </w:tc>
+        <w:tc>
+          <w:tcPr>
+            <w:tcW w:type="dxa" w:w="6840"/>
+            <w:shd w:val="clear" w:color="auto" w:fill="FFF4E5"/>
+          </w:tcPr>
+          <w:p>
+            <w:r/>
+            <w:r>
+              <w:rPr>
+                <w:rFonts w:ascii="Arial" w:hAnsi="Arial"/>
+                <w:b w:val="0"/>
+                <w:sz w:val="19"/>
+              </w:rPr>
               <w:t>Tea break</w:t>
             </w:r>
           </w:p>
@@ -3584,7 +4357,7 @@
                 <w:b/>
                 <w:sz w:val="19"/>
               </w:rPr>
-              <w:t>11:30–13:00</w:t>
+              <w:t>11:45–12:20</w:t>
             </w:r>
           </w:p>
         </w:tc>
@@ -3601,7 +4374,7 @@
                 <w:b w:val="0"/>
                 <w:sz w:val="19"/>
               </w:rPr>
-              <w:t>90 min</w:t>
+              <w:t>35 min</w:t>
             </w:r>
           </w:p>
         </w:tc>
@@ -3618,7 +4391,7 @@
                 <w:b/>
                 <w:sz w:val="19"/>
               </w:rPr>
-              <w:t>Domain 5 concepts: audits &amp; assessments, penetration testing, reconnaissance, security awareness &amp; compliance (Obj 5.4–5.6). Hands-on: Lab 32: Passive Reconnaissance / OSINT; Lab 33: Active Reconnaissance with Nmap</w:t>
+              <w:t>Objectives 5.4 compliance, 5.5 audits, assessments and penetration testing, 5.6 security awareness</w:t>
             </w:r>
           </w:p>
         </w:tc>
@@ -3627,7 +4400,6 @@
         <w:tc>
           <w:tcPr>
             <w:tcW w:type="dxa" w:w="1656"/>
-            <w:shd w:val="clear" w:color="auto" w:fill="FDE9D9"/>
           </w:tcPr>
           <w:p>
             <w:r/>
@@ -3637,14 +4409,13 @@
                 <w:b w:val="0"/>
                 <w:sz w:val="19"/>
               </w:rPr>
-              <w:t>13:00–14:00</w:t>
+              <w:t>12:20–13:00</w:t>
             </w:r>
           </w:p>
         </w:tc>
         <w:tc>
           <w:tcPr>
             <w:tcW w:type="dxa" w:w="1296"/>
-            <w:shd w:val="clear" w:color="auto" w:fill="FDE9D9"/>
           </w:tcPr>
           <w:p>
             <w:r/>
@@ -3654,14 +4425,13 @@
                 <w:b w:val="0"/>
                 <w:sz w:val="19"/>
               </w:rPr>
-              <w:t>60 min</w:t>
+              <w:t>40 min</w:t>
             </w:r>
           </w:p>
         </w:tc>
         <w:tc>
           <w:tcPr>
             <w:tcW w:type="dxa" w:w="6840"/>
-            <w:shd w:val="clear" w:color="auto" w:fill="FDE9D9"/>
           </w:tcPr>
           <w:p>
             <w:r/>
@@ -3671,7 +4441,7 @@
                 <w:b w:val="0"/>
                 <w:sz w:val="19"/>
               </w:rPr>
-              <w:t>Lunch break</w:t>
+              <w:t>Hands-on: Lab 48: Compliance Audit with OpenSCAP</w:t>
             </w:r>
           </w:p>
         </w:tc>
@@ -3680,6 +4450,7 @@
         <w:tc>
           <w:tcPr>
             <w:tcW w:type="dxa" w:w="1656"/>
+            <w:shd w:val="clear" w:color="auto" w:fill="FDE9D9"/>
           </w:tcPr>
           <w:p>
             <w:r/>
@@ -3689,13 +4460,14 @@
                 <w:b w:val="0"/>
                 <w:sz w:val="19"/>
               </w:rPr>
-              <w:t>14:00–15:45</w:t>
+              <w:t>13:00–14:00</w:t>
             </w:r>
           </w:p>
         </w:tc>
         <w:tc>
           <w:tcPr>
             <w:tcW w:type="dxa" w:w="1296"/>
+            <w:shd w:val="clear" w:color="auto" w:fill="FDE9D9"/>
           </w:tcPr>
           <w:p>
             <w:r/>
@@ -3705,13 +4477,14 @@
                 <w:b w:val="0"/>
                 <w:sz w:val="19"/>
               </w:rPr>
-              <w:t>105 min</w:t>
+              <w:t>60 min</w:t>
             </w:r>
           </w:p>
         </w:tc>
         <w:tc>
           <w:tcPr>
             <w:tcW w:type="dxa" w:w="6840"/>
+            <w:shd w:val="clear" w:color="auto" w:fill="FDE9D9"/>
           </w:tcPr>
           <w:p>
             <w:r/>
@@ -3721,7 +4494,7 @@
                 <w:b w:val="0"/>
                 <w:sz w:val="19"/>
               </w:rPr>
-              <w:t>Hands-on: Lab 34: Penetration Testing with Metasploit (Authorised Lab); Lab 35: Compliance Audit with OpenSCAP; Lab 36: Security Awareness: Run a Phishing Simulation with GoPhish</w:t>
+              <w:t>Lunch break</w:t>
             </w:r>
           </w:p>
         </w:tc>
@@ -3730,7 +4503,6 @@
         <w:tc>
           <w:tcPr>
             <w:tcW w:type="dxa" w:w="1656"/>
-            <w:shd w:val="clear" w:color="auto" w:fill="FFF4E5"/>
           </w:tcPr>
           <w:p>
             <w:r/>
@@ -3740,14 +4512,13 @@
                 <w:b w:val="0"/>
                 <w:sz w:val="19"/>
               </w:rPr>
-              <w:t>15:45–16:00</w:t>
+              <w:t>14:00–15:15</w:t>
             </w:r>
           </w:p>
         </w:tc>
         <w:tc>
           <w:tcPr>
             <w:tcW w:type="dxa" w:w="1296"/>
-            <w:shd w:val="clear" w:color="auto" w:fill="FFF4E5"/>
           </w:tcPr>
           <w:p>
             <w:r/>
@@ -3757,14 +4528,13 @@
                 <w:b w:val="0"/>
                 <w:sz w:val="19"/>
               </w:rPr>
-              <w:t>15 min</w:t>
+              <w:t>75 min</w:t>
             </w:r>
           </w:p>
         </w:tc>
         <w:tc>
           <w:tcPr>
             <w:tcW w:type="dxa" w:w="6840"/>
-            <w:shd w:val="clear" w:color="auto" w:fill="FFF4E5"/>
           </w:tcPr>
           <w:p>
             <w:r/>
@@ -3774,7 +4544,113 @@
                 <w:b w:val="0"/>
                 <w:sz w:val="19"/>
               </w:rPr>
+              <w:t>Hands-on: Lab 49: Passive Reconnaissance / OSINT; Lab 50: Active Reconnaissance with Nmap; Lab 51: Penetration Testing in an Authorised Lab; Lab 52: Security Awareness: Phishing Simulation</w:t>
+            </w:r>
+          </w:p>
+        </w:tc>
+      </w:tr>
+      <w:tr>
+        <w:tc>
+          <w:tcPr>
+            <w:tcW w:type="dxa" w:w="1656"/>
+            <w:shd w:val="clear" w:color="auto" w:fill="FFF4E5"/>
+          </w:tcPr>
+          <w:p>
+            <w:r/>
+            <w:r>
+              <w:rPr>
+                <w:rFonts w:ascii="Arial" w:hAnsi="Arial"/>
+                <w:b w:val="0"/>
+                <w:sz w:val="19"/>
+              </w:rPr>
+              <w:t>15:15–15:30</w:t>
+            </w:r>
+          </w:p>
+        </w:tc>
+        <w:tc>
+          <w:tcPr>
+            <w:tcW w:type="dxa" w:w="1296"/>
+            <w:shd w:val="clear" w:color="auto" w:fill="FFF4E5"/>
+          </w:tcPr>
+          <w:p>
+            <w:r/>
+            <w:r>
+              <w:rPr>
+                <w:rFonts w:ascii="Arial" w:hAnsi="Arial"/>
+                <w:b w:val="0"/>
+                <w:sz w:val="19"/>
+              </w:rPr>
+              <w:t>15 min</w:t>
+            </w:r>
+          </w:p>
+        </w:tc>
+        <w:tc>
+          <w:tcPr>
+            <w:tcW w:type="dxa" w:w="6840"/>
+            <w:shd w:val="clear" w:color="auto" w:fill="FFF4E5"/>
+          </w:tcPr>
+          <w:p>
+            <w:r/>
+            <w:r>
+              <w:rPr>
+                <w:rFonts w:ascii="Arial" w:hAnsi="Arial"/>
+                <w:b w:val="0"/>
+                <w:sz w:val="19"/>
+              </w:rPr>
               <w:t>Tea break</w:t>
+            </w:r>
+          </w:p>
+        </w:tc>
+      </w:tr>
+      <w:tr>
+        <w:tc>
+          <w:tcPr>
+            <w:tcW w:type="dxa" w:w="1656"/>
+            <w:shd w:val="clear" w:color="auto" w:fill="F3F5F8"/>
+          </w:tcPr>
+          <w:p>
+            <w:r/>
+            <w:r>
+              <w:rPr>
+                <w:rFonts w:ascii="Arial" w:hAnsi="Arial"/>
+                <w:b w:val="0"/>
+                <w:sz w:val="19"/>
+              </w:rPr>
+              <w:t>15:30–16:00</w:t>
+            </w:r>
+          </w:p>
+        </w:tc>
+        <w:tc>
+          <w:tcPr>
+            <w:tcW w:type="dxa" w:w="1296"/>
+            <w:shd w:val="clear" w:color="auto" w:fill="F3F5F8"/>
+          </w:tcPr>
+          <w:p>
+            <w:r/>
+            <w:r>
+              <w:rPr>
+                <w:rFonts w:ascii="Arial" w:hAnsi="Arial"/>
+                <w:b w:val="0"/>
+                <w:sz w:val="19"/>
+              </w:rPr>
+              <w:t>30 min</w:t>
+            </w:r>
+          </w:p>
+        </w:tc>
+        <w:tc>
+          <w:tcPr>
+            <w:tcW w:type="dxa" w:w="6840"/>
+            <w:shd w:val="clear" w:color="auto" w:fill="F3F5F8"/>
+          </w:tcPr>
+          <w:p>
+            <w:r/>
+            <w:r>
+              <w:rPr>
+                <w:rFonts w:ascii="Arial" w:hAnsi="Arial"/>
+                <w:b w:val="0"/>
+                <w:sz w:val="19"/>
+              </w:rPr>
+              <w:t>Domain 5 recap, full-course review of all 28 SY0-701 objectives, practice-exam walkthrough and exam-registration guidance</w:t>
             </w:r>
           </w:p>
         </w:tc>
@@ -3827,7 +4703,7 @@
                 <w:b/>
                 <w:sz w:val="19"/>
               </w:rPr>
-              <w:t>Briefing for Assessment and exam-registration walkthrough</w:t>
+              <w:t>Briefing for Assessment</w:t>
             </w:r>
           </w:p>
         </w:tc>
@@ -3946,7 +4822,7 @@
           <w:color w:val="555B66"/>
           <w:sz w:val="19"/>
         </w:rPr>
-        <w:t>Total training time: 480 minutes (8 hours).</w:t>
+        <w:t>Total scheduled time: 480 minutes (8 hours) excluding lunch — of which 450 minutes (7.5 hours) are instructional, plus 30 minutes of tea breaks.</w:t>
       </w:r>
     </w:p>
     <w:p>
@@ -3954,24 +4830,25 @@
         <w:pStyle w:val="Heading1"/>
       </w:pPr>
       <w:r>
-        <w:t>Lab Reference (aligned to exam domains)</w:t>
+        <w:t>Lab Reference (aligned to the exam domains)</w:t>
       </w:r>
     </w:p>
     <w:tbl>
       <w:tblPr>
         <w:tblStyle w:val="TableGrid"/>
         <w:tblW w:type="auto" w:w="0"/>
+        <w:tblLayout w:type="fixed"/>
         <w:tblLook w:firstColumn="1" w:firstRow="1" w:lastColumn="0" w:lastRow="0" w:noHBand="0" w:noVBand="1" w:val="04A0"/>
       </w:tblPr>
       <w:tblGrid>
-        <w:gridCol w:w="2880"/>
-        <w:gridCol w:w="2880"/>
-        <w:gridCol w:w="2880"/>
+        <w:gridCol w:w="3744"/>
+        <w:gridCol w:w="1728"/>
+        <w:gridCol w:w="4320"/>
       </w:tblGrid>
       <w:tr>
         <w:tc>
           <w:tcPr>
-            <w:tcW w:type="dxa" w:w="2880"/>
+            <w:tcW w:type="dxa" w:w="3744"/>
             <w:shd w:val="clear" w:color="auto" w:fill="1F6FEB"/>
           </w:tcPr>
           <w:p>
@@ -3983,13 +4860,13 @@
                 <w:color w:val="FFFFFF"/>
                 <w:sz w:val="20"/>
               </w:rPr>
-              <w:t>Domain / exam area</w:t>
-            </w:r>
-          </w:p>
-        </w:tc>
-        <w:tc>
-          <w:tcPr>
-            <w:tcW w:type="dxa" w:w="2880"/>
+              <w:t>Exam domain</w:t>
+            </w:r>
+          </w:p>
+        </w:tc>
+        <w:tc>
+          <w:tcPr>
+            <w:tcW w:type="dxa" w:w="1728"/>
             <w:shd w:val="clear" w:color="auto" w:fill="1F6FEB"/>
           </w:tcPr>
           <w:p>
@@ -4001,13 +4878,13 @@
                 <w:color w:val="FFFFFF"/>
                 <w:sz w:val="20"/>
               </w:rPr>
-              <w:t>Weighting</w:t>
-            </w:r>
-          </w:p>
-        </w:tc>
-        <w:tc>
-          <w:tcPr>
-            <w:tcW w:type="dxa" w:w="2880"/>
+              <w:t>Exam weighting</w:t>
+            </w:r>
+          </w:p>
+        </w:tc>
+        <w:tc>
+          <w:tcPr>
+            <w:tcW w:type="dxa" w:w="4320"/>
             <w:shd w:val="clear" w:color="auto" w:fill="1F6FEB"/>
           </w:tcPr>
           <w:p>
@@ -4027,7 +4904,7 @@
       <w:tr>
         <w:tc>
           <w:tcPr>
-            <w:tcW w:type="dxa" w:w="2880"/>
+            <w:tcW w:type="dxa" w:w="3744"/>
             <w:shd w:val="clear" w:color="auto" w:fill="E8F0FE"/>
           </w:tcPr>
           <w:p>
@@ -4038,13 +4915,13 @@
                 <w:b/>
                 <w:sz w:val="19"/>
               </w:rPr>
-              <w:t>Domain 01: General Security Concepts</w:t>
-            </w:r>
-          </w:p>
-        </w:tc>
-        <w:tc>
-          <w:tcPr>
-            <w:tcW w:type="dxa" w:w="2880"/>
+              <w:t>Domain 1: General Security Concepts</w:t>
+            </w:r>
+          </w:p>
+        </w:tc>
+        <w:tc>
+          <w:tcPr>
+            <w:tcW w:type="dxa" w:w="1728"/>
             <w:shd w:val="clear" w:color="auto" w:fill="E8F0FE"/>
           </w:tcPr>
           <w:p>
@@ -4061,7 +4938,7 @@
         </w:tc>
         <w:tc>
           <w:tcPr>
-            <w:tcW w:type="dxa" w:w="2880"/>
+            <w:tcW w:type="dxa" w:w="4320"/>
           </w:tcPr>
           <w:p>
             <w:r/>
@@ -4071,7 +4948,7 @@
                 <w:b w:val="0"/>
                 <w:sz w:val="19"/>
               </w:rPr>
-              <w:t>Lab 1, Lab 2, Lab 3, Lab 4, Lab 5</w:t>
+              <w:t>Lab 1, Lab 2, Lab 3, Lab 4, Lab 5, Lab 6, Lab 7</w:t>
             </w:r>
           </w:p>
         </w:tc>
@@ -4079,7 +4956,7 @@
       <w:tr>
         <w:tc>
           <w:tcPr>
-            <w:tcW w:type="dxa" w:w="2880"/>
+            <w:tcW w:type="dxa" w:w="3744"/>
             <w:shd w:val="clear" w:color="auto" w:fill="E8F0FE"/>
           </w:tcPr>
           <w:p>
@@ -4090,13 +4967,13 @@
                 <w:b/>
                 <w:sz w:val="19"/>
               </w:rPr>
-              <w:t>Domain 02: Threats, Vulnerabilities &amp; Mitigations</w:t>
-            </w:r>
-          </w:p>
-        </w:tc>
-        <w:tc>
-          <w:tcPr>
-            <w:tcW w:type="dxa" w:w="2880"/>
+              <w:t>Domain 2: Threats, Vulnerabilities &amp; Mitigations</w:t>
+            </w:r>
+          </w:p>
+        </w:tc>
+        <w:tc>
+          <w:tcPr>
+            <w:tcW w:type="dxa" w:w="1728"/>
             <w:shd w:val="clear" w:color="auto" w:fill="E8F0FE"/>
           </w:tcPr>
           <w:p>
@@ -4113,7 +4990,7 @@
         </w:tc>
         <w:tc>
           <w:tcPr>
-            <w:tcW w:type="dxa" w:w="2880"/>
+            <w:tcW w:type="dxa" w:w="4320"/>
           </w:tcPr>
           <w:p>
             <w:r/>
@@ -4123,7 +5000,7 @@
                 <w:b w:val="0"/>
                 <w:sz w:val="19"/>
               </w:rPr>
-              <w:t>Lab 6, Lab 7, Lab 8, Lab 9, Lab 10, Lab 11, Lab 12, Lab 13</w:t>
+              <w:t>Lab 8, Lab 9, Lab 10, Lab 11, Lab 12, Lab 13, Lab 14, Lab 15, Lab 16</w:t>
             </w:r>
           </w:p>
         </w:tc>
@@ -4131,7 +5008,7 @@
       <w:tr>
         <w:tc>
           <w:tcPr>
-            <w:tcW w:type="dxa" w:w="2880"/>
+            <w:tcW w:type="dxa" w:w="3744"/>
             <w:shd w:val="clear" w:color="auto" w:fill="E8F0FE"/>
           </w:tcPr>
           <w:p>
@@ -4142,13 +5019,13 @@
                 <w:b/>
                 <w:sz w:val="19"/>
               </w:rPr>
-              <w:t>Domain 03: Security Architecture</w:t>
-            </w:r>
-          </w:p>
-        </w:tc>
-        <w:tc>
-          <w:tcPr>
-            <w:tcW w:type="dxa" w:w="2880"/>
+              <w:t>Domain 3: Security Architecture</w:t>
+            </w:r>
+          </w:p>
+        </w:tc>
+        <w:tc>
+          <w:tcPr>
+            <w:tcW w:type="dxa" w:w="1728"/>
             <w:shd w:val="clear" w:color="auto" w:fill="E8F0FE"/>
           </w:tcPr>
           <w:p>
@@ -4165,7 +5042,7 @@
         </w:tc>
         <w:tc>
           <w:tcPr>
-            <w:tcW w:type="dxa" w:w="2880"/>
+            <w:tcW w:type="dxa" w:w="4320"/>
           </w:tcPr>
           <w:p>
             <w:r/>
@@ -4175,7 +5052,7 @@
                 <w:b w:val="0"/>
                 <w:sz w:val="19"/>
               </w:rPr>
-              <w:t>Lab 14, Lab 15, Lab 16, Lab 17, Lab 18, Lab 19, Lab 20, Lab 37, Lab 38, Lab 39</w:t>
+              <w:t>Lab 17, Lab 18, Lab 19, Lab 20, Lab 21, Lab 22, Lab 23, Lab 24, Lab 25, Lab 26, Lab 27</w:t>
             </w:r>
           </w:p>
         </w:tc>
@@ -4183,7 +5060,7 @@
       <w:tr>
         <w:tc>
           <w:tcPr>
-            <w:tcW w:type="dxa" w:w="2880"/>
+            <w:tcW w:type="dxa" w:w="3744"/>
             <w:shd w:val="clear" w:color="auto" w:fill="E8F0FE"/>
           </w:tcPr>
           <w:p>
@@ -4194,13 +5071,13 @@
                 <w:b/>
                 <w:sz w:val="19"/>
               </w:rPr>
-              <w:t>Domain 04: Security Operations</w:t>
-            </w:r>
-          </w:p>
-        </w:tc>
-        <w:tc>
-          <w:tcPr>
-            <w:tcW w:type="dxa" w:w="2880"/>
+              <w:t>Domain 4: Security Operations</w:t>
+            </w:r>
+          </w:p>
+        </w:tc>
+        <w:tc>
+          <w:tcPr>
+            <w:tcW w:type="dxa" w:w="1728"/>
             <w:shd w:val="clear" w:color="auto" w:fill="E8F0FE"/>
           </w:tcPr>
           <w:p>
@@ -4217,7 +5094,7 @@
         </w:tc>
         <w:tc>
           <w:tcPr>
-            <w:tcW w:type="dxa" w:w="2880"/>
+            <w:tcW w:type="dxa" w:w="4320"/>
           </w:tcPr>
           <w:p>
             <w:r/>
@@ -4227,7 +5104,7 @@
                 <w:b w:val="0"/>
                 <w:sz w:val="19"/>
               </w:rPr>
-              <w:t>Lab 21, Lab 22, Lab 23, Lab 24, Lab 25, Lab 26, Lab 27, Lab 28, Lab 29, Lab 30, Lab 40, Lab 41, Lab 42, Lab 43</w:t>
+              <w:t>Lab 28, Lab 29, Lab 30, Lab 31, Lab 32, Lab 33, Lab 34, Lab 35, Lab 36, Lab 37, Lab 38, Lab 39, Lab 40, Lab 41, Lab 42, Lab 43, Lab 44</w:t>
             </w:r>
           </w:p>
         </w:tc>
@@ -4235,7 +5112,7 @@
       <w:tr>
         <w:tc>
           <w:tcPr>
-            <w:tcW w:type="dxa" w:w="2880"/>
+            <w:tcW w:type="dxa" w:w="3744"/>
             <w:shd w:val="clear" w:color="auto" w:fill="E8F0FE"/>
           </w:tcPr>
           <w:p>
@@ -4246,13 +5123,13 @@
                 <w:b/>
                 <w:sz w:val="19"/>
               </w:rPr>
-              <w:t>Domain 05: Security Program Management &amp; Oversight</w:t>
-            </w:r>
-          </w:p>
-        </w:tc>
-        <w:tc>
-          <w:tcPr>
-            <w:tcW w:type="dxa" w:w="2880"/>
+              <w:t>Domain 5: Security Program Management &amp; Oversight</w:t>
+            </w:r>
+          </w:p>
+        </w:tc>
+        <w:tc>
+          <w:tcPr>
+            <w:tcW w:type="dxa" w:w="1728"/>
             <w:shd w:val="clear" w:color="auto" w:fill="E8F0FE"/>
           </w:tcPr>
           <w:p>
@@ -4269,7 +5146,7 @@
         </w:tc>
         <w:tc>
           <w:tcPr>
-            <w:tcW w:type="dxa" w:w="2880"/>
+            <w:tcW w:type="dxa" w:w="4320"/>
           </w:tcPr>
           <w:p>
             <w:r/>
@@ -4279,7 +5156,1517 @@
                 <w:b w:val="0"/>
                 <w:sz w:val="19"/>
               </w:rPr>
-              <w:t>Lab 31, Lab 32, Lab 33, Lab 34, Lab 35, Lab 36</w:t>
+              <w:t>Lab 45, Lab 46, Lab 47, Lab 48, Lab 49, Lab 50, Lab 51, Lab 52</w:t>
+            </w:r>
+          </w:p>
+        </w:tc>
+      </w:tr>
+    </w:tbl>
+    <w:p>
+      <w:pPr>
+        <w:pStyle w:val="Heading1"/>
+      </w:pPr>
+      <w:r>
+        <w:t>SY0-701 Exam Objective Coverage</w:t>
+      </w:r>
+    </w:p>
+    <w:p>
+      <w:r>
+        <w:t>The course follows the official CompTIA Security+ SY0-701 blueprint in order. Every exam objective is taught and then practised in at least one hands-on lab.</w:t>
+      </w:r>
+    </w:p>
+    <w:tbl>
+      <w:tblPr>
+        <w:tblStyle w:val="TableGrid"/>
+        <w:tblW w:type="auto" w:w="0"/>
+        <w:tblLayout w:type="fixed"/>
+        <w:tblLook w:firstColumn="1" w:firstRow="1" w:lastColumn="0" w:lastRow="0" w:noHBand="0" w:noVBand="1" w:val="04A0"/>
+      </w:tblPr>
+      <w:tblGrid>
+        <w:gridCol w:w="1296"/>
+        <w:gridCol w:w="6624"/>
+        <w:gridCol w:w="1872"/>
+      </w:tblGrid>
+      <w:tr>
+        <w:tc>
+          <w:tcPr>
+            <w:tcW w:type="dxa" w:w="1296"/>
+            <w:shd w:val="clear" w:color="auto" w:fill="1F6FEB"/>
+          </w:tcPr>
+          <w:p>
+            <w:r/>
+            <w:r>
+              <w:rPr>
+                <w:rFonts w:ascii="Arial" w:hAnsi="Arial"/>
+                <w:b/>
+                <w:color w:val="FFFFFF"/>
+                <w:sz w:val="20"/>
+              </w:rPr>
+              <w:t>Objective</w:t>
+            </w:r>
+          </w:p>
+        </w:tc>
+        <w:tc>
+          <w:tcPr>
+            <w:tcW w:type="dxa" w:w="6624"/>
+            <w:shd w:val="clear" w:color="auto" w:fill="1F6FEB"/>
+          </w:tcPr>
+          <w:p>
+            <w:r/>
+            <w:r>
+              <w:rPr>
+                <w:rFonts w:ascii="Arial" w:hAnsi="Arial"/>
+                <w:b/>
+                <w:color w:val="FFFFFF"/>
+                <w:sz w:val="20"/>
+              </w:rPr>
+              <w:t>Exam objective (official wording)</w:t>
+            </w:r>
+          </w:p>
+        </w:tc>
+        <w:tc>
+          <w:tcPr>
+            <w:tcW w:type="dxa" w:w="1872"/>
+            <w:shd w:val="clear" w:color="auto" w:fill="1F6FEB"/>
+          </w:tcPr>
+          <w:p>
+            <w:r/>
+            <w:r>
+              <w:rPr>
+                <w:rFonts w:ascii="Arial" w:hAnsi="Arial"/>
+                <w:b/>
+                <w:color w:val="FFFFFF"/>
+                <w:sz w:val="20"/>
+              </w:rPr>
+              <w:t>Labs</w:t>
+            </w:r>
+          </w:p>
+        </w:tc>
+      </w:tr>
+      <w:tr>
+        <w:tc>
+          <w:tcPr>
+            <w:tcW w:type="dxa" w:w="1296"/>
+            <w:shd w:val="clear" w:color="auto" w:fill="E8F0FE"/>
+          </w:tcPr>
+          <w:p>
+            <w:r/>
+            <w:r>
+              <w:rPr>
+                <w:rFonts w:ascii="Arial" w:hAnsi="Arial"/>
+                <w:b/>
+                <w:sz w:val="19"/>
+              </w:rPr>
+              <w:t>1.1</w:t>
+            </w:r>
+          </w:p>
+        </w:tc>
+        <w:tc>
+          <w:tcPr>
+            <w:tcW w:type="dxa" w:w="6624"/>
+          </w:tcPr>
+          <w:p>
+            <w:r/>
+            <w:r>
+              <w:rPr>
+                <w:rFonts w:ascii="Arial" w:hAnsi="Arial"/>
+                <w:b w:val="0"/>
+                <w:sz w:val="19"/>
+              </w:rPr>
+              <w:t>Compare and contrast various types of security controls</w:t>
+            </w:r>
+          </w:p>
+        </w:tc>
+        <w:tc>
+          <w:tcPr>
+            <w:tcW w:type="dxa" w:w="1872"/>
+          </w:tcPr>
+          <w:p>
+            <w:r/>
+            <w:r>
+              <w:rPr>
+                <w:rFonts w:ascii="Arial" w:hAnsi="Arial"/>
+                <w:b w:val="0"/>
+                <w:sz w:val="19"/>
+              </w:rPr>
+              <w:t>Lab 1</w:t>
+            </w:r>
+          </w:p>
+        </w:tc>
+      </w:tr>
+      <w:tr>
+        <w:tc>
+          <w:tcPr>
+            <w:tcW w:type="dxa" w:w="1296"/>
+            <w:shd w:val="clear" w:color="auto" w:fill="E8F0FE"/>
+          </w:tcPr>
+          <w:p>
+            <w:r/>
+            <w:r>
+              <w:rPr>
+                <w:rFonts w:ascii="Arial" w:hAnsi="Arial"/>
+                <w:b/>
+                <w:sz w:val="19"/>
+              </w:rPr>
+              <w:t>1.2</w:t>
+            </w:r>
+          </w:p>
+        </w:tc>
+        <w:tc>
+          <w:tcPr>
+            <w:tcW w:type="dxa" w:w="6624"/>
+          </w:tcPr>
+          <w:p>
+            <w:r/>
+            <w:r>
+              <w:rPr>
+                <w:rFonts w:ascii="Arial" w:hAnsi="Arial"/>
+                <w:b w:val="0"/>
+                <w:sz w:val="19"/>
+              </w:rPr>
+              <w:t>Summarize fundamental security concepts</w:t>
+            </w:r>
+          </w:p>
+        </w:tc>
+        <w:tc>
+          <w:tcPr>
+            <w:tcW w:type="dxa" w:w="1872"/>
+          </w:tcPr>
+          <w:p>
+            <w:r/>
+            <w:r>
+              <w:rPr>
+                <w:rFonts w:ascii="Arial" w:hAnsi="Arial"/>
+                <w:b w:val="0"/>
+                <w:sz w:val="19"/>
+              </w:rPr>
+              <w:t>Lab 2, Lab 3</w:t>
+            </w:r>
+          </w:p>
+        </w:tc>
+      </w:tr>
+      <w:tr>
+        <w:tc>
+          <w:tcPr>
+            <w:tcW w:type="dxa" w:w="1296"/>
+            <w:shd w:val="clear" w:color="auto" w:fill="E8F0FE"/>
+          </w:tcPr>
+          <w:p>
+            <w:r/>
+            <w:r>
+              <w:rPr>
+                <w:rFonts w:ascii="Arial" w:hAnsi="Arial"/>
+                <w:b/>
+                <w:sz w:val="19"/>
+              </w:rPr>
+              <w:t>1.3</w:t>
+            </w:r>
+          </w:p>
+        </w:tc>
+        <w:tc>
+          <w:tcPr>
+            <w:tcW w:type="dxa" w:w="6624"/>
+          </w:tcPr>
+          <w:p>
+            <w:r/>
+            <w:r>
+              <w:rPr>
+                <w:rFonts w:ascii="Arial" w:hAnsi="Arial"/>
+                <w:b w:val="0"/>
+                <w:sz w:val="19"/>
+              </w:rPr>
+              <w:t>Explain the importance of change management processes and the impact to security</w:t>
+            </w:r>
+          </w:p>
+        </w:tc>
+        <w:tc>
+          <w:tcPr>
+            <w:tcW w:type="dxa" w:w="1872"/>
+          </w:tcPr>
+          <w:p>
+            <w:r/>
+            <w:r>
+              <w:rPr>
+                <w:rFonts w:ascii="Arial" w:hAnsi="Arial"/>
+                <w:b w:val="0"/>
+                <w:sz w:val="19"/>
+              </w:rPr>
+              <w:t>Lab 4</w:t>
+            </w:r>
+          </w:p>
+        </w:tc>
+      </w:tr>
+      <w:tr>
+        <w:tc>
+          <w:tcPr>
+            <w:tcW w:type="dxa" w:w="1296"/>
+            <w:shd w:val="clear" w:color="auto" w:fill="E8F0FE"/>
+          </w:tcPr>
+          <w:p>
+            <w:r/>
+            <w:r>
+              <w:rPr>
+                <w:rFonts w:ascii="Arial" w:hAnsi="Arial"/>
+                <w:b/>
+                <w:sz w:val="19"/>
+              </w:rPr>
+              <w:t>1.4</w:t>
+            </w:r>
+          </w:p>
+        </w:tc>
+        <w:tc>
+          <w:tcPr>
+            <w:tcW w:type="dxa" w:w="6624"/>
+          </w:tcPr>
+          <w:p>
+            <w:r/>
+            <w:r>
+              <w:rPr>
+                <w:rFonts w:ascii="Arial" w:hAnsi="Arial"/>
+                <w:b w:val="0"/>
+                <w:sz w:val="19"/>
+              </w:rPr>
+              <w:t>Explain the importance of using appropriate cryptographic solutions</w:t>
+            </w:r>
+          </w:p>
+        </w:tc>
+        <w:tc>
+          <w:tcPr>
+            <w:tcW w:type="dxa" w:w="1872"/>
+          </w:tcPr>
+          <w:p>
+            <w:r/>
+            <w:r>
+              <w:rPr>
+                <w:rFonts w:ascii="Arial" w:hAnsi="Arial"/>
+                <w:b w:val="0"/>
+                <w:sz w:val="19"/>
+              </w:rPr>
+              <w:t>Lab 5, Lab 6, Lab 7</w:t>
+            </w:r>
+          </w:p>
+        </w:tc>
+      </w:tr>
+      <w:tr>
+        <w:tc>
+          <w:tcPr>
+            <w:tcW w:type="dxa" w:w="1296"/>
+            <w:shd w:val="clear" w:color="auto" w:fill="E8F0FE"/>
+          </w:tcPr>
+          <w:p>
+            <w:r/>
+            <w:r>
+              <w:rPr>
+                <w:rFonts w:ascii="Arial" w:hAnsi="Arial"/>
+                <w:b/>
+                <w:sz w:val="19"/>
+              </w:rPr>
+              <w:t>2.1</w:t>
+            </w:r>
+          </w:p>
+        </w:tc>
+        <w:tc>
+          <w:tcPr>
+            <w:tcW w:type="dxa" w:w="6624"/>
+          </w:tcPr>
+          <w:p>
+            <w:r/>
+            <w:r>
+              <w:rPr>
+                <w:rFonts w:ascii="Arial" w:hAnsi="Arial"/>
+                <w:b w:val="0"/>
+                <w:sz w:val="19"/>
+              </w:rPr>
+              <w:t>Compare and contrast common threat actors and motivations</w:t>
+            </w:r>
+          </w:p>
+        </w:tc>
+        <w:tc>
+          <w:tcPr>
+            <w:tcW w:type="dxa" w:w="1872"/>
+          </w:tcPr>
+          <w:p>
+            <w:r/>
+            <w:r>
+              <w:rPr>
+                <w:rFonts w:ascii="Arial" w:hAnsi="Arial"/>
+                <w:b w:val="0"/>
+                <w:sz w:val="19"/>
+              </w:rPr>
+              <w:t>Lab 8</w:t>
+            </w:r>
+          </w:p>
+        </w:tc>
+      </w:tr>
+      <w:tr>
+        <w:tc>
+          <w:tcPr>
+            <w:tcW w:type="dxa" w:w="1296"/>
+            <w:shd w:val="clear" w:color="auto" w:fill="E8F0FE"/>
+          </w:tcPr>
+          <w:p>
+            <w:r/>
+            <w:r>
+              <w:rPr>
+                <w:rFonts w:ascii="Arial" w:hAnsi="Arial"/>
+                <w:b/>
+                <w:sz w:val="19"/>
+              </w:rPr>
+              <w:t>2.2</w:t>
+            </w:r>
+          </w:p>
+        </w:tc>
+        <w:tc>
+          <w:tcPr>
+            <w:tcW w:type="dxa" w:w="6624"/>
+          </w:tcPr>
+          <w:p>
+            <w:r/>
+            <w:r>
+              <w:rPr>
+                <w:rFonts w:ascii="Arial" w:hAnsi="Arial"/>
+                <w:b w:val="0"/>
+                <w:sz w:val="19"/>
+              </w:rPr>
+              <w:t>Explain common threat vectors and attack surfaces</w:t>
+            </w:r>
+          </w:p>
+        </w:tc>
+        <w:tc>
+          <w:tcPr>
+            <w:tcW w:type="dxa" w:w="1872"/>
+          </w:tcPr>
+          <w:p>
+            <w:r/>
+            <w:r>
+              <w:rPr>
+                <w:rFonts w:ascii="Arial" w:hAnsi="Arial"/>
+                <w:b w:val="0"/>
+                <w:sz w:val="19"/>
+              </w:rPr>
+              <w:t>Lab 9</w:t>
+            </w:r>
+          </w:p>
+        </w:tc>
+      </w:tr>
+      <w:tr>
+        <w:tc>
+          <w:tcPr>
+            <w:tcW w:type="dxa" w:w="1296"/>
+            <w:shd w:val="clear" w:color="auto" w:fill="E8F0FE"/>
+          </w:tcPr>
+          <w:p>
+            <w:r/>
+            <w:r>
+              <w:rPr>
+                <w:rFonts w:ascii="Arial" w:hAnsi="Arial"/>
+                <w:b/>
+                <w:sz w:val="19"/>
+              </w:rPr>
+              <w:t>2.3</w:t>
+            </w:r>
+          </w:p>
+        </w:tc>
+        <w:tc>
+          <w:tcPr>
+            <w:tcW w:type="dxa" w:w="6624"/>
+          </w:tcPr>
+          <w:p>
+            <w:r/>
+            <w:r>
+              <w:rPr>
+                <w:rFonts w:ascii="Arial" w:hAnsi="Arial"/>
+                <w:b w:val="0"/>
+                <w:sz w:val="19"/>
+              </w:rPr>
+              <w:t>Explain various types of vulnerabilities</w:t>
+            </w:r>
+          </w:p>
+        </w:tc>
+        <w:tc>
+          <w:tcPr>
+            <w:tcW w:type="dxa" w:w="1872"/>
+          </w:tcPr>
+          <w:p>
+            <w:r/>
+            <w:r>
+              <w:rPr>
+                <w:rFonts w:ascii="Arial" w:hAnsi="Arial"/>
+                <w:b w:val="0"/>
+                <w:sz w:val="19"/>
+              </w:rPr>
+              <w:t>Lab 10, Lab 11, Lab 12</w:t>
+            </w:r>
+          </w:p>
+        </w:tc>
+      </w:tr>
+      <w:tr>
+        <w:tc>
+          <w:tcPr>
+            <w:tcW w:type="dxa" w:w="1296"/>
+            <w:shd w:val="clear" w:color="auto" w:fill="E8F0FE"/>
+          </w:tcPr>
+          <w:p>
+            <w:r/>
+            <w:r>
+              <w:rPr>
+                <w:rFonts w:ascii="Arial" w:hAnsi="Arial"/>
+                <w:b/>
+                <w:sz w:val="19"/>
+              </w:rPr>
+              <w:t>2.4</w:t>
+            </w:r>
+          </w:p>
+        </w:tc>
+        <w:tc>
+          <w:tcPr>
+            <w:tcW w:type="dxa" w:w="6624"/>
+          </w:tcPr>
+          <w:p>
+            <w:r/>
+            <w:r>
+              <w:rPr>
+                <w:rFonts w:ascii="Arial" w:hAnsi="Arial"/>
+                <w:b w:val="0"/>
+                <w:sz w:val="19"/>
+              </w:rPr>
+              <w:t>Given a scenario, analyze indicators of malicious activity</w:t>
+            </w:r>
+          </w:p>
+        </w:tc>
+        <w:tc>
+          <w:tcPr>
+            <w:tcW w:type="dxa" w:w="1872"/>
+          </w:tcPr>
+          <w:p>
+            <w:r/>
+            <w:r>
+              <w:rPr>
+                <w:rFonts w:ascii="Arial" w:hAnsi="Arial"/>
+                <w:b w:val="0"/>
+                <w:sz w:val="19"/>
+              </w:rPr>
+              <w:t>Lab 13, Lab 14, Lab 15</w:t>
+            </w:r>
+          </w:p>
+        </w:tc>
+      </w:tr>
+      <w:tr>
+        <w:tc>
+          <w:tcPr>
+            <w:tcW w:type="dxa" w:w="1296"/>
+            <w:shd w:val="clear" w:color="auto" w:fill="E8F0FE"/>
+          </w:tcPr>
+          <w:p>
+            <w:r/>
+            <w:r>
+              <w:rPr>
+                <w:rFonts w:ascii="Arial" w:hAnsi="Arial"/>
+                <w:b/>
+                <w:sz w:val="19"/>
+              </w:rPr>
+              <w:t>2.5</w:t>
+            </w:r>
+          </w:p>
+        </w:tc>
+        <w:tc>
+          <w:tcPr>
+            <w:tcW w:type="dxa" w:w="6624"/>
+          </w:tcPr>
+          <w:p>
+            <w:r/>
+            <w:r>
+              <w:rPr>
+                <w:rFonts w:ascii="Arial" w:hAnsi="Arial"/>
+                <w:b w:val="0"/>
+                <w:sz w:val="19"/>
+              </w:rPr>
+              <w:t>Explain the purpose of mitigation techniques used to secure the enterprise</w:t>
+            </w:r>
+          </w:p>
+        </w:tc>
+        <w:tc>
+          <w:tcPr>
+            <w:tcW w:type="dxa" w:w="1872"/>
+          </w:tcPr>
+          <w:p>
+            <w:r/>
+            <w:r>
+              <w:rPr>
+                <w:rFonts w:ascii="Arial" w:hAnsi="Arial"/>
+                <w:b w:val="0"/>
+                <w:sz w:val="19"/>
+              </w:rPr>
+              <w:t>Lab 16</w:t>
+            </w:r>
+          </w:p>
+        </w:tc>
+      </w:tr>
+      <w:tr>
+        <w:tc>
+          <w:tcPr>
+            <w:tcW w:type="dxa" w:w="1296"/>
+            <w:shd w:val="clear" w:color="auto" w:fill="E8F0FE"/>
+          </w:tcPr>
+          <w:p>
+            <w:r/>
+            <w:r>
+              <w:rPr>
+                <w:rFonts w:ascii="Arial" w:hAnsi="Arial"/>
+                <w:b/>
+                <w:sz w:val="19"/>
+              </w:rPr>
+              <w:t>3.1</w:t>
+            </w:r>
+          </w:p>
+        </w:tc>
+        <w:tc>
+          <w:tcPr>
+            <w:tcW w:type="dxa" w:w="6624"/>
+          </w:tcPr>
+          <w:p>
+            <w:r/>
+            <w:r>
+              <w:rPr>
+                <w:rFonts w:ascii="Arial" w:hAnsi="Arial"/>
+                <w:b w:val="0"/>
+                <w:sz w:val="19"/>
+              </w:rPr>
+              <w:t>Compare and contrast security implications of different architecture models</w:t>
+            </w:r>
+          </w:p>
+        </w:tc>
+        <w:tc>
+          <w:tcPr>
+            <w:tcW w:type="dxa" w:w="1872"/>
+          </w:tcPr>
+          <w:p>
+            <w:r/>
+            <w:r>
+              <w:rPr>
+                <w:rFonts w:ascii="Arial" w:hAnsi="Arial"/>
+                <w:b w:val="0"/>
+                <w:sz w:val="19"/>
+              </w:rPr>
+              <w:t>Lab 17, Lab 18</w:t>
+            </w:r>
+          </w:p>
+        </w:tc>
+      </w:tr>
+      <w:tr>
+        <w:tc>
+          <w:tcPr>
+            <w:tcW w:type="dxa" w:w="1296"/>
+            <w:shd w:val="clear" w:color="auto" w:fill="E8F0FE"/>
+          </w:tcPr>
+          <w:p>
+            <w:r/>
+            <w:r>
+              <w:rPr>
+                <w:rFonts w:ascii="Arial" w:hAnsi="Arial"/>
+                <w:b/>
+                <w:sz w:val="19"/>
+              </w:rPr>
+              <w:t>3.2</w:t>
+            </w:r>
+          </w:p>
+        </w:tc>
+        <w:tc>
+          <w:tcPr>
+            <w:tcW w:type="dxa" w:w="6624"/>
+          </w:tcPr>
+          <w:p>
+            <w:r/>
+            <w:r>
+              <w:rPr>
+                <w:rFonts w:ascii="Arial" w:hAnsi="Arial"/>
+                <w:b w:val="0"/>
+                <w:sz w:val="19"/>
+              </w:rPr>
+              <w:t>Given a scenario, apply security principles to secure enterprise infrastructure</w:t>
+            </w:r>
+          </w:p>
+        </w:tc>
+        <w:tc>
+          <w:tcPr>
+            <w:tcW w:type="dxa" w:w="1872"/>
+          </w:tcPr>
+          <w:p>
+            <w:r/>
+            <w:r>
+              <w:rPr>
+                <w:rFonts w:ascii="Arial" w:hAnsi="Arial"/>
+                <w:b w:val="0"/>
+                <w:sz w:val="19"/>
+              </w:rPr>
+              <w:t>Lab 19, Lab 20, Lab 21, Lab 22</w:t>
+            </w:r>
+          </w:p>
+        </w:tc>
+      </w:tr>
+      <w:tr>
+        <w:tc>
+          <w:tcPr>
+            <w:tcW w:type="dxa" w:w="1296"/>
+            <w:shd w:val="clear" w:color="auto" w:fill="E8F0FE"/>
+          </w:tcPr>
+          <w:p>
+            <w:r/>
+            <w:r>
+              <w:rPr>
+                <w:rFonts w:ascii="Arial" w:hAnsi="Arial"/>
+                <w:b/>
+                <w:sz w:val="19"/>
+              </w:rPr>
+              <w:t>3.3</w:t>
+            </w:r>
+          </w:p>
+        </w:tc>
+        <w:tc>
+          <w:tcPr>
+            <w:tcW w:type="dxa" w:w="6624"/>
+          </w:tcPr>
+          <w:p>
+            <w:r/>
+            <w:r>
+              <w:rPr>
+                <w:rFonts w:ascii="Arial" w:hAnsi="Arial"/>
+                <w:b w:val="0"/>
+                <w:sz w:val="19"/>
+              </w:rPr>
+              <w:t>Compare and contrast concepts and strategies to protect data</w:t>
+            </w:r>
+          </w:p>
+        </w:tc>
+        <w:tc>
+          <w:tcPr>
+            <w:tcW w:type="dxa" w:w="1872"/>
+          </w:tcPr>
+          <w:p>
+            <w:r/>
+            <w:r>
+              <w:rPr>
+                <w:rFonts w:ascii="Arial" w:hAnsi="Arial"/>
+                <w:b w:val="0"/>
+                <w:sz w:val="19"/>
+              </w:rPr>
+              <w:t>Lab 23, Lab 24, Lab 25</w:t>
+            </w:r>
+          </w:p>
+        </w:tc>
+      </w:tr>
+      <w:tr>
+        <w:tc>
+          <w:tcPr>
+            <w:tcW w:type="dxa" w:w="1296"/>
+            <w:shd w:val="clear" w:color="auto" w:fill="E8F0FE"/>
+          </w:tcPr>
+          <w:p>
+            <w:r/>
+            <w:r>
+              <w:rPr>
+                <w:rFonts w:ascii="Arial" w:hAnsi="Arial"/>
+                <w:b/>
+                <w:sz w:val="19"/>
+              </w:rPr>
+              <w:t>3.4</w:t>
+            </w:r>
+          </w:p>
+        </w:tc>
+        <w:tc>
+          <w:tcPr>
+            <w:tcW w:type="dxa" w:w="6624"/>
+          </w:tcPr>
+          <w:p>
+            <w:r/>
+            <w:r>
+              <w:rPr>
+                <w:rFonts w:ascii="Arial" w:hAnsi="Arial"/>
+                <w:b w:val="0"/>
+                <w:sz w:val="19"/>
+              </w:rPr>
+              <w:t>Explain the importance of resilience and recovery in security architecture</w:t>
+            </w:r>
+          </w:p>
+        </w:tc>
+        <w:tc>
+          <w:tcPr>
+            <w:tcW w:type="dxa" w:w="1872"/>
+          </w:tcPr>
+          <w:p>
+            <w:r/>
+            <w:r>
+              <w:rPr>
+                <w:rFonts w:ascii="Arial" w:hAnsi="Arial"/>
+                <w:b w:val="0"/>
+                <w:sz w:val="19"/>
+              </w:rPr>
+              <w:t>Lab 26, Lab 27</w:t>
+            </w:r>
+          </w:p>
+        </w:tc>
+      </w:tr>
+      <w:tr>
+        <w:tc>
+          <w:tcPr>
+            <w:tcW w:type="dxa" w:w="1296"/>
+            <w:shd w:val="clear" w:color="auto" w:fill="E8F0FE"/>
+          </w:tcPr>
+          <w:p>
+            <w:r/>
+            <w:r>
+              <w:rPr>
+                <w:rFonts w:ascii="Arial" w:hAnsi="Arial"/>
+                <w:b/>
+                <w:sz w:val="19"/>
+              </w:rPr>
+              <w:t>4.1</w:t>
+            </w:r>
+          </w:p>
+        </w:tc>
+        <w:tc>
+          <w:tcPr>
+            <w:tcW w:type="dxa" w:w="6624"/>
+          </w:tcPr>
+          <w:p>
+            <w:r/>
+            <w:r>
+              <w:rPr>
+                <w:rFonts w:ascii="Arial" w:hAnsi="Arial"/>
+                <w:b w:val="0"/>
+                <w:sz w:val="19"/>
+              </w:rPr>
+              <w:t>Given a scenario, apply common security techniques to computing resources</w:t>
+            </w:r>
+          </w:p>
+        </w:tc>
+        <w:tc>
+          <w:tcPr>
+            <w:tcW w:type="dxa" w:w="1872"/>
+          </w:tcPr>
+          <w:p>
+            <w:r/>
+            <w:r>
+              <w:rPr>
+                <w:rFonts w:ascii="Arial" w:hAnsi="Arial"/>
+                <w:b w:val="0"/>
+                <w:sz w:val="19"/>
+              </w:rPr>
+              <w:t>Lab 28, Lab 29</w:t>
+            </w:r>
+          </w:p>
+        </w:tc>
+      </w:tr>
+      <w:tr>
+        <w:tc>
+          <w:tcPr>
+            <w:tcW w:type="dxa" w:w="1296"/>
+            <w:shd w:val="clear" w:color="auto" w:fill="E8F0FE"/>
+          </w:tcPr>
+          <w:p>
+            <w:r/>
+            <w:r>
+              <w:rPr>
+                <w:rFonts w:ascii="Arial" w:hAnsi="Arial"/>
+                <w:b/>
+                <w:sz w:val="19"/>
+              </w:rPr>
+              <w:t>4.2</w:t>
+            </w:r>
+          </w:p>
+        </w:tc>
+        <w:tc>
+          <w:tcPr>
+            <w:tcW w:type="dxa" w:w="6624"/>
+          </w:tcPr>
+          <w:p>
+            <w:r/>
+            <w:r>
+              <w:rPr>
+                <w:rFonts w:ascii="Arial" w:hAnsi="Arial"/>
+                <w:b w:val="0"/>
+                <w:sz w:val="19"/>
+              </w:rPr>
+              <w:t>Explain the security implications of proper hardware, software, and data asset management</w:t>
+            </w:r>
+          </w:p>
+        </w:tc>
+        <w:tc>
+          <w:tcPr>
+            <w:tcW w:type="dxa" w:w="1872"/>
+          </w:tcPr>
+          <w:p>
+            <w:r/>
+            <w:r>
+              <w:rPr>
+                <w:rFonts w:ascii="Arial" w:hAnsi="Arial"/>
+                <w:b w:val="0"/>
+                <w:sz w:val="19"/>
+              </w:rPr>
+              <w:t>Lab 30</w:t>
+            </w:r>
+          </w:p>
+        </w:tc>
+      </w:tr>
+      <w:tr>
+        <w:tc>
+          <w:tcPr>
+            <w:tcW w:type="dxa" w:w="1296"/>
+            <w:shd w:val="clear" w:color="auto" w:fill="E8F0FE"/>
+          </w:tcPr>
+          <w:p>
+            <w:r/>
+            <w:r>
+              <w:rPr>
+                <w:rFonts w:ascii="Arial" w:hAnsi="Arial"/>
+                <w:b/>
+                <w:sz w:val="19"/>
+              </w:rPr>
+              <w:t>4.3</w:t>
+            </w:r>
+          </w:p>
+        </w:tc>
+        <w:tc>
+          <w:tcPr>
+            <w:tcW w:type="dxa" w:w="6624"/>
+          </w:tcPr>
+          <w:p>
+            <w:r/>
+            <w:r>
+              <w:rPr>
+                <w:rFonts w:ascii="Arial" w:hAnsi="Arial"/>
+                <w:b w:val="0"/>
+                <w:sz w:val="19"/>
+              </w:rPr>
+              <w:t>Explain various activities associated with vulnerability management</w:t>
+            </w:r>
+          </w:p>
+        </w:tc>
+        <w:tc>
+          <w:tcPr>
+            <w:tcW w:type="dxa" w:w="1872"/>
+          </w:tcPr>
+          <w:p>
+            <w:r/>
+            <w:r>
+              <w:rPr>
+                <w:rFonts w:ascii="Arial" w:hAnsi="Arial"/>
+                <w:b w:val="0"/>
+                <w:sz w:val="19"/>
+              </w:rPr>
+              <w:t>Lab 31, Lab 32</w:t>
+            </w:r>
+          </w:p>
+        </w:tc>
+      </w:tr>
+      <w:tr>
+        <w:tc>
+          <w:tcPr>
+            <w:tcW w:type="dxa" w:w="1296"/>
+            <w:shd w:val="clear" w:color="auto" w:fill="E8F0FE"/>
+          </w:tcPr>
+          <w:p>
+            <w:r/>
+            <w:r>
+              <w:rPr>
+                <w:rFonts w:ascii="Arial" w:hAnsi="Arial"/>
+                <w:b/>
+                <w:sz w:val="19"/>
+              </w:rPr>
+              <w:t>4.4</w:t>
+            </w:r>
+          </w:p>
+        </w:tc>
+        <w:tc>
+          <w:tcPr>
+            <w:tcW w:type="dxa" w:w="6624"/>
+          </w:tcPr>
+          <w:p>
+            <w:r/>
+            <w:r>
+              <w:rPr>
+                <w:rFonts w:ascii="Arial" w:hAnsi="Arial"/>
+                <w:b w:val="0"/>
+                <w:sz w:val="19"/>
+              </w:rPr>
+              <w:t>Explain security alerting and monitoring concepts and tools</w:t>
+            </w:r>
+          </w:p>
+        </w:tc>
+        <w:tc>
+          <w:tcPr>
+            <w:tcW w:type="dxa" w:w="1872"/>
+          </w:tcPr>
+          <w:p>
+            <w:r/>
+            <w:r>
+              <w:rPr>
+                <w:rFonts w:ascii="Arial" w:hAnsi="Arial"/>
+                <w:b w:val="0"/>
+                <w:sz w:val="19"/>
+              </w:rPr>
+              <w:t>Lab 33, Lab 34</w:t>
+            </w:r>
+          </w:p>
+        </w:tc>
+      </w:tr>
+      <w:tr>
+        <w:tc>
+          <w:tcPr>
+            <w:tcW w:type="dxa" w:w="1296"/>
+            <w:shd w:val="clear" w:color="auto" w:fill="E8F0FE"/>
+          </w:tcPr>
+          <w:p>
+            <w:r/>
+            <w:r>
+              <w:rPr>
+                <w:rFonts w:ascii="Arial" w:hAnsi="Arial"/>
+                <w:b/>
+                <w:sz w:val="19"/>
+              </w:rPr>
+              <w:t>4.5</w:t>
+            </w:r>
+          </w:p>
+        </w:tc>
+        <w:tc>
+          <w:tcPr>
+            <w:tcW w:type="dxa" w:w="6624"/>
+          </w:tcPr>
+          <w:p>
+            <w:r/>
+            <w:r>
+              <w:rPr>
+                <w:rFonts w:ascii="Arial" w:hAnsi="Arial"/>
+                <w:b w:val="0"/>
+                <w:sz w:val="19"/>
+              </w:rPr>
+              <w:t>Given a scenario, modify enterprise capabilities to enhance security</w:t>
+            </w:r>
+          </w:p>
+        </w:tc>
+        <w:tc>
+          <w:tcPr>
+            <w:tcW w:type="dxa" w:w="1872"/>
+          </w:tcPr>
+          <w:p>
+            <w:r/>
+            <w:r>
+              <w:rPr>
+                <w:rFonts w:ascii="Arial" w:hAnsi="Arial"/>
+                <w:b w:val="0"/>
+                <w:sz w:val="19"/>
+              </w:rPr>
+              <w:t>Lab 35, Lab 36, Lab 37</w:t>
+            </w:r>
+          </w:p>
+        </w:tc>
+      </w:tr>
+      <w:tr>
+        <w:tc>
+          <w:tcPr>
+            <w:tcW w:type="dxa" w:w="1296"/>
+            <w:shd w:val="clear" w:color="auto" w:fill="E8F0FE"/>
+          </w:tcPr>
+          <w:p>
+            <w:r/>
+            <w:r>
+              <w:rPr>
+                <w:rFonts w:ascii="Arial" w:hAnsi="Arial"/>
+                <w:b/>
+                <w:sz w:val="19"/>
+              </w:rPr>
+              <w:t>4.6</w:t>
+            </w:r>
+          </w:p>
+        </w:tc>
+        <w:tc>
+          <w:tcPr>
+            <w:tcW w:type="dxa" w:w="6624"/>
+          </w:tcPr>
+          <w:p>
+            <w:r/>
+            <w:r>
+              <w:rPr>
+                <w:rFonts w:ascii="Arial" w:hAnsi="Arial"/>
+                <w:b w:val="0"/>
+                <w:sz w:val="19"/>
+              </w:rPr>
+              <w:t>Given a scenario, implement and maintain identity and access management</w:t>
+            </w:r>
+          </w:p>
+        </w:tc>
+        <w:tc>
+          <w:tcPr>
+            <w:tcW w:type="dxa" w:w="1872"/>
+          </w:tcPr>
+          <w:p>
+            <w:r/>
+            <w:r>
+              <w:rPr>
+                <w:rFonts w:ascii="Arial" w:hAnsi="Arial"/>
+                <w:b w:val="0"/>
+                <w:sz w:val="19"/>
+              </w:rPr>
+              <w:t>Lab 38, Lab 39</w:t>
+            </w:r>
+          </w:p>
+        </w:tc>
+      </w:tr>
+      <w:tr>
+        <w:tc>
+          <w:tcPr>
+            <w:tcW w:type="dxa" w:w="1296"/>
+            <w:shd w:val="clear" w:color="auto" w:fill="E8F0FE"/>
+          </w:tcPr>
+          <w:p>
+            <w:r/>
+            <w:r>
+              <w:rPr>
+                <w:rFonts w:ascii="Arial" w:hAnsi="Arial"/>
+                <w:b/>
+                <w:sz w:val="19"/>
+              </w:rPr>
+              <w:t>4.7</w:t>
+            </w:r>
+          </w:p>
+        </w:tc>
+        <w:tc>
+          <w:tcPr>
+            <w:tcW w:type="dxa" w:w="6624"/>
+          </w:tcPr>
+          <w:p>
+            <w:r/>
+            <w:r>
+              <w:rPr>
+                <w:rFonts w:ascii="Arial" w:hAnsi="Arial"/>
+                <w:b w:val="0"/>
+                <w:sz w:val="19"/>
+              </w:rPr>
+              <w:t>Explain the importance of automation and orchestration related to secure operations</w:t>
+            </w:r>
+          </w:p>
+        </w:tc>
+        <w:tc>
+          <w:tcPr>
+            <w:tcW w:type="dxa" w:w="1872"/>
+          </w:tcPr>
+          <w:p>
+            <w:r/>
+            <w:r>
+              <w:rPr>
+                <w:rFonts w:ascii="Arial" w:hAnsi="Arial"/>
+                <w:b w:val="0"/>
+                <w:sz w:val="19"/>
+              </w:rPr>
+              <w:t>Lab 40</w:t>
+            </w:r>
+          </w:p>
+        </w:tc>
+      </w:tr>
+      <w:tr>
+        <w:tc>
+          <w:tcPr>
+            <w:tcW w:type="dxa" w:w="1296"/>
+            <w:shd w:val="clear" w:color="auto" w:fill="E8F0FE"/>
+          </w:tcPr>
+          <w:p>
+            <w:r/>
+            <w:r>
+              <w:rPr>
+                <w:rFonts w:ascii="Arial" w:hAnsi="Arial"/>
+                <w:b/>
+                <w:sz w:val="19"/>
+              </w:rPr>
+              <w:t>4.8</w:t>
+            </w:r>
+          </w:p>
+        </w:tc>
+        <w:tc>
+          <w:tcPr>
+            <w:tcW w:type="dxa" w:w="6624"/>
+          </w:tcPr>
+          <w:p>
+            <w:r/>
+            <w:r>
+              <w:rPr>
+                <w:rFonts w:ascii="Arial" w:hAnsi="Arial"/>
+                <w:b w:val="0"/>
+                <w:sz w:val="19"/>
+              </w:rPr>
+              <w:t>Explain appropriate incident response activities</w:t>
+            </w:r>
+          </w:p>
+        </w:tc>
+        <w:tc>
+          <w:tcPr>
+            <w:tcW w:type="dxa" w:w="1872"/>
+          </w:tcPr>
+          <w:p>
+            <w:r/>
+            <w:r>
+              <w:rPr>
+                <w:rFonts w:ascii="Arial" w:hAnsi="Arial"/>
+                <w:b w:val="0"/>
+                <w:sz w:val="19"/>
+              </w:rPr>
+              <w:t>Lab 41, Lab 42</w:t>
+            </w:r>
+          </w:p>
+        </w:tc>
+      </w:tr>
+      <w:tr>
+        <w:tc>
+          <w:tcPr>
+            <w:tcW w:type="dxa" w:w="1296"/>
+            <w:shd w:val="clear" w:color="auto" w:fill="E8F0FE"/>
+          </w:tcPr>
+          <w:p>
+            <w:r/>
+            <w:r>
+              <w:rPr>
+                <w:rFonts w:ascii="Arial" w:hAnsi="Arial"/>
+                <w:b/>
+                <w:sz w:val="19"/>
+              </w:rPr>
+              <w:t>4.9</w:t>
+            </w:r>
+          </w:p>
+        </w:tc>
+        <w:tc>
+          <w:tcPr>
+            <w:tcW w:type="dxa" w:w="6624"/>
+          </w:tcPr>
+          <w:p>
+            <w:r/>
+            <w:r>
+              <w:rPr>
+                <w:rFonts w:ascii="Arial" w:hAnsi="Arial"/>
+                <w:b w:val="0"/>
+                <w:sz w:val="19"/>
+              </w:rPr>
+              <w:t>Given a scenario, use data sources to support an investigation</w:t>
+            </w:r>
+          </w:p>
+        </w:tc>
+        <w:tc>
+          <w:tcPr>
+            <w:tcW w:type="dxa" w:w="1872"/>
+          </w:tcPr>
+          <w:p>
+            <w:r/>
+            <w:r>
+              <w:rPr>
+                <w:rFonts w:ascii="Arial" w:hAnsi="Arial"/>
+                <w:b w:val="0"/>
+                <w:sz w:val="19"/>
+              </w:rPr>
+              <w:t>Lab 43, Lab 44</w:t>
+            </w:r>
+          </w:p>
+        </w:tc>
+      </w:tr>
+      <w:tr>
+        <w:tc>
+          <w:tcPr>
+            <w:tcW w:type="dxa" w:w="1296"/>
+            <w:shd w:val="clear" w:color="auto" w:fill="E8F0FE"/>
+          </w:tcPr>
+          <w:p>
+            <w:r/>
+            <w:r>
+              <w:rPr>
+                <w:rFonts w:ascii="Arial" w:hAnsi="Arial"/>
+                <w:b/>
+                <w:sz w:val="19"/>
+              </w:rPr>
+              <w:t>5.1</w:t>
+            </w:r>
+          </w:p>
+        </w:tc>
+        <w:tc>
+          <w:tcPr>
+            <w:tcW w:type="dxa" w:w="6624"/>
+          </w:tcPr>
+          <w:p>
+            <w:r/>
+            <w:r>
+              <w:rPr>
+                <w:rFonts w:ascii="Arial" w:hAnsi="Arial"/>
+                <w:b w:val="0"/>
+                <w:sz w:val="19"/>
+              </w:rPr>
+              <w:t>Summarize elements of effective security governance</w:t>
+            </w:r>
+          </w:p>
+        </w:tc>
+        <w:tc>
+          <w:tcPr>
+            <w:tcW w:type="dxa" w:w="1872"/>
+          </w:tcPr>
+          <w:p>
+            <w:r/>
+            <w:r>
+              <w:rPr>
+                <w:rFonts w:ascii="Arial" w:hAnsi="Arial"/>
+                <w:b w:val="0"/>
+                <w:sz w:val="19"/>
+              </w:rPr>
+              <w:t>Lab 45</w:t>
+            </w:r>
+          </w:p>
+        </w:tc>
+      </w:tr>
+      <w:tr>
+        <w:tc>
+          <w:tcPr>
+            <w:tcW w:type="dxa" w:w="1296"/>
+            <w:shd w:val="clear" w:color="auto" w:fill="E8F0FE"/>
+          </w:tcPr>
+          <w:p>
+            <w:r/>
+            <w:r>
+              <w:rPr>
+                <w:rFonts w:ascii="Arial" w:hAnsi="Arial"/>
+                <w:b/>
+                <w:sz w:val="19"/>
+              </w:rPr>
+              <w:t>5.2</w:t>
+            </w:r>
+          </w:p>
+        </w:tc>
+        <w:tc>
+          <w:tcPr>
+            <w:tcW w:type="dxa" w:w="6624"/>
+          </w:tcPr>
+          <w:p>
+            <w:r/>
+            <w:r>
+              <w:rPr>
+                <w:rFonts w:ascii="Arial" w:hAnsi="Arial"/>
+                <w:b w:val="0"/>
+                <w:sz w:val="19"/>
+              </w:rPr>
+              <w:t>Explain elements of the risk management process</w:t>
+            </w:r>
+          </w:p>
+        </w:tc>
+        <w:tc>
+          <w:tcPr>
+            <w:tcW w:type="dxa" w:w="1872"/>
+          </w:tcPr>
+          <w:p>
+            <w:r/>
+            <w:r>
+              <w:rPr>
+                <w:rFonts w:ascii="Arial" w:hAnsi="Arial"/>
+                <w:b w:val="0"/>
+                <w:sz w:val="19"/>
+              </w:rPr>
+              <w:t>Lab 46</w:t>
+            </w:r>
+          </w:p>
+        </w:tc>
+      </w:tr>
+      <w:tr>
+        <w:tc>
+          <w:tcPr>
+            <w:tcW w:type="dxa" w:w="1296"/>
+            <w:shd w:val="clear" w:color="auto" w:fill="E8F0FE"/>
+          </w:tcPr>
+          <w:p>
+            <w:r/>
+            <w:r>
+              <w:rPr>
+                <w:rFonts w:ascii="Arial" w:hAnsi="Arial"/>
+                <w:b/>
+                <w:sz w:val="19"/>
+              </w:rPr>
+              <w:t>5.3</w:t>
+            </w:r>
+          </w:p>
+        </w:tc>
+        <w:tc>
+          <w:tcPr>
+            <w:tcW w:type="dxa" w:w="6624"/>
+          </w:tcPr>
+          <w:p>
+            <w:r/>
+            <w:r>
+              <w:rPr>
+                <w:rFonts w:ascii="Arial" w:hAnsi="Arial"/>
+                <w:b w:val="0"/>
+                <w:sz w:val="19"/>
+              </w:rPr>
+              <w:t>Explain the processes associated with third-party risk assessment and management</w:t>
+            </w:r>
+          </w:p>
+        </w:tc>
+        <w:tc>
+          <w:tcPr>
+            <w:tcW w:type="dxa" w:w="1872"/>
+          </w:tcPr>
+          <w:p>
+            <w:r/>
+            <w:r>
+              <w:rPr>
+                <w:rFonts w:ascii="Arial" w:hAnsi="Arial"/>
+                <w:b w:val="0"/>
+                <w:sz w:val="19"/>
+              </w:rPr>
+              <w:t>Lab 47</w:t>
+            </w:r>
+          </w:p>
+        </w:tc>
+      </w:tr>
+      <w:tr>
+        <w:tc>
+          <w:tcPr>
+            <w:tcW w:type="dxa" w:w="1296"/>
+            <w:shd w:val="clear" w:color="auto" w:fill="E8F0FE"/>
+          </w:tcPr>
+          <w:p>
+            <w:r/>
+            <w:r>
+              <w:rPr>
+                <w:rFonts w:ascii="Arial" w:hAnsi="Arial"/>
+                <w:b/>
+                <w:sz w:val="19"/>
+              </w:rPr>
+              <w:t>5.4</w:t>
+            </w:r>
+          </w:p>
+        </w:tc>
+        <w:tc>
+          <w:tcPr>
+            <w:tcW w:type="dxa" w:w="6624"/>
+          </w:tcPr>
+          <w:p>
+            <w:r/>
+            <w:r>
+              <w:rPr>
+                <w:rFonts w:ascii="Arial" w:hAnsi="Arial"/>
+                <w:b w:val="0"/>
+                <w:sz w:val="19"/>
+              </w:rPr>
+              <w:t>Summarize elements of effective security compliance</w:t>
+            </w:r>
+          </w:p>
+        </w:tc>
+        <w:tc>
+          <w:tcPr>
+            <w:tcW w:type="dxa" w:w="1872"/>
+          </w:tcPr>
+          <w:p>
+            <w:r/>
+            <w:r>
+              <w:rPr>
+                <w:rFonts w:ascii="Arial" w:hAnsi="Arial"/>
+                <w:b w:val="0"/>
+                <w:sz w:val="19"/>
+              </w:rPr>
+              <w:t>Lab 48</w:t>
+            </w:r>
+          </w:p>
+        </w:tc>
+      </w:tr>
+      <w:tr>
+        <w:tc>
+          <w:tcPr>
+            <w:tcW w:type="dxa" w:w="1296"/>
+            <w:shd w:val="clear" w:color="auto" w:fill="E8F0FE"/>
+          </w:tcPr>
+          <w:p>
+            <w:r/>
+            <w:r>
+              <w:rPr>
+                <w:rFonts w:ascii="Arial" w:hAnsi="Arial"/>
+                <w:b/>
+                <w:sz w:val="19"/>
+              </w:rPr>
+              <w:t>5.5</w:t>
+            </w:r>
+          </w:p>
+        </w:tc>
+        <w:tc>
+          <w:tcPr>
+            <w:tcW w:type="dxa" w:w="6624"/>
+          </w:tcPr>
+          <w:p>
+            <w:r/>
+            <w:r>
+              <w:rPr>
+                <w:rFonts w:ascii="Arial" w:hAnsi="Arial"/>
+                <w:b w:val="0"/>
+                <w:sz w:val="19"/>
+              </w:rPr>
+              <w:t>Explain types and purposes of audits and assessments</w:t>
+            </w:r>
+          </w:p>
+        </w:tc>
+        <w:tc>
+          <w:tcPr>
+            <w:tcW w:type="dxa" w:w="1872"/>
+          </w:tcPr>
+          <w:p>
+            <w:r/>
+            <w:r>
+              <w:rPr>
+                <w:rFonts w:ascii="Arial" w:hAnsi="Arial"/>
+                <w:b w:val="0"/>
+                <w:sz w:val="19"/>
+              </w:rPr>
+              <w:t>Lab 49, Lab 50, Lab 51</w:t>
+            </w:r>
+          </w:p>
+        </w:tc>
+      </w:tr>
+      <w:tr>
+        <w:tc>
+          <w:tcPr>
+            <w:tcW w:type="dxa" w:w="1296"/>
+            <w:shd w:val="clear" w:color="auto" w:fill="E8F0FE"/>
+          </w:tcPr>
+          <w:p>
+            <w:r/>
+            <w:r>
+              <w:rPr>
+                <w:rFonts w:ascii="Arial" w:hAnsi="Arial"/>
+                <w:b/>
+                <w:sz w:val="19"/>
+              </w:rPr>
+              <w:t>5.6</w:t>
+            </w:r>
+          </w:p>
+        </w:tc>
+        <w:tc>
+          <w:tcPr>
+            <w:tcW w:type="dxa" w:w="6624"/>
+          </w:tcPr>
+          <w:p>
+            <w:r/>
+            <w:r>
+              <w:rPr>
+                <w:rFonts w:ascii="Arial" w:hAnsi="Arial"/>
+                <w:b w:val="0"/>
+                <w:sz w:val="19"/>
+              </w:rPr>
+              <w:t>Given a scenario, implement security awareness practices</w:t>
+            </w:r>
+          </w:p>
+        </w:tc>
+        <w:tc>
+          <w:tcPr>
+            <w:tcW w:type="dxa" w:w="1872"/>
+          </w:tcPr>
+          <w:p>
+            <w:r/>
+            <w:r>
+              <w:rPr>
+                <w:rFonts w:ascii="Arial" w:hAnsi="Arial"/>
+                <w:b w:val="0"/>
+                <w:sz w:val="19"/>
+              </w:rPr>
+              <w:t>Lab 52</w:t>
             </w:r>
           </w:p>
         </w:tc>

</xml_diff>